<commit_message>
paper: 9pt body text with first-line indent in v2
</commit_message>
<xml_diff>
--- a/paper/final/다알지_논문_v2.docx
+++ b/paper/final/다알지_논문_v2.docx
@@ -314,6 +314,7 @@
       <w:pPr>
         <w:wordWrap/>
         <w:spacing w:before="0" w:after="0" w:line="300" w:lineRule="exact"/>
+        <w:ind w:firstLine="180"/>
         <w:jc w:val="both"/>
       </w:pPr>
       <w:r>
@@ -321,7 +322,7 @@
           <w:rFonts w:ascii="함초롬돋움" w:eastAsia="함초롬돋움" w:hAnsi="함초롬돋움" w:cs="함초롬돋움"/>
           <w:b w:val="0"/>
           <w:i w:val="0"/>
-          <w:sz w:val="20"/>
+          <w:sz w:val="18"/>
         </w:rPr>
         <w:t>기관사와 관제원이 설비 고장 대응 절차를 확인하려면 현장 길라잡이의 구체적인 조치와 규정의 보고·운전 조건을 함께 찾아야 한다. 본 연구는 이러한 근거를 챗봇으로 찾을 때, 관리자가 등록한 문서 간 링크가 검색에 얼마나 도움이 되는지를 다룬다.</w:t>
       </w:r>
@@ -330,6 +331,7 @@
       <w:pPr>
         <w:wordWrap/>
         <w:spacing w:before="0" w:after="0" w:line="300" w:lineRule="exact"/>
+        <w:ind w:firstLine="180"/>
         <w:jc w:val="both"/>
       </w:pPr>
       <w:r>
@@ -337,7 +339,7 @@
           <w:rFonts w:ascii="함초롬돋움" w:eastAsia="함초롬돋움" w:hAnsi="함초롬돋움" w:cs="함초롬돋움"/>
           <w:b w:val="0"/>
           <w:i w:val="0"/>
-          <w:sz w:val="20"/>
+          <w:sz w:val="18"/>
         </w:rPr>
         <w:t>검색 증강 생성(RAG)은 외부 문서에서 찾은 근거로 답변을 만들며[1], 최근에는 LLM으로 검색 후보의 순위를 다시 매기는 방식도 널리 쓰인다[2]. 문서 간 관계를 검색에 반영하려는 연구도 이어지고 있다. GraphRAG와 LightRAG는 문서에서 관계 그래프를 자동으로 구축하고[3,4], KG²RAG는 처음 찾은 청크에서 지식그래프를 따라 주변 청크로 검색 범위를 넓힌다[5]. 철도 분야에서는 공간 지식그래프를 탐색하는 CARAG와 출입문 고장 이력을 활용하는 도시철도 RAG가 제안되었고[6,7], 법률 분야에서도 근거 검색 평가셋과 한국어 하이브리드 검색 연구가 나왔다[8,9]. 다만 이들 방법은 문서 간 관계를 모델이 추출하거나 별도로 구축한 지식그래프에 의존한다. 본 시스템에서는 관리자가 규정과 길라잡이의 대응 구간을 직접 연결해 둔다. 본 연구는 새로운 그래프 알고리즘을 제안하기보다, 이렇게 사람이 등록한 링크로 검색을 확장했을 때 필요한 근거를 얼마나 더 찾을 수 있는지 살펴본다.</w:t>
       </w:r>
@@ -362,6 +364,7 @@
       <w:pPr>
         <w:wordWrap/>
         <w:spacing w:before="0" w:after="0" w:line="300" w:lineRule="exact"/>
+        <w:ind w:firstLine="180"/>
         <w:jc w:val="both"/>
       </w:pPr>
       <w:r>
@@ -369,7 +372,7 @@
           <w:rFonts w:ascii="함초롬돋움" w:eastAsia="함초롬돋움" w:hAnsi="함초롬돋움" w:cs="함초롬돋움"/>
           <w:b w:val="0"/>
           <w:i w:val="0"/>
-          <w:sz w:val="20"/>
+          <w:sz w:val="18"/>
         </w:rPr>
         <w:t>비교에는 일곱 가지 검색 방식을 사용했다. 기준선인 BM25와 Dense는 각각 어휘 일치와 임베딩 유사도로 문서 구간을 찾고, Hybrid는 두 점수를 0.6(Dense)과 0.4(BM25)의 가중치로 합친다. H+RR은 Hybrid로 찾은 상위 20개 후보를 LLM에 보여 주고, 질문에 직접 답하는 근거를 최대 5개까지 고르게 한 방식이다.</w:t>
       </w:r>
@@ -378,6 +381,7 @@
       <w:pPr>
         <w:wordWrap/>
         <w:spacing w:before="0" w:after="0" w:line="300" w:lineRule="exact"/>
+        <w:ind w:firstLine="180"/>
         <w:jc w:val="both"/>
       </w:pPr>
       <w:r>
@@ -385,7 +389,7 @@
           <w:rFonts w:ascii="함초롬돋움" w:eastAsia="함초롬돋움" w:hAnsi="함초롬돋움" w:cs="함초롬돋움"/>
           <w:b w:val="0"/>
           <w:i w:val="0"/>
-          <w:sz w:val="20"/>
+          <w:sz w:val="18"/>
         </w:rPr>
         <w:t>link_all과 proposed는 H+RR이 고른 직접 근거를 그대로 두고, 여기에 승인 링크로 연결된 문서 구간을 최대 2단계까지 따라가 덧붙인다(그림 1). 두 방식은 연결 구간을 다루는 방법이 다르다. link_all은 연결된 구간을 모두 붙이되 전체 근거가 15개를 넘지 않도록 자르고, proposed는 연결 구간만 질문과의 관련성에 따라 다시 순위를 매겨 최대 10개를 고른다. H+RR은 LLM이 근거를 적게 고르는 경우가 많아 질의당 평균 근거 수가 링크 방식보다 적다. 근거 개수의 차이만으로 결과가 달라지는지 확인하기 위해, 선택된 근거가 3개보다 적으면 Hybrid 순위에서 모자란 만큼 채우는 K3를 함께 비교했다.</w:t>
       </w:r>
@@ -467,6 +471,7 @@
       <w:pPr>
         <w:wordWrap/>
         <w:spacing w:before="0" w:after="0" w:line="300" w:lineRule="exact"/>
+        <w:ind w:firstLine="180"/>
         <w:jc w:val="both"/>
       </w:pPr>
       <w:r>
@@ -474,7 +479,7 @@
           <w:rFonts w:ascii="함초롬돋움" w:eastAsia="함초롬돋움" w:hAnsi="함초롬돋움" w:cs="함초롬돋움"/>
           <w:b w:val="0"/>
           <w:i w:val="0"/>
-          <w:sz w:val="20"/>
+          <w:sz w:val="18"/>
         </w:rPr>
         <w:t>평가에는 질의 37건을 사용했다. 기존 사례 17건은 시스템 개발 과정에서 만든 질의이고(문서형 12건, 그래프형 5건), 나머지 20건은 LLM으로 초안을 작성한 신규 질의다(문서형 5건, 그래프형 15건). 문서형은 한 문서 안에서 답을 찾을 수 있는 질의이고, 그래프형은 링크로 연결된 다른 문서의 구간까지 봐야 답할 수 있는 질의다. 신규 그래프형 15건은 승인 링크 하나를 정한 뒤 그 양쪽 원문을 바탕으로 만들었다. 링크로 연결된 구간 가운데 정답에 해당하는 구간은 따로 '링크 정답 근거'로 표시했다. 신규 20건은 철도 운영기관의 현업 전문가 1인이 체크리스트로 검토했다. 질문이 현실적인지, 정답 근거와 참조 답변이 정확한지, 링크가 실제로 필요한지를 확인했으며, 모두 적합 판정을 받아 고치거나 뺀 사례는 없었다. 링크의 효과를 보려는 것이므로 결과는 그래프형 20건을 중심으로 보고한다.</w:t>
       </w:r>
@@ -483,6 +488,7 @@
       <w:pPr>
         <w:wordWrap/>
         <w:spacing w:before="0" w:after="0" w:line="300" w:lineRule="exact"/>
+        <w:ind w:firstLine="180"/>
         <w:jc w:val="both"/>
       </w:pPr>
       <w:r>
@@ -490,7 +496,7 @@
           <w:rFonts w:ascii="함초롬돋움" w:eastAsia="함초롬돋움" w:hAnsi="함초롬돋움" w:cs="함초롬돋움"/>
           <w:b w:val="0"/>
           <w:i w:val="0"/>
-          <w:sz w:val="20"/>
+          <w:sz w:val="18"/>
         </w:rPr>
         <w:t>일곱 가지 방식으로 37건을 각각 세 번씩 검색했고, 검색 지표는 세 번의 평균으로 보고한다. 답변은 gpt-5.6-luna로 생성했고, 같은 모델을 평가자로 쓰는 RAGAS[10]로 채점했다. 임베딩은 text-embedding-3-small(검색)과 text-embedding-3-large(평가)를 썼다. 실험에 쓴 승인 링크는 36개이며, 재현을 위해 평가 시점의 링크 목록과 해시를 따로 보관했다.</w:t>
       </w:r>
@@ -499,6 +505,7 @@
       <w:pPr>
         <w:wordWrap/>
         <w:spacing w:before="0" w:after="0" w:line="300" w:lineRule="exact"/>
+        <w:ind w:firstLine="180"/>
         <w:jc w:val="both"/>
       </w:pPr>
       <w:r>
@@ -506,7 +513,7 @@
           <w:rFonts w:ascii="함초롬돋움" w:eastAsia="함초롬돋움" w:hAnsi="함초롬돋움" w:cs="함초롬돋움"/>
           <w:b w:val="0"/>
           <w:i w:val="0"/>
-          <w:sz w:val="20"/>
+          <w:sz w:val="18"/>
         </w:rPr>
         <w:t>그래프형 질의 20건의 검색 결과를 표 1에 정리했다. 링크를 쓰지 않는 방식 가운데서는 K3의 Recall이 0.618로 가장 높았고, 링크로 확장한 link_all과 proposed는 각각 0.850과 0.839였다. 링크 정답 근거만 보면 차이가 더 커서, K3는 0.225에 그친 반면 link_all은 0.750이었다. 출처별로 나눈 표 2에서도 link_all의 Recall은 K3보다 기존 사례에서 0.128, 신규 사례에서 0.267 높았다.</w:t>
       </w:r>
@@ -2130,6 +2137,7 @@
       <w:pPr>
         <w:wordWrap/>
         <w:spacing w:before="0" w:after="0" w:line="300" w:lineRule="exact"/>
+        <w:ind w:firstLine="180"/>
         <w:jc w:val="both"/>
       </w:pPr>
       <w:r>
@@ -2137,7 +2145,7 @@
           <w:rFonts w:ascii="함초롬돋움" w:eastAsia="함초롬돋움" w:hAnsi="함초롬돋움" w:cs="함초롬돋움"/>
           <w:b w:val="0"/>
           <w:i w:val="0"/>
-          <w:sz w:val="20"/>
+          <w:sz w:val="18"/>
         </w:rPr>
         <w:t>여러 질의가 같은 링크 정답 근거를 공유하는 경우가 있어서, 질의를 서로 독립인 표본으로 보고 재표집하면 구간이 실제보다 좁아질 수 있다. 그래서 같은 문서 버전의 같은 조항을 링크 정답 근거로 갖는 질의들을 하나로 묶고, 이렇게 이어진 묶음을 군집으로 삼아 군집 단위로 재표집했다. 군집이 기존 사례에서 5개, 신규 사례에서 6개뿐이어서, 표의 구간은 효과의 크기를 가늠하는 참고값으로만 본다.</w:t>
       </w:r>
@@ -2623,6 +2631,7 @@
       <w:pPr>
         <w:wordWrap/>
         <w:spacing w:before="0" w:after="0" w:line="300" w:lineRule="exact"/>
+        <w:ind w:firstLine="180"/>
         <w:jc w:val="both"/>
       </w:pPr>
       <w:r>
@@ -2630,7 +2639,7 @@
           <w:rFonts w:ascii="함초롬돋움" w:eastAsia="함초롬돋움" w:hAnsi="함초롬돋움" w:cs="함초롬돋움"/>
           <w:b w:val="0"/>
           <w:i w:val="0"/>
-          <w:sz w:val="20"/>
+          <w:sz w:val="18"/>
         </w:rPr>
         <w:t>K3는 첫 번째 실행에서만 답변을 채점했으므로 그 결과끼리 비교하면, 기존 사례에서 proposed는 Context Precision이 K3보다 0.266 [−0.478, −0.099] 낮았지만 Answer Correctness 차이는 −0.022 [−0.120, +0.077]로 거의 없었다. 신규 사례에서는 두 지표의 차이가 각각 +0.020 [−0.047, +0.078], +0.031 [−0.043, +0.136]으로 모두 작았다. 즉, 링크 확장으로 찾은 정답 근거가 늘었어도 자동 채점한 답변의 정확도는 뚜렷하게 달라지지 않았다.</w:t>
       </w:r>
@@ -2639,6 +2648,7 @@
       <w:pPr>
         <w:wordWrap/>
         <w:spacing w:before="0" w:after="0" w:line="300" w:lineRule="exact"/>
+        <w:ind w:firstLine="180"/>
         <w:jc w:val="both"/>
       </w:pPr>
       <w:r>
@@ -2646,7 +2656,7 @@
           <w:rFonts w:ascii="함초롬돋움" w:eastAsia="함초롬돋움" w:hAnsi="함초롬돋움" w:cs="함초롬돋움"/>
           <w:b w:val="0"/>
           <w:i w:val="0"/>
-          <w:sz w:val="20"/>
+          <w:sz w:val="18"/>
         </w:rPr>
         <w:t>그래프형 질의의 평균 응답 시간은 K3 1.446초, link_all 2.157초, proposed 2.678초로, proposed는 연결 근거를 한 번 더 재정렬하는 만큼 link_all보다 약 0.5초 느렸다(표 3).</w:t>
       </w:r>
@@ -2671,6 +2681,7 @@
       <w:pPr>
         <w:wordWrap/>
         <w:spacing w:before="0" w:after="0" w:line="300" w:lineRule="exact"/>
+        <w:ind w:firstLine="180"/>
         <w:jc w:val="both"/>
       </w:pPr>
       <w:r>
@@ -2678,7 +2689,7 @@
           <w:rFonts w:ascii="함초롬돋움" w:eastAsia="함초롬돋움" w:hAnsi="함초롬돋움" w:cs="함초롬돋움"/>
           <w:b w:val="0"/>
           <w:i w:val="0"/>
-          <w:sz w:val="20"/>
+          <w:sz w:val="18"/>
         </w:rPr>
         <w:t>승인 링크로 검색을 확장하자 그래프형 질의에서 찾아낸 정답 근거가 크게 늘었다. 특히 K3와 link_all은 질의당 평균 근거 수가 3.15개와 3.08개로 비슷했는데도 Recall 차이가 컸다. 근거를 더 많이 가져와서가 아니라, 링크가 다른 문서에 있는 필요한 구간을 찾아 준 덕분으로 볼 수 있다. 반면 연결 근거를 한 번 더 골라내는 proposed는 link_all보다 Recall이 높지 않았고 응답만 느려졌다.</w:t>
       </w:r>
@@ -2687,6 +2698,7 @@
       <w:pPr>
         <w:wordWrap/>
         <w:spacing w:before="0" w:after="0" w:line="300" w:lineRule="exact"/>
+        <w:ind w:firstLine="180"/>
         <w:jc w:val="both"/>
       </w:pPr>
       <w:r>
@@ -2694,7 +2706,7 @@
           <w:rFonts w:ascii="함초롬돋움" w:eastAsia="함초롬돋움" w:hAnsi="함초롬돋움" w:cs="함초롬돋움"/>
           <w:b w:val="0"/>
           <w:i w:val="0"/>
-          <w:sz w:val="20"/>
+          <w:sz w:val="18"/>
         </w:rPr>
         <w:t>이 결과를 해석할 때는 평가 자료의 한계를 함께 봐야 한다. 기존 그래프형 5건은 개발 과정에서 만든 질의이고, 신규 15건은 링크를 먼저 정한 뒤 만들었기 때문에 링크 방식에 유리한 질문이 모였을 수 있다. 신규 질의는 현업 전문가 1인이 링크 구조를 아는 상태에서 검토했으므로 평가자 간 일치도를 구하지 못했다. 또한 K3는 근거가 3개보다 적을 때만 보충하므로 근거 수나 토큰 예산을 정확히 맞춘 비교는 아니다. 답변 역시 생성에 쓴 모델이 그대로 채점했고, 사람이 방법명을 가린 채 평가하지는 않았다.</w:t>
       </w:r>
@@ -2703,6 +2715,7 @@
       <w:pPr>
         <w:wordWrap/>
         <w:spacing w:before="0" w:after="0" w:line="300" w:lineRule="exact"/>
+        <w:ind w:firstLine="180"/>
         <w:jc w:val="both"/>
       </w:pPr>
       <w:r>
@@ -2710,7 +2723,7 @@
           <w:rFonts w:ascii="함초롬돋움" w:eastAsia="함초롬돋움" w:hAnsi="함초롬돋움" w:cs="함초롬돋움"/>
           <w:b w:val="0"/>
           <w:i w:val="0"/>
-          <w:sz w:val="20"/>
+          <w:sz w:val="18"/>
         </w:rPr>
         <w:t>운영 측면에서도 확인할 점이 남아 있다. 관리자는 링크 양 끝의 구간과 승인 상태, 담당자, 시각을 기록하지만, 어떤 기준으로 승인하는지와 문서가 개정되거나 폐기될 때 링크를 어떻게 처리하는지는 정해져 있지 않다. 따라서 이번 결과는 승인된 링크가 정확하다는 근거가 아니라, 링크가 있을 때 검색이 어떻게 달라지는지를 보여 준다. 링크를 미리 보지 않고 만든 현장 질의, 두 명 이상의 독립 검수, 블라인드 답변 평가로 이 결과를 다시 확인할 계획이다. 또한 현재 시스템은 연결 근거를 찾지 못해도 경고 없이 직접 근거만으로 답하므로, 이를 보완하기 전에는 실제 운전 판단에 쓰기 어렵다.</w:t>
       </w:r>

</xml_diff>

<commit_message>
paper: 13pt line spacing for 9pt body in v2
</commit_message>
<xml_diff>
--- a/paper/final/다알지_논문_v2.docx
+++ b/paper/final/다알지_논문_v2.docx
@@ -298,7 +298,7 @@
       <w:pPr>
         <w:keepNext/>
         <w:wordWrap/>
-        <w:spacing w:before="0" w:after="0" w:line="300" w:lineRule="exact"/>
+        <w:spacing w:before="0" w:after="0" w:line="260" w:lineRule="exact"/>
       </w:pPr>
       <w:r>
         <w:rPr>
@@ -313,7 +313,7 @@
     <w:p>
       <w:pPr>
         <w:wordWrap/>
-        <w:spacing w:before="0" w:after="0" w:line="300" w:lineRule="exact"/>
+        <w:spacing w:before="0" w:after="0" w:line="260" w:lineRule="exact"/>
         <w:ind w:firstLine="180"/>
         <w:jc w:val="both"/>
       </w:pPr>
@@ -330,7 +330,7 @@
     <w:p>
       <w:pPr>
         <w:wordWrap/>
-        <w:spacing w:before="0" w:after="0" w:line="300" w:lineRule="exact"/>
+        <w:spacing w:before="0" w:after="0" w:line="260" w:lineRule="exact"/>
         <w:ind w:firstLine="180"/>
         <w:jc w:val="both"/>
       </w:pPr>
@@ -348,7 +348,7 @@
       <w:pPr>
         <w:keepNext/>
         <w:wordWrap/>
-        <w:spacing w:before="80" w:after="0" w:line="300" w:lineRule="exact"/>
+        <w:spacing w:before="80" w:after="0" w:line="260" w:lineRule="exact"/>
       </w:pPr>
       <w:r>
         <w:rPr>
@@ -363,7 +363,7 @@
     <w:p>
       <w:pPr>
         <w:wordWrap/>
-        <w:spacing w:before="0" w:after="0" w:line="300" w:lineRule="exact"/>
+        <w:spacing w:before="0" w:after="0" w:line="260" w:lineRule="exact"/>
         <w:ind w:firstLine="180"/>
         <w:jc w:val="both"/>
       </w:pPr>
@@ -380,7 +380,7 @@
     <w:p>
       <w:pPr>
         <w:wordWrap/>
-        <w:spacing w:before="0" w:after="0" w:line="300" w:lineRule="exact"/>
+        <w:spacing w:before="0" w:after="0" w:line="260" w:lineRule="exact"/>
         <w:ind w:firstLine="180"/>
         <w:jc w:val="both"/>
       </w:pPr>
@@ -438,7 +438,7 @@
     <w:p>
       <w:pPr>
         <w:wordWrap/>
-        <w:spacing w:before="0" w:after="80" w:line="300" w:lineRule="exact"/>
+        <w:spacing w:before="0" w:after="80" w:line="260" w:lineRule="exact"/>
         <w:jc w:val="center"/>
       </w:pPr>
       <w:r>
@@ -455,7 +455,7 @@
       <w:pPr>
         <w:keepNext/>
         <w:wordWrap/>
-        <w:spacing w:before="80" w:after="0" w:line="300" w:lineRule="exact"/>
+        <w:spacing w:before="80" w:after="0" w:line="260" w:lineRule="exact"/>
       </w:pPr>
       <w:r>
         <w:rPr>
@@ -470,7 +470,7 @@
     <w:p>
       <w:pPr>
         <w:wordWrap/>
-        <w:spacing w:before="0" w:after="0" w:line="300" w:lineRule="exact"/>
+        <w:spacing w:before="0" w:after="0" w:line="260" w:lineRule="exact"/>
         <w:ind w:firstLine="180"/>
         <w:jc w:val="both"/>
       </w:pPr>
@@ -487,7 +487,7 @@
     <w:p>
       <w:pPr>
         <w:wordWrap/>
-        <w:spacing w:before="0" w:after="0" w:line="300" w:lineRule="exact"/>
+        <w:spacing w:before="0" w:after="0" w:line="260" w:lineRule="exact"/>
         <w:ind w:firstLine="180"/>
         <w:jc w:val="both"/>
       </w:pPr>
@@ -504,7 +504,7 @@
     <w:p>
       <w:pPr>
         <w:wordWrap/>
-        <w:spacing w:before="0" w:after="0" w:line="300" w:lineRule="exact"/>
+        <w:spacing w:before="0" w:after="0" w:line="260" w:lineRule="exact"/>
         <w:ind w:firstLine="180"/>
         <w:jc w:val="both"/>
       </w:pPr>
@@ -2136,7 +2136,7 @@
     <w:p>
       <w:pPr>
         <w:wordWrap/>
-        <w:spacing w:before="0" w:after="0" w:line="300" w:lineRule="exact"/>
+        <w:spacing w:before="0" w:after="0" w:line="260" w:lineRule="exact"/>
         <w:ind w:firstLine="180"/>
         <w:jc w:val="both"/>
       </w:pPr>
@@ -2630,7 +2630,7 @@
     <w:p>
       <w:pPr>
         <w:wordWrap/>
-        <w:spacing w:before="0" w:after="0" w:line="300" w:lineRule="exact"/>
+        <w:spacing w:before="0" w:after="0" w:line="260" w:lineRule="exact"/>
         <w:ind w:firstLine="180"/>
         <w:jc w:val="both"/>
       </w:pPr>
@@ -2647,7 +2647,7 @@
     <w:p>
       <w:pPr>
         <w:wordWrap/>
-        <w:spacing w:before="0" w:after="0" w:line="300" w:lineRule="exact"/>
+        <w:spacing w:before="0" w:after="0" w:line="260" w:lineRule="exact"/>
         <w:ind w:firstLine="180"/>
         <w:jc w:val="both"/>
       </w:pPr>
@@ -2665,7 +2665,7 @@
       <w:pPr>
         <w:keepNext/>
         <w:wordWrap/>
-        <w:spacing w:before="80" w:after="0" w:line="300" w:lineRule="exact"/>
+        <w:spacing w:before="80" w:after="0" w:line="260" w:lineRule="exact"/>
       </w:pPr>
       <w:r>
         <w:rPr>
@@ -2680,7 +2680,7 @@
     <w:p>
       <w:pPr>
         <w:wordWrap/>
-        <w:spacing w:before="0" w:after="0" w:line="300" w:lineRule="exact"/>
+        <w:spacing w:before="0" w:after="0" w:line="260" w:lineRule="exact"/>
         <w:ind w:firstLine="180"/>
         <w:jc w:val="both"/>
       </w:pPr>
@@ -2697,7 +2697,7 @@
     <w:p>
       <w:pPr>
         <w:wordWrap/>
-        <w:spacing w:before="0" w:after="0" w:line="300" w:lineRule="exact"/>
+        <w:spacing w:before="0" w:after="0" w:line="260" w:lineRule="exact"/>
         <w:ind w:firstLine="180"/>
         <w:jc w:val="both"/>
       </w:pPr>
@@ -2714,7 +2714,7 @@
     <w:p>
       <w:pPr>
         <w:wordWrap/>
-        <w:spacing w:before="0" w:after="0" w:line="300" w:lineRule="exact"/>
+        <w:spacing w:before="0" w:after="0" w:line="260" w:lineRule="exact"/>
         <w:ind w:firstLine="180"/>
         <w:jc w:val="both"/>
       </w:pPr>
@@ -2732,7 +2732,7 @@
       <w:pPr>
         <w:keepNext/>
         <w:wordWrap/>
-        <w:spacing w:before="80" w:after="0" w:line="300" w:lineRule="exact"/>
+        <w:spacing w:before="80" w:after="0" w:line="260" w:lineRule="exact"/>
       </w:pPr>
       <w:r>
         <w:rPr>

</xml_diff>

<commit_message>
paper: restore 15pt line spacing in v2
</commit_message>
<xml_diff>
--- a/paper/final/다알지_논문_v2.docx
+++ b/paper/final/다알지_논문_v2.docx
@@ -298,7 +298,7 @@
       <w:pPr>
         <w:keepNext/>
         <w:wordWrap/>
-        <w:spacing w:before="0" w:after="0" w:line="260" w:lineRule="exact"/>
+        <w:spacing w:before="0" w:after="0" w:line="300" w:lineRule="exact"/>
       </w:pPr>
       <w:r>
         <w:rPr>
@@ -313,7 +313,7 @@
     <w:p>
       <w:pPr>
         <w:wordWrap/>
-        <w:spacing w:before="0" w:after="0" w:line="260" w:lineRule="exact"/>
+        <w:spacing w:before="0" w:after="0" w:line="300" w:lineRule="exact"/>
         <w:ind w:firstLine="180"/>
         <w:jc w:val="both"/>
       </w:pPr>
@@ -330,7 +330,7 @@
     <w:p>
       <w:pPr>
         <w:wordWrap/>
-        <w:spacing w:before="0" w:after="0" w:line="260" w:lineRule="exact"/>
+        <w:spacing w:before="0" w:after="0" w:line="300" w:lineRule="exact"/>
         <w:ind w:firstLine="180"/>
         <w:jc w:val="both"/>
       </w:pPr>
@@ -348,7 +348,7 @@
       <w:pPr>
         <w:keepNext/>
         <w:wordWrap/>
-        <w:spacing w:before="80" w:after="0" w:line="260" w:lineRule="exact"/>
+        <w:spacing w:before="80" w:after="0" w:line="300" w:lineRule="exact"/>
       </w:pPr>
       <w:r>
         <w:rPr>
@@ -363,7 +363,7 @@
     <w:p>
       <w:pPr>
         <w:wordWrap/>
-        <w:spacing w:before="0" w:after="0" w:line="260" w:lineRule="exact"/>
+        <w:spacing w:before="0" w:after="0" w:line="300" w:lineRule="exact"/>
         <w:ind w:firstLine="180"/>
         <w:jc w:val="both"/>
       </w:pPr>
@@ -380,7 +380,7 @@
     <w:p>
       <w:pPr>
         <w:wordWrap/>
-        <w:spacing w:before="0" w:after="0" w:line="260" w:lineRule="exact"/>
+        <w:spacing w:before="0" w:after="0" w:line="300" w:lineRule="exact"/>
         <w:ind w:firstLine="180"/>
         <w:jc w:val="both"/>
       </w:pPr>
@@ -438,7 +438,7 @@
     <w:p>
       <w:pPr>
         <w:wordWrap/>
-        <w:spacing w:before="0" w:after="80" w:line="260" w:lineRule="exact"/>
+        <w:spacing w:before="0" w:after="80" w:line="300" w:lineRule="exact"/>
         <w:jc w:val="center"/>
       </w:pPr>
       <w:r>
@@ -455,7 +455,7 @@
       <w:pPr>
         <w:keepNext/>
         <w:wordWrap/>
-        <w:spacing w:before="80" w:after="0" w:line="260" w:lineRule="exact"/>
+        <w:spacing w:before="80" w:after="0" w:line="300" w:lineRule="exact"/>
       </w:pPr>
       <w:r>
         <w:rPr>
@@ -470,7 +470,7 @@
     <w:p>
       <w:pPr>
         <w:wordWrap/>
-        <w:spacing w:before="0" w:after="0" w:line="260" w:lineRule="exact"/>
+        <w:spacing w:before="0" w:after="0" w:line="300" w:lineRule="exact"/>
         <w:ind w:firstLine="180"/>
         <w:jc w:val="both"/>
       </w:pPr>
@@ -487,7 +487,7 @@
     <w:p>
       <w:pPr>
         <w:wordWrap/>
-        <w:spacing w:before="0" w:after="0" w:line="260" w:lineRule="exact"/>
+        <w:spacing w:before="0" w:after="0" w:line="300" w:lineRule="exact"/>
         <w:ind w:firstLine="180"/>
         <w:jc w:val="both"/>
       </w:pPr>
@@ -504,7 +504,7 @@
     <w:p>
       <w:pPr>
         <w:wordWrap/>
-        <w:spacing w:before="0" w:after="0" w:line="260" w:lineRule="exact"/>
+        <w:spacing w:before="0" w:after="0" w:line="300" w:lineRule="exact"/>
         <w:ind w:firstLine="180"/>
         <w:jc w:val="both"/>
       </w:pPr>
@@ -2136,7 +2136,7 @@
     <w:p>
       <w:pPr>
         <w:wordWrap/>
-        <w:spacing w:before="0" w:after="0" w:line="260" w:lineRule="exact"/>
+        <w:spacing w:before="0" w:after="0" w:line="300" w:lineRule="exact"/>
         <w:ind w:firstLine="180"/>
         <w:jc w:val="both"/>
       </w:pPr>
@@ -2630,7 +2630,7 @@
     <w:p>
       <w:pPr>
         <w:wordWrap/>
-        <w:spacing w:before="0" w:after="0" w:line="260" w:lineRule="exact"/>
+        <w:spacing w:before="0" w:after="0" w:line="300" w:lineRule="exact"/>
         <w:ind w:firstLine="180"/>
         <w:jc w:val="both"/>
       </w:pPr>
@@ -2647,7 +2647,7 @@
     <w:p>
       <w:pPr>
         <w:wordWrap/>
-        <w:spacing w:before="0" w:after="0" w:line="260" w:lineRule="exact"/>
+        <w:spacing w:before="0" w:after="0" w:line="300" w:lineRule="exact"/>
         <w:ind w:firstLine="180"/>
         <w:jc w:val="both"/>
       </w:pPr>
@@ -2665,7 +2665,7 @@
       <w:pPr>
         <w:keepNext/>
         <w:wordWrap/>
-        <w:spacing w:before="80" w:after="0" w:line="260" w:lineRule="exact"/>
+        <w:spacing w:before="80" w:after="0" w:line="300" w:lineRule="exact"/>
       </w:pPr>
       <w:r>
         <w:rPr>
@@ -2680,7 +2680,7 @@
     <w:p>
       <w:pPr>
         <w:wordWrap/>
-        <w:spacing w:before="0" w:after="0" w:line="260" w:lineRule="exact"/>
+        <w:spacing w:before="0" w:after="0" w:line="300" w:lineRule="exact"/>
         <w:ind w:firstLine="180"/>
         <w:jc w:val="both"/>
       </w:pPr>
@@ -2697,7 +2697,7 @@
     <w:p>
       <w:pPr>
         <w:wordWrap/>
-        <w:spacing w:before="0" w:after="0" w:line="260" w:lineRule="exact"/>
+        <w:spacing w:before="0" w:after="0" w:line="300" w:lineRule="exact"/>
         <w:ind w:firstLine="180"/>
         <w:jc w:val="both"/>
       </w:pPr>
@@ -2714,7 +2714,7 @@
     <w:p>
       <w:pPr>
         <w:wordWrap/>
-        <w:spacing w:before="0" w:after="0" w:line="260" w:lineRule="exact"/>
+        <w:spacing w:before="0" w:after="0" w:line="300" w:lineRule="exact"/>
         <w:ind w:firstLine="180"/>
         <w:jc w:val="both"/>
       </w:pPr>
@@ -2732,7 +2732,7 @@
       <w:pPr>
         <w:keepNext/>
         <w:wordWrap/>
-        <w:spacing w:before="80" w:after="0" w:line="260" w:lineRule="exact"/>
+        <w:spacing w:before="80" w:after="0" w:line="300" w:lineRule="exact"/>
       </w:pPr>
       <w:r>
         <w:rPr>

</xml_diff>

<commit_message>
paper: clean document title metadata
</commit_message>
<xml_diff>
--- a/paper/final/다알지_논문_v2.docx
+++ b/paper/final/다알지_논문_v2.docx
@@ -36,7 +36,7 @@
               <w:right w:w="99" w:type="dxa"/>
             </w:tcMar>
             <w:tcBorders>
-              <w:right w:val="nil" w:sz="4" w:space="0" w:color="000000" tmln="10, 20, 20, 0, 0"/>
+              <w:right w:val="nil" w:sz="0" w:space="0" w:color="000000" tmln="20, 20, 20, 0, 0"/>
             </w:tcBorders>
             <w:tmTcPr id="1792316937" protected="0"/>
           </w:tcPr>
@@ -54,7 +54,7 @@
               <w:right w:w="99" w:type="dxa"/>
             </w:tcMar>
             <w:tcBorders>
-              <w:left w:val="nil" w:sz="4" w:space="0" w:color="000000" tmln="10, 20, 20, 0, 0"/>
+              <w:left w:val="nil" w:sz="0" w:space="0" w:color="000000" tmln="20, 20, 20, 0, 0"/>
             </w:tcBorders>
             <w:tmTcPr id="1792316937" protected="0"/>
           </w:tcPr>
@@ -148,7 +148,10 @@
             </w:tcBorders>
             <w:tmTcPr id="1792316937" protected="0"/>
           </w:tcPr>
-          <w:p/>
+          <w:p>
+            <w:pPr/>
+            <w:r/>
+          </w:p>
         </w:tc>
         <w:tc>
           <w:tcPr>
@@ -159,7 +162,7 @@
               <w:right w:w="99" w:type="dxa"/>
             </w:tcMar>
             <w:tcBorders>
-              <w:left w:val="nil" w:sz="4" w:space="0" w:color="000000" tmln="10, 20, 20, 0, 0"/>
+              <w:left w:val="nil" w:sz="0" w:space="0" w:color="000000" tmln="20, 20, 20, 0, 0"/>
             </w:tcBorders>
             <w:tmTcPr id="1792316937" protected="0"/>
           </w:tcPr>
@@ -242,7 +245,10 @@
             </w:tcBorders>
             <w:tmTcPr id="1792316937" protected="0"/>
           </w:tcPr>
-          <w:p/>
+          <w:p>
+            <w:pPr/>
+            <w:r/>
+          </w:p>
         </w:tc>
         <w:tc>
           <w:tcPr>
@@ -253,7 +259,7 @@
               <w:right w:w="99" w:type="dxa"/>
             </w:tcMar>
             <w:tcBorders>
-              <w:left w:val="nil" w:sz="4" w:space="0" w:color="000000" tmln="10, 20, 20, 0, 0"/>
+              <w:left w:val="nil" w:sz="0" w:space="0" w:color="000000" tmln="20, 20, 20, 0, 0"/>
             </w:tcBorders>
             <w:tmTcPr id="1792316937" protected="0"/>
           </w:tcPr>
@@ -316,7 +322,10 @@
             </w:tcBorders>
             <w:tmTcPr id="1792316937" protected="0"/>
           </w:tcPr>
-          <w:p/>
+          <w:p>
+            <w:pPr/>
+            <w:r/>
+          </w:p>
         </w:tc>
         <w:tc>
           <w:tcPr>
@@ -327,7 +336,7 @@
               <w:right w:w="99" w:type="dxa"/>
             </w:tcMar>
             <w:tcBorders>
-              <w:left w:val="nil" w:sz="4" w:space="0" w:color="000000" tmln="10, 20, 20, 0, 0"/>
+              <w:left w:val="nil" w:sz="0" w:space="0" w:color="000000" tmln="20, 20, 20, 0, 0"/>
             </w:tcBorders>
             <w:tmTcPr id="1792316937" protected="0"/>
           </w:tcPr>
@@ -522,6 +531,12 @@
         </w:rPr>
         <w:t>검색 증강 생성(RAG)은 외부 문서에서 찾은 근거로 답변을 만들며[1], 최근에는 LLM으로 검색 후보의 순위를 다시 매기는 방식도 널리 쓰인다[2]. 문서 간 관계를 검색에 반영하려는 연구도 이어지고 있다. GraphRAG와 LightRAG는 문서에서 관계 그래프를 자동으로 구축하고[3,4], KG²RAG는 처음 찾은 청크에서 지식그래프를 따라 주변 청크로 검색 범위를 넓힌다[5]. 철도 분야에서는 공간 지식그래프를 탐색하는 CARAG와 출입문 고장 이력을 활용하는 도시철도 RAG가 제안되었고[6,7], 법률 분야에서도 근거 검색 평가셋과 한국어 하이브리드 검색 연구가 나왔다[8,9]. 다만 이들 방법은 문서 간 관계를 모델이 추출하거나 별도로 구축한 지식그래프에 의존한다. 본 시스템에서는 관리자가 규정과 길라잡이의 대응 구간을 직접 연결해 둔다. 본 연구는 새로운 그래프 알고리즘을 제안하기보다, 이렇게 사람이 등록한 링크로 검색을 확장했을 때 필요한 근거를 얼마나 더 찾을 수 있는지 살펴본다.</w:t>
       </w:r>
+      <w:r>
+        <w:rPr>
+          <w:rFonts w:ascii="함초롬돋움" w:hAnsi="함초롬돋움" w:eastAsia="함초롬돋움" w:cs="함초롬돋움"/>
+          <w:sz w:val="18"/>
+        </w:rPr>
+      </w:r>
     </w:p>
     <w:p>
       <w:pPr>
@@ -594,12 +609,12 @@
               <a:graphicData uri="http://schemas.openxmlformats.org/drawingml/2006/picture">
                 <pic:pic xmlns:pic="http://schemas.openxmlformats.org/drawingml/2006/picture">
                   <pic:nvPicPr>
-                    <pic:cNvPr id="1" name="Picture 1" descr="그림 1. 승인 링크를 이용한 검색 과정"/>
+                    <pic:cNvPr id="1" name="Picture 1"/>
                     <pic:cNvPicPr>
                       <a:picLocks noChangeAspect="1"/>
                       <a:extLst>
                         <a:ext uri="sm">
-                          <sm:smNativeData xmlns:sm="sm" val="SMDATA_16_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"/>
+                          <sm:smNativeData xmlns:sm="sm" val="SMDATA_16_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"/>
                         </a:ext>
                       </a:extLst>
                     </pic:cNvPicPr>
@@ -667,8 +682,8 @@
       </w:r>
       <w:r>
         <w:rPr>
-          <w:sz w:val="18"/>
-          <w:szCs w:val="18"/>
+          <w:sz w:val="14"/>
+          <w:szCs w:val="14"/>
         </w:rPr>
       </w:r>
     </w:p>
@@ -755,8 +770,8 @@
       </w:r>
       <w:r>
         <w:rPr>
-          <w:sz w:val="18"/>
-          <w:szCs w:val="18"/>
+          <w:sz w:val="14"/>
+          <w:szCs w:val="14"/>
         </w:rPr>
       </w:r>
     </w:p>
@@ -1909,14 +1924,12 @@
           <w:sz w:val="18"/>
           <w:szCs w:val="18"/>
         </w:rPr>
-        <w:t>표 2. 동일 질의에 대한 방법 간 차이와 끝점 군집 부트스트랩 95% 구간</w:t>
-        <w:t xml:space="preserve"> </w:t>
-        <w:t>(10,000회). L=link_all, P=proposed.</w:t>
+        <w:t>표 2. 동일 질의에 대한 방법 간 차이와 끝점 군집 부트스트랩 95% 구간 (10,000회). L=link_all, P=proposed.</w:t>
       </w:r>
       <w:r>
         <w:rPr>
-          <w:sz w:val="18"/>
-          <w:szCs w:val="18"/>
+          <w:sz w:val="14"/>
+          <w:szCs w:val="14"/>
         </w:rPr>
       </w:r>
     </w:p>
@@ -2904,8 +2917,8 @@
       </w:r>
       <w:r>
         <w:rPr>
-          <w:sz w:val="18"/>
-          <w:szCs w:val="18"/>
+          <w:sz w:val="14"/>
+          <w:szCs w:val="14"/>
         </w:rPr>
       </w:r>
     </w:p>
@@ -3498,6 +3511,12 @@
           <w:sz w:val="18"/>
         </w:rPr>
         <w:t>그래프형 질의의 평균 응답 시간은 K3 1.446초, link_all 2.157초, proposed 2.678초로, proposed는 연결 근거를 한 번 더 재정렬하는 만큼 link_all보다 약 0.5초 느렸다(표 3).</w:t>
+      </w:r>
+      <w:r>
+        <w:rPr>
+          <w:rFonts w:ascii="함초롬돋움" w:hAnsi="함초롬돋움" w:eastAsia="함초롬돋움" w:cs="함초롬돋움"/>
+          <w:sz w:val="18"/>
+        </w:rPr>
       </w:r>
     </w:p>
     <w:p>
@@ -4778,11 +4797,6 @@
   <w:style w:type="table" w:styleId="1">
     <w:name w:val="표 구분선1"/>
     <w:basedOn w:val="1"/>
-    <w:pPr>
-      <w:spacing/>
-      <w:jc w:val="both"/>
-      <w:widowControl w:val="0"/>
-    </w:pPr>
     <w:tblPr>
       <w:tblBorders>
         <w:top w:val="single" w:sz="4" w:space="0" w:color="000000" tmln="10, 0, 0, 0, 0"/>
@@ -5387,11 +5401,6 @@
   <w:style w:type="table" w:styleId="1">
     <w:name w:val="표 구분선1"/>
     <w:basedOn w:val="1"/>
-    <w:pPr>
-      <w:spacing/>
-      <w:jc w:val="both"/>
-      <w:widowControl w:val="0"/>
-    </w:pPr>
     <w:tblPr>
       <w:tblBorders>
         <w:top w:val="single" w:sz="4" w:space="0" w:color="000000" tmln="10, 0, 0, 0, 0"/>

</xml_diff>

<commit_message>
paper: title metadata, Table 1 caption, word-level wrapping in v2
</commit_message>
<xml_diff>
--- a/paper/final/다알지_논문_v2.docx
+++ b/paper/final/다알지_논문_v2.docx
@@ -11,8 +11,8 @@
         <w:tblInd w:w="1097" w:type="dxa"/>
         <w:tblW w:w="8958" w:type="dxa"/>
         <w:pPr>
+          <w:spacing/>
           <w:ind w:left="1097"/>
-          <w:spacing/>
           <w:jc w:val="left"/>
         </w:pPr>
         <w:tblLook w:val="0000" w:firstRow="0" w:lastRow="0" w:firstColumn="0" w:lastColumn="0" w:noHBand="0" w:noVBand="0"/>
@@ -41,7 +41,9 @@
             <w:tmTcPr id="1792316937" protected="0"/>
           </w:tcPr>
           <w:p>
-            <w:pPr/>
+            <w:pPr>
+              <w:wordWrap w:val="1"/>
+            </w:pPr>
             <w:r/>
           </w:p>
         </w:tc>
@@ -60,12 +62,13 @@
           </w:tcPr>
           <w:p>
             <w:pPr>
-              <w:spacing w:line="276" w:lineRule="auto"/>
-              <w:jc w:val="center"/>
               <w:tabs defTabSz="800">
                 <w:tab w:val="left" w:pos="1260" w:leader="none"/>
                 <w:tab w:val="left" w:pos="9180" w:leader="none"/>
               </w:tabs>
+              <w:wordWrap w:val="1"/>
+              <w:spacing w:line="276" w:lineRule="auto"/>
+              <w:jc w:val="center"/>
               <w:rPr>
                 <w:rFonts w:ascii="함초롬돋움" w:hAnsi="함초롬돋움" w:eastAsia="함초롬돋움" w:cs="함초롬돋움"/>
                 <w:b/>
@@ -86,12 +89,13 @@
           </w:p>
           <w:p>
             <w:pPr>
-              <w:spacing w:line="276" w:lineRule="auto"/>
-              <w:jc w:val="center"/>
               <w:tabs defTabSz="800">
                 <w:tab w:val="left" w:pos="1260" w:leader="none"/>
                 <w:tab w:val="left" w:pos="9180" w:leader="none"/>
               </w:tabs>
+              <w:wordWrap w:val="1"/>
+              <w:spacing w:line="276" w:lineRule="auto"/>
+              <w:jc w:val="center"/>
               <w:rPr>
                 <w:rFonts w:ascii="함초롬돋움" w:hAnsi="함초롬돋움" w:eastAsia="함초롬돋움" w:cs="함초롬돋움"/>
                 <w:sz w:val="40"/>
@@ -149,7 +153,9 @@
             <w:tmTcPr id="1792316937" protected="0"/>
           </w:tcPr>
           <w:p>
-            <w:pPr/>
+            <w:pPr>
+              <w:wordWrap w:val="1"/>
+            </w:pPr>
             <w:r/>
           </w:p>
         </w:tc>
@@ -168,45 +174,48 @@
           </w:tcPr>
           <w:p>
             <w:pPr>
-              <w:spacing w:line="276" w:lineRule="auto"/>
-              <w:jc w:val="center"/>
               <w:tabs defTabSz="800">
                 <w:tab w:val="left" w:pos="3300" w:leader="none"/>
               </w:tabs>
-              <w:rPr>
-                <w:rFonts w:ascii="함초롬돋움" w:hAnsi="함초롬돋움" w:eastAsia="함초롬돋움" w:cs="함초롬돋움"/>
-              </w:rPr>
-            </w:pPr>
-            <w:r>
-              <w:rPr>
-                <w:rFonts w:ascii="함초롬돋움" w:hAnsi="함초롬돋움" w:eastAsia="함초롬돋움" w:cs="함초롬돋움"/>
-              </w:rPr>
-            </w:r>
-          </w:p>
-          <w:p>
-            <w:pPr>
+              <w:wordWrap w:val="1"/>
               <w:spacing w:line="276" w:lineRule="auto"/>
               <w:jc w:val="center"/>
+              <w:rPr>
+                <w:rFonts w:ascii="함초롬돋움" w:hAnsi="함초롬돋움" w:eastAsia="함초롬돋움" w:cs="함초롬돋움"/>
+              </w:rPr>
+            </w:pPr>
+            <w:r>
+              <w:rPr>
+                <w:rFonts w:ascii="함초롬돋움" w:hAnsi="함초롬돋움" w:eastAsia="함초롬돋움" w:cs="함초롬돋움"/>
+              </w:rPr>
+            </w:r>
+          </w:p>
+          <w:p>
+            <w:pPr>
               <w:tabs defTabSz="800">
                 <w:tab w:val="left" w:pos="3300" w:leader="none"/>
               </w:tabs>
-              <w:rPr>
-                <w:rFonts w:ascii="함초롬돋움" w:hAnsi="함초롬돋움" w:eastAsia="함초롬돋움" w:cs="함초롬돋움"/>
-              </w:rPr>
-            </w:pPr>
-            <w:r>
-              <w:rPr>
-                <w:rFonts w:ascii="함초롬돋움" w:hAnsi="함초롬돋움" w:eastAsia="함초롬돋움" w:cs="함초롬돋움"/>
-              </w:rPr>
-            </w:r>
-          </w:p>
-          <w:p>
-            <w:pPr>
+              <w:wordWrap w:val="1"/>
               <w:spacing w:line="276" w:lineRule="auto"/>
               <w:jc w:val="center"/>
+              <w:rPr>
+                <w:rFonts w:ascii="함초롬돋움" w:hAnsi="함초롬돋움" w:eastAsia="함초롬돋움" w:cs="함초롬돋움"/>
+              </w:rPr>
+            </w:pPr>
+            <w:r>
+              <w:rPr>
+                <w:rFonts w:ascii="함초롬돋움" w:hAnsi="함초롬돋움" w:eastAsia="함초롬돋움" w:cs="함초롬돋움"/>
+              </w:rPr>
+            </w:r>
+          </w:p>
+          <w:p>
+            <w:pPr>
               <w:tabs defTabSz="800">
                 <w:tab w:val="left" w:pos="3300" w:leader="none"/>
               </w:tabs>
+              <w:wordWrap w:val="1"/>
+              <w:spacing w:line="276" w:lineRule="auto"/>
+              <w:jc w:val="center"/>
               <w:rPr>
                 <w:rFonts w:ascii="함초롬돋움" w:hAnsi="함초롬돋움" w:eastAsia="함초롬돋움" w:cs="함초롬돋움"/>
               </w:rPr>
@@ -246,7 +255,9 @@
             <w:tmTcPr id="1792316937" protected="0"/>
           </w:tcPr>
           <w:p>
-            <w:pPr/>
+            <w:pPr>
+              <w:wordWrap w:val="1"/>
+            </w:pPr>
             <w:r/>
           </w:p>
         </w:tc>
@@ -265,6 +276,7 @@
           </w:tcPr>
           <w:p>
             <w:pPr>
+              <w:wordWrap w:val="1"/>
               <w:spacing/>
               <w:jc w:val="center"/>
               <w:rPr>
@@ -323,7 +335,9 @@
             <w:tmTcPr id="1792316937" protected="0"/>
           </w:tcPr>
           <w:p>
-            <w:pPr/>
+            <w:pPr>
+              <w:wordWrap w:val="1"/>
+            </w:pPr>
             <w:r/>
           </w:p>
         </w:tc>
@@ -342,11 +356,12 @@
           </w:tcPr>
           <w:p>
             <w:pPr>
-              <w:spacing w:line="276" w:lineRule="auto"/>
               <w:tabs defTabSz="800">
                 <w:tab w:val="left" w:pos="1260" w:leader="none"/>
                 <w:tab w:val="left" w:pos="9180" w:leader="none"/>
               </w:tabs>
+              <w:wordWrap w:val="1"/>
+              <w:spacing w:line="276" w:lineRule="auto"/>
               <w:rPr>
                 <w:rFonts w:cs="Times New Roman"/>
               </w:rPr>
@@ -378,6 +393,7 @@
           </w:tcPr>
           <w:p>
             <w:pPr>
+              <w:wordWrap w:val="1"/>
               <w:spacing w:line="276" w:lineRule="auto"/>
               <w:jc w:val="center"/>
               <w:rPr>
@@ -420,27 +436,29 @@
           </w:p>
           <w:p>
             <w:pPr>
+              <w:wordWrap w:val="1"/>
+              <w:spacing w:line="276" w:lineRule="auto"/>
               <w:ind w:firstLine="97"/>
+              <w:rPr>
+                <w:rFonts w:ascii="함초롬돋움" w:hAnsi="함초롬돋움" w:eastAsia="함초롬돋움" w:cs="함초롬돋움"/>
+                <w:sz w:val="18"/>
+                <w:szCs w:val="18"/>
+              </w:rPr>
+            </w:pPr>
+            <w:r>
+              <w:rPr>
+                <w:rFonts w:ascii="함초롬돋움" w:hAnsi="함초롬돋움" w:eastAsia="함초롬돋움" w:cs="함초롬돋움"/>
+                <w:sz w:val="18"/>
+                <w:szCs w:val="18"/>
+              </w:rPr>
+              <w:t>철도 현장에서 설비 고장에 대응하려면 길라잡이의 조치 절차와 규정의 보고·운전 조건을 함께 찾아야 하지만, 두 내용은 서로 다른 문서에 흩어져 있다. 본 연구는 관리자가 규정과 길라잡이의 대응 구간을 직접 연결해 둔 승인 링크로 검색 결과를 확장하는 방법을 평가했다. 다른 문서의 근거가 필요한 그래프형 질의 20건에서 링크로 확장한 검색의 Recall은 0.850으로, 비슷한 수의 근거를 쓰는 기준선(0.618)보다 높았다. 다만 신규 질의는 링크를 먼저 정한 뒤 만들었기 때문에, 링크와 무관한 현장 질의에서의 효과는 더 확인해야 한다.</w:t>
+            </w:r>
+          </w:p>
+          <w:p>
+            <w:pPr>
+              <w:wordWrap w:val="1"/>
               <w:spacing w:line="276" w:lineRule="auto"/>
-              <w:rPr>
-                <w:rFonts w:ascii="함초롬돋움" w:hAnsi="함초롬돋움" w:eastAsia="함초롬돋움" w:cs="함초롬돋움"/>
-                <w:sz w:val="18"/>
-                <w:szCs w:val="18"/>
-              </w:rPr>
-            </w:pPr>
-            <w:r>
-              <w:rPr>
-                <w:rFonts w:ascii="함초롬돋움" w:hAnsi="함초롬돋움" w:eastAsia="함초롬돋움" w:cs="함초롬돋움"/>
-                <w:sz w:val="18"/>
-                <w:szCs w:val="18"/>
-              </w:rPr>
-              <w:t>철도 현장에서 설비 고장에 대응하려면 길라잡이의 조치 절차와 규정의 보고·운전 조건을 함께 찾아야 하지만, 두 내용은 서로 다른 문서에 흩어져 있다. 본 연구는 관리자가 규정과 길라잡이의 대응 구간을 직접 연결해 둔 승인 링크로 검색 결과를 확장하는 방법을 평가했다. 다른 문서의 근거가 필요한 그래프형 질의 20건에서 링크로 확장한 검색의 Recall은 0.850으로, 비슷한 수의 근거를 쓰는 기준선(0.618)보다 높았다. 다만 신규 질의는 링크를 먼저 정한 뒤 만들었기 때문에, 링크와 무관한 현장 질의에서의 효과는 더 확인해야 한다.</w:t>
-            </w:r>
-          </w:p>
-          <w:p>
-            <w:pPr>
               <w:ind w:firstLine="90"/>
-              <w:spacing w:line="276" w:lineRule="auto"/>
               <w:rPr>
                 <w:rFonts w:ascii="굴림" w:hAnsi="굴림" w:eastAsia="굴림" w:cs="굴림"/>
                 <w:sz w:val="18"/>
@@ -460,6 +478,7 @@
     </w:tbl>
     <w:p>
       <w:pPr>
+        <w:wordWrap w:val="1"/>
         <w:sectPr>
           <w:footnotePr>
             <w:pos w:val="pageBottom"/>
@@ -489,8 +508,9 @@
     </w:p>
     <w:p>
       <w:pPr>
+        <w:keepNext/>
+        <w:wordWrap w:val="1"/>
         <w:spacing w:line="300" w:lineRule="exact"/>
-        <w:keepNext/>
       </w:pPr>
       <w:r>
         <w:rPr>
@@ -503,8 +523,9 @@
     </w:p>
     <w:p>
       <w:pPr>
+        <w:wordWrap w:val="1"/>
+        <w:spacing w:line="300" w:lineRule="exact"/>
         <w:ind w:firstLine="180"/>
-        <w:spacing w:line="300" w:lineRule="exact"/>
       </w:pPr>
       <w:r>
         <w:rPr>
@@ -517,8 +538,9 @@
     </w:p>
     <w:p>
       <w:pPr>
+        <w:wordWrap w:val="1"/>
+        <w:spacing w:line="300" w:lineRule="exact"/>
         <w:ind w:firstLine="180"/>
-        <w:spacing w:line="300" w:lineRule="exact"/>
         <w:rPr>
           <w:rFonts w:ascii="함초롬돋움" w:hAnsi="함초롬돋움" w:eastAsia="함초롬돋움" w:cs="함초롬돋움"/>
           <w:sz w:val="18"/>
@@ -540,15 +562,17 @@
     </w:p>
     <w:p>
       <w:pPr>
+        <w:wordWrap w:val="1"/>
+        <w:spacing w:line="300" w:lineRule="exact"/>
         <w:ind w:firstLine="180"/>
-        <w:spacing w:line="300" w:lineRule="exact"/>
       </w:pPr>
       <w:r/>
     </w:p>
     <w:p>
       <w:pPr>
+        <w:keepNext/>
+        <w:wordWrap w:val="1"/>
         <w:spacing w:before="80" w:line="300" w:lineRule="exact"/>
-        <w:keepNext/>
       </w:pPr>
       <w:r>
         <w:rPr>
@@ -561,8 +585,9 @@
     </w:p>
     <w:p>
       <w:pPr>
+        <w:wordWrap w:val="1"/>
+        <w:spacing w:line="300" w:lineRule="exact"/>
         <w:ind w:firstLine="180"/>
-        <w:spacing w:line="300" w:lineRule="exact"/>
       </w:pPr>
       <w:r>
         <w:rPr>
@@ -575,8 +600,9 @@
     </w:p>
     <w:p>
       <w:pPr>
+        <w:wordWrap w:val="1"/>
+        <w:spacing w:line="300" w:lineRule="exact"/>
         <w:ind w:firstLine="180"/>
-        <w:spacing w:line="300" w:lineRule="exact"/>
       </w:pPr>
       <w:r>
         <w:rPr>
@@ -589,9 +615,10 @@
     </w:p>
     <w:p>
       <w:pPr>
+        <w:keepNext/>
+        <w:wordWrap w:val="1"/>
         <w:spacing w:before="80"/>
         <w:jc w:val="center"/>
-        <w:keepNext/>
       </w:pPr>
       <w:r>
         <w:rPr>
@@ -648,6 +675,7 @@
     </w:p>
     <w:p>
       <w:pPr>
+        <w:wordWrap w:val="1"/>
         <w:spacing w:after="80"/>
         <w:jc w:val="center"/>
         <w:rPr>
@@ -689,15 +717,17 @@
     </w:p>
     <w:p>
       <w:pPr>
+        <w:keepNext/>
+        <w:wordWrap w:val="1"/>
         <w:spacing w:before="80" w:line="300" w:lineRule="exact"/>
-        <w:keepNext/>
       </w:pPr>
       <w:r/>
     </w:p>
     <w:p>
       <w:pPr>
+        <w:keepNext/>
+        <w:wordWrap w:val="1"/>
         <w:spacing w:before="80" w:line="300" w:lineRule="exact"/>
-        <w:keepNext/>
       </w:pPr>
       <w:r>
         <w:rPr>
@@ -710,8 +740,9 @@
     </w:p>
     <w:p>
       <w:pPr>
+        <w:wordWrap w:val="1"/>
+        <w:spacing w:line="300" w:lineRule="exact"/>
         <w:ind w:firstLine="180"/>
-        <w:spacing w:line="300" w:lineRule="exact"/>
       </w:pPr>
       <w:r>
         <w:rPr>
@@ -724,8 +755,9 @@
     </w:p>
     <w:p>
       <w:pPr>
+        <w:wordWrap w:val="1"/>
+        <w:spacing w:line="300" w:lineRule="exact"/>
         <w:ind w:firstLine="180"/>
-        <w:spacing w:line="300" w:lineRule="exact"/>
       </w:pPr>
       <w:r>
         <w:rPr>
@@ -738,8 +770,9 @@
     </w:p>
     <w:p>
       <w:pPr>
+        <w:wordWrap w:val="1"/>
+        <w:spacing w:line="300" w:lineRule="exact"/>
         <w:ind w:firstLine="180"/>
-        <w:spacing w:line="300" w:lineRule="exact"/>
       </w:pPr>
       <w:r>
         <w:rPr>
@@ -752,9 +785,10 @@
     </w:p>
     <w:p>
       <w:pPr>
+        <w:keepNext/>
+        <w:wordWrap w:val="1"/>
         <w:spacing w:before="80" w:after="40"/>
         <w:jc w:val="center"/>
-        <w:keepNext/>
         <w:rPr>
           <w:sz w:val="14"/>
           <w:szCs w:val="14"/>
@@ -766,13 +800,7 @@
           <w:sz w:val="18"/>
           <w:szCs w:val="18"/>
         </w:rPr>
-        <w:t>표 1. 그래프형 질의의 검색 결과(n=20). 3회 반복 평균±표준편차.</w:t>
-      </w:r>
-      <w:r>
-        <w:rPr>
-          <w:sz w:val="14"/>
-          <w:szCs w:val="14"/>
-        </w:rPr>
+        <w:t>표 1. 그래프형 질의의 검색 결과(n=20, 3회 평균±표준편차).</w:t>
       </w:r>
     </w:p>
     <w:tbl>
@@ -819,9 +847,44 @@
           </w:tcPr>
           <w:p>
             <w:pPr>
+              <w:keepNext/>
+              <w:wordWrap w:val="1"/>
               <w:spacing w:before="0" w:after="0" w:line="240" w:lineRule="auto"/>
               <w:jc w:val="left"/>
+            </w:pPr>
+            <w:r>
+              <w:rPr>
+                <w:rFonts w:ascii="함초롬돋움" w:hAnsi="함초롬돋움" w:eastAsia="함초롬돋움" w:cs="함초롬돋움"/>
+                <w:b/>
+                <w:sz w:val="18"/>
+              </w:rPr>
+              <w:t>변형</w:t>
+            </w:r>
+            <w:r/>
+          </w:p>
+        </w:tc>
+        <w:tc>
+          <w:tcPr>
+            <w:tcW w:w="1268" w:type="dxa"/>
+            <w:vAlign w:val="center"/>
+            <w:tcMar>
+              <w:left w:w="57" w:type="dxa"/>
+              <w:right w:w="57" w:type="dxa"/>
+            </w:tcMar>
+            <w:tcBorders>
+              <w:top w:val="single" w:sz="4" w:space="0" w:color="000000" tmln="10, 20, 20, 0, 0"/>
+              <w:left w:val="single" w:sz="4" w:space="0" w:color="000000" tmln="10, 20, 20, 0, 0"/>
+              <w:bottom w:val="single" w:sz="4" w:space="0" w:color="000000" tmln="10, 20, 20, 0, 0"/>
+              <w:right w:val="single" w:sz="4" w:space="0" w:color="000000" tmln="10, 20, 20, 0, 0"/>
+            </w:tcBorders>
+            <w:tmTcPr id="1792316937" protected="0"/>
+          </w:tcPr>
+          <w:p>
+            <w:pPr>
               <w:keepNext/>
+              <w:wordWrap w:val="1"/>
+              <w:spacing w:before="0" w:after="0" w:line="240" w:lineRule="auto"/>
+              <w:jc w:val="center"/>
             </w:pPr>
             <w:r>
               <w:rPr>
@@ -829,7 +892,7 @@
                 <w:b/>
                 <w:sz w:val="18"/>
               </w:rPr>
-              <w:t>변형</w:t>
+              <w:t>Recall</w:t>
             </w:r>
             <w:r/>
           </w:p>
@@ -852,86 +915,55 @@
           </w:tcPr>
           <w:p>
             <w:pPr>
+              <w:keepNext/>
+              <w:wordWrap w:val="1"/>
               <w:spacing w:before="0" w:after="0" w:line="240" w:lineRule="auto"/>
               <w:jc w:val="center"/>
+            </w:pPr>
+            <w:r>
+              <w:rPr>
+                <w:rFonts w:ascii="함초롬돋움" w:hAnsi="함초롬돋움" w:eastAsia="함초롬돋움" w:cs="함초롬돋움"/>
+                <w:b/>
+                <w:sz w:val="18"/>
+              </w:rPr>
+              <w:t>링크 정답</w:t>
+            </w:r>
+            <w:r>
+              <w:br w:type="textWrapping"/>
+            </w:r>
+            <w:r>
+              <w:rPr>
+                <w:rFonts w:ascii="함초롬돋움" w:hAnsi="함초롬돋움" w:eastAsia="함초롬돋움" w:cs="함초롬돋움"/>
+                <w:b/>
+                <w:sz w:val="18"/>
+              </w:rPr>
+              <w:t>Recall</w:t>
+            </w:r>
+            <w:r/>
+          </w:p>
+        </w:tc>
+        <w:tc>
+          <w:tcPr>
+            <w:tcW w:w="1268" w:type="dxa"/>
+            <w:vAlign w:val="center"/>
+            <w:tcMar>
+              <w:left w:w="57" w:type="dxa"/>
+              <w:right w:w="57" w:type="dxa"/>
+            </w:tcMar>
+            <w:tcBorders>
+              <w:top w:val="single" w:sz="4" w:space="0" w:color="000000" tmln="10, 20, 20, 0, 0"/>
+              <w:left w:val="single" w:sz="4" w:space="0" w:color="000000" tmln="10, 20, 20, 0, 0"/>
+              <w:bottom w:val="single" w:sz="4" w:space="0" w:color="000000" tmln="10, 20, 20, 0, 0"/>
+              <w:right w:val="single" w:sz="4" w:space="0" w:color="000000" tmln="10, 20, 20, 0, 0"/>
+            </w:tcBorders>
+            <w:tmTcPr id="1792316937" protected="0"/>
+          </w:tcPr>
+          <w:p>
+            <w:pPr>
               <w:keepNext/>
-            </w:pPr>
-            <w:r>
-              <w:rPr>
-                <w:rFonts w:ascii="함초롬돋움" w:hAnsi="함초롬돋움" w:eastAsia="함초롬돋움" w:cs="함초롬돋움"/>
-                <w:b/>
-                <w:sz w:val="18"/>
-              </w:rPr>
-              <w:t>Recall</w:t>
-            </w:r>
-            <w:r/>
-          </w:p>
-        </w:tc>
-        <w:tc>
-          <w:tcPr>
-            <w:tcW w:w="1268" w:type="dxa"/>
-            <w:vAlign w:val="center"/>
-            <w:tcMar>
-              <w:left w:w="57" w:type="dxa"/>
-              <w:right w:w="57" w:type="dxa"/>
-            </w:tcMar>
-            <w:tcBorders>
-              <w:top w:val="single" w:sz="4" w:space="0" w:color="000000" tmln="10, 20, 20, 0, 0"/>
-              <w:left w:val="single" w:sz="4" w:space="0" w:color="000000" tmln="10, 20, 20, 0, 0"/>
-              <w:bottom w:val="single" w:sz="4" w:space="0" w:color="000000" tmln="10, 20, 20, 0, 0"/>
-              <w:right w:val="single" w:sz="4" w:space="0" w:color="000000" tmln="10, 20, 20, 0, 0"/>
-            </w:tcBorders>
-            <w:tmTcPr id="1792316937" protected="0"/>
-          </w:tcPr>
-          <w:p>
-            <w:pPr>
+              <w:wordWrap w:val="1"/>
               <w:spacing w:before="0" w:after="0" w:line="240" w:lineRule="auto"/>
               <w:jc w:val="center"/>
-              <w:keepNext/>
-            </w:pPr>
-            <w:r>
-              <w:rPr>
-                <w:rFonts w:ascii="함초롬돋움" w:hAnsi="함초롬돋움" w:eastAsia="함초롬돋움" w:cs="함초롬돋움"/>
-                <w:b/>
-                <w:sz w:val="18"/>
-              </w:rPr>
-              <w:t>링크 정답</w:t>
-            </w:r>
-            <w:r>
-              <w:br w:type="textWrapping"/>
-            </w:r>
-            <w:r>
-              <w:rPr>
-                <w:rFonts w:ascii="함초롬돋움" w:hAnsi="함초롬돋움" w:eastAsia="함초롬돋움" w:cs="함초롬돋움"/>
-                <w:b/>
-                <w:sz w:val="18"/>
-              </w:rPr>
-              <w:t>Recall</w:t>
-            </w:r>
-            <w:r/>
-          </w:p>
-        </w:tc>
-        <w:tc>
-          <w:tcPr>
-            <w:tcW w:w="1268" w:type="dxa"/>
-            <w:vAlign w:val="center"/>
-            <w:tcMar>
-              <w:left w:w="57" w:type="dxa"/>
-              <w:right w:w="57" w:type="dxa"/>
-            </w:tcMar>
-            <w:tcBorders>
-              <w:top w:val="single" w:sz="4" w:space="0" w:color="000000" tmln="10, 20, 20, 0, 0"/>
-              <w:left w:val="single" w:sz="4" w:space="0" w:color="000000" tmln="10, 20, 20, 0, 0"/>
-              <w:bottom w:val="single" w:sz="4" w:space="0" w:color="000000" tmln="10, 20, 20, 0, 0"/>
-              <w:right w:val="single" w:sz="4" w:space="0" w:color="000000" tmln="10, 20, 20, 0, 0"/>
-            </w:tcBorders>
-            <w:tmTcPr id="1792316937" protected="0"/>
-          </w:tcPr>
-          <w:p>
-            <w:pPr>
-              <w:spacing w:before="0" w:after="0" w:line="240" w:lineRule="auto"/>
-              <w:jc w:val="center"/>
-              <w:keepNext/>
             </w:pPr>
             <w:r>
               <w:rPr>
@@ -980,16 +1012,50 @@
           </w:tcPr>
           <w:p>
             <w:pPr>
+              <w:keepNext/>
+              <w:wordWrap w:val="1"/>
               <w:spacing w:before="0" w:after="0" w:line="240" w:lineRule="auto"/>
               <w:jc w:val="left"/>
+            </w:pPr>
+            <w:r>
+              <w:rPr>
+                <w:rFonts w:ascii="함초롬돋움" w:hAnsi="함초롬돋움" w:eastAsia="함초롬돋움" w:cs="함초롬돋움"/>
+                <w:sz w:val="18"/>
+              </w:rPr>
+              <w:t>BM25</w:t>
+            </w:r>
+            <w:r/>
+          </w:p>
+        </w:tc>
+        <w:tc>
+          <w:tcPr>
+            <w:tcW w:w="1268" w:type="dxa"/>
+            <w:vAlign w:val="center"/>
+            <w:tcMar>
+              <w:left w:w="57" w:type="dxa"/>
+              <w:right w:w="57" w:type="dxa"/>
+            </w:tcMar>
+            <w:tcBorders>
+              <w:top w:val="single" w:sz="4" w:space="0" w:color="000000" tmln="10, 20, 20, 0, 0"/>
+              <w:left w:val="single" w:sz="4" w:space="0" w:color="000000" tmln="10, 20, 20, 0, 0"/>
+              <w:bottom w:val="single" w:sz="4" w:space="0" w:color="000000" tmln="10, 20, 20, 0, 0"/>
+              <w:right w:val="single" w:sz="4" w:space="0" w:color="000000" tmln="10, 20, 20, 0, 0"/>
+            </w:tcBorders>
+            <w:tmTcPr id="1792316937" protected="0"/>
+          </w:tcPr>
+          <w:p>
+            <w:pPr>
               <w:keepNext/>
-            </w:pPr>
-            <w:r>
-              <w:rPr>
-                <w:rFonts w:ascii="함초롬돋움" w:hAnsi="함초롬돋움" w:eastAsia="함초롬돋움" w:cs="함초롬돋움"/>
-                <w:sz w:val="18"/>
-              </w:rPr>
-              <w:t>BM25</w:t>
+              <w:wordWrap w:val="1"/>
+              <w:spacing w:before="0" w:after="0" w:line="240" w:lineRule="auto"/>
+              <w:jc w:val="center"/>
+            </w:pPr>
+            <w:r>
+              <w:rPr>
+                <w:rFonts w:ascii="함초롬돋움" w:hAnsi="함초롬돋움" w:eastAsia="함초롬돋움" w:cs="함초롬돋움"/>
+                <w:sz w:val="18"/>
+              </w:rPr>
+              <w:t>0.592±.000</w:t>
             </w:r>
             <w:r/>
           </w:p>
@@ -1012,73 +1078,43 @@
           </w:tcPr>
           <w:p>
             <w:pPr>
+              <w:keepNext/>
+              <w:wordWrap w:val="1"/>
               <w:spacing w:before="0" w:after="0" w:line="240" w:lineRule="auto"/>
               <w:jc w:val="center"/>
+            </w:pPr>
+            <w:r>
+              <w:rPr>
+                <w:rFonts w:ascii="함초롬돋움" w:hAnsi="함초롬돋움" w:eastAsia="함초롬돋움" w:cs="함초롬돋움"/>
+                <w:sz w:val="18"/>
+              </w:rPr>
+              <w:t>0.275±.000</w:t>
+            </w:r>
+            <w:r/>
+          </w:p>
+        </w:tc>
+        <w:tc>
+          <w:tcPr>
+            <w:tcW w:w="1268" w:type="dxa"/>
+            <w:vAlign w:val="center"/>
+            <w:tcMar>
+              <w:left w:w="57" w:type="dxa"/>
+              <w:right w:w="57" w:type="dxa"/>
+            </w:tcMar>
+            <w:tcBorders>
+              <w:top w:val="single" w:sz="4" w:space="0" w:color="000000" tmln="10, 20, 20, 0, 0"/>
+              <w:left w:val="single" w:sz="4" w:space="0" w:color="000000" tmln="10, 20, 20, 0, 0"/>
+              <w:bottom w:val="single" w:sz="4" w:space="0" w:color="000000" tmln="10, 20, 20, 0, 0"/>
+              <w:right w:val="single" w:sz="4" w:space="0" w:color="000000" tmln="10, 20, 20, 0, 0"/>
+            </w:tcBorders>
+            <w:tmTcPr id="1792316937" protected="0"/>
+          </w:tcPr>
+          <w:p>
+            <w:pPr>
               <w:keepNext/>
-            </w:pPr>
-            <w:r>
-              <w:rPr>
-                <w:rFonts w:ascii="함초롬돋움" w:hAnsi="함초롬돋움" w:eastAsia="함초롬돋움" w:cs="함초롬돋움"/>
-                <w:sz w:val="18"/>
-              </w:rPr>
-              <w:t>0.592±.000</w:t>
-            </w:r>
-            <w:r/>
-          </w:p>
-        </w:tc>
-        <w:tc>
-          <w:tcPr>
-            <w:tcW w:w="1268" w:type="dxa"/>
-            <w:vAlign w:val="center"/>
-            <w:tcMar>
-              <w:left w:w="57" w:type="dxa"/>
-              <w:right w:w="57" w:type="dxa"/>
-            </w:tcMar>
-            <w:tcBorders>
-              <w:top w:val="single" w:sz="4" w:space="0" w:color="000000" tmln="10, 20, 20, 0, 0"/>
-              <w:left w:val="single" w:sz="4" w:space="0" w:color="000000" tmln="10, 20, 20, 0, 0"/>
-              <w:bottom w:val="single" w:sz="4" w:space="0" w:color="000000" tmln="10, 20, 20, 0, 0"/>
-              <w:right w:val="single" w:sz="4" w:space="0" w:color="000000" tmln="10, 20, 20, 0, 0"/>
-            </w:tcBorders>
-            <w:tmTcPr id="1792316937" protected="0"/>
-          </w:tcPr>
-          <w:p>
-            <w:pPr>
+              <w:wordWrap w:val="1"/>
               <w:spacing w:before="0" w:after="0" w:line="240" w:lineRule="auto"/>
               <w:jc w:val="center"/>
-              <w:keepNext/>
-            </w:pPr>
-            <w:r>
-              <w:rPr>
-                <w:rFonts w:ascii="함초롬돋움" w:hAnsi="함초롬돋움" w:eastAsia="함초롬돋움" w:cs="함초롬돋움"/>
-                <w:sz w:val="18"/>
-              </w:rPr>
-              <w:t>0.275±.000</w:t>
-            </w:r>
-            <w:r/>
-          </w:p>
-        </w:tc>
-        <w:tc>
-          <w:tcPr>
-            <w:tcW w:w="1268" w:type="dxa"/>
-            <w:vAlign w:val="center"/>
-            <w:tcMar>
-              <w:left w:w="57" w:type="dxa"/>
-              <w:right w:w="57" w:type="dxa"/>
-            </w:tcMar>
-            <w:tcBorders>
-              <w:top w:val="single" w:sz="4" w:space="0" w:color="000000" tmln="10, 20, 20, 0, 0"/>
-              <w:left w:val="single" w:sz="4" w:space="0" w:color="000000" tmln="10, 20, 20, 0, 0"/>
-              <w:bottom w:val="single" w:sz="4" w:space="0" w:color="000000" tmln="10, 20, 20, 0, 0"/>
-              <w:right w:val="single" w:sz="4" w:space="0" w:color="000000" tmln="10, 20, 20, 0, 0"/>
-            </w:tcBorders>
-            <w:tmTcPr id="1792316937" protected="0"/>
-          </w:tcPr>
-          <w:p>
-            <w:pPr>
-              <w:spacing w:before="0" w:after="0" w:line="240" w:lineRule="auto"/>
-              <w:jc w:val="center"/>
-              <w:keepNext/>
             </w:pPr>
             <w:r>
               <w:rPr>
@@ -1115,16 +1151,50 @@
           </w:tcPr>
           <w:p>
             <w:pPr>
+              <w:keepNext/>
+              <w:wordWrap w:val="1"/>
               <w:spacing w:before="0" w:after="0" w:line="240" w:lineRule="auto"/>
               <w:jc w:val="left"/>
+            </w:pPr>
+            <w:r>
+              <w:rPr>
+                <w:rFonts w:ascii="함초롬돋움" w:hAnsi="함초롬돋움" w:eastAsia="함초롬돋움" w:cs="함초롬돋움"/>
+                <w:sz w:val="18"/>
+              </w:rPr>
+              <w:t>Dense</w:t>
+            </w:r>
+            <w:r/>
+          </w:p>
+        </w:tc>
+        <w:tc>
+          <w:tcPr>
+            <w:tcW w:w="1268" w:type="dxa"/>
+            <w:vAlign w:val="center"/>
+            <w:tcMar>
+              <w:left w:w="57" w:type="dxa"/>
+              <w:right w:w="57" w:type="dxa"/>
+            </w:tcMar>
+            <w:tcBorders>
+              <w:top w:val="single" w:sz="4" w:space="0" w:color="000000" tmln="10, 20, 20, 0, 0"/>
+              <w:left w:val="single" w:sz="4" w:space="0" w:color="000000" tmln="10, 20, 20, 0, 0"/>
+              <w:bottom w:val="single" w:sz="4" w:space="0" w:color="000000" tmln="10, 20, 20, 0, 0"/>
+              <w:right w:val="single" w:sz="4" w:space="0" w:color="000000" tmln="10, 20, 20, 0, 0"/>
+            </w:tcBorders>
+            <w:tmTcPr id="1792316937" protected="0"/>
+          </w:tcPr>
+          <w:p>
+            <w:pPr>
               <w:keepNext/>
-            </w:pPr>
-            <w:r>
-              <w:rPr>
-                <w:rFonts w:ascii="함초롬돋움" w:hAnsi="함초롬돋움" w:eastAsia="함초롬돋움" w:cs="함초롬돋움"/>
-                <w:sz w:val="18"/>
-              </w:rPr>
-              <w:t>Dense</w:t>
+              <w:wordWrap w:val="1"/>
+              <w:spacing w:before="0" w:after="0" w:line="240" w:lineRule="auto"/>
+              <w:jc w:val="center"/>
+            </w:pPr>
+            <w:r>
+              <w:rPr>
+                <w:rFonts w:ascii="함초롬돋움" w:hAnsi="함초롬돋움" w:eastAsia="함초롬돋움" w:cs="함초롬돋움"/>
+                <w:sz w:val="18"/>
+              </w:rPr>
+              <w:t>0.383±.000</w:t>
             </w:r>
             <w:r/>
           </w:p>
@@ -1147,73 +1217,43 @@
           </w:tcPr>
           <w:p>
             <w:pPr>
+              <w:keepNext/>
+              <w:wordWrap w:val="1"/>
               <w:spacing w:before="0" w:after="0" w:line="240" w:lineRule="auto"/>
               <w:jc w:val="center"/>
+            </w:pPr>
+            <w:r>
+              <w:rPr>
+                <w:rFonts w:ascii="함초롬돋움" w:hAnsi="함초롬돋움" w:eastAsia="함초롬돋움" w:cs="함초롬돋움"/>
+                <w:sz w:val="18"/>
+              </w:rPr>
+              <w:t>0.000±.000</w:t>
+            </w:r>
+            <w:r/>
+          </w:p>
+        </w:tc>
+        <w:tc>
+          <w:tcPr>
+            <w:tcW w:w="1268" w:type="dxa"/>
+            <w:vAlign w:val="center"/>
+            <w:tcMar>
+              <w:left w:w="57" w:type="dxa"/>
+              <w:right w:w="57" w:type="dxa"/>
+            </w:tcMar>
+            <w:tcBorders>
+              <w:top w:val="single" w:sz="4" w:space="0" w:color="000000" tmln="10, 20, 20, 0, 0"/>
+              <w:left w:val="single" w:sz="4" w:space="0" w:color="000000" tmln="10, 20, 20, 0, 0"/>
+              <w:bottom w:val="single" w:sz="4" w:space="0" w:color="000000" tmln="10, 20, 20, 0, 0"/>
+              <w:right w:val="single" w:sz="4" w:space="0" w:color="000000" tmln="10, 20, 20, 0, 0"/>
+            </w:tcBorders>
+            <w:tmTcPr id="1792316937" protected="0"/>
+          </w:tcPr>
+          <w:p>
+            <w:pPr>
               <w:keepNext/>
-            </w:pPr>
-            <w:r>
-              <w:rPr>
-                <w:rFonts w:ascii="함초롬돋움" w:hAnsi="함초롬돋움" w:eastAsia="함초롬돋움" w:cs="함초롬돋움"/>
-                <w:sz w:val="18"/>
-              </w:rPr>
-              <w:t>0.383±.000</w:t>
-            </w:r>
-            <w:r/>
-          </w:p>
-        </w:tc>
-        <w:tc>
-          <w:tcPr>
-            <w:tcW w:w="1268" w:type="dxa"/>
-            <w:vAlign w:val="center"/>
-            <w:tcMar>
-              <w:left w:w="57" w:type="dxa"/>
-              <w:right w:w="57" w:type="dxa"/>
-            </w:tcMar>
-            <w:tcBorders>
-              <w:top w:val="single" w:sz="4" w:space="0" w:color="000000" tmln="10, 20, 20, 0, 0"/>
-              <w:left w:val="single" w:sz="4" w:space="0" w:color="000000" tmln="10, 20, 20, 0, 0"/>
-              <w:bottom w:val="single" w:sz="4" w:space="0" w:color="000000" tmln="10, 20, 20, 0, 0"/>
-              <w:right w:val="single" w:sz="4" w:space="0" w:color="000000" tmln="10, 20, 20, 0, 0"/>
-            </w:tcBorders>
-            <w:tmTcPr id="1792316937" protected="0"/>
-          </w:tcPr>
-          <w:p>
-            <w:pPr>
+              <w:wordWrap w:val="1"/>
               <w:spacing w:before="0" w:after="0" w:line="240" w:lineRule="auto"/>
               <w:jc w:val="center"/>
-              <w:keepNext/>
-            </w:pPr>
-            <w:r>
-              <w:rPr>
-                <w:rFonts w:ascii="함초롬돋움" w:hAnsi="함초롬돋움" w:eastAsia="함초롬돋움" w:cs="함초롬돋움"/>
-                <w:sz w:val="18"/>
-              </w:rPr>
-              <w:t>0.000±.000</w:t>
-            </w:r>
-            <w:r/>
-          </w:p>
-        </w:tc>
-        <w:tc>
-          <w:tcPr>
-            <w:tcW w:w="1268" w:type="dxa"/>
-            <w:vAlign w:val="center"/>
-            <w:tcMar>
-              <w:left w:w="57" w:type="dxa"/>
-              <w:right w:w="57" w:type="dxa"/>
-            </w:tcMar>
-            <w:tcBorders>
-              <w:top w:val="single" w:sz="4" w:space="0" w:color="000000" tmln="10, 20, 20, 0, 0"/>
-              <w:left w:val="single" w:sz="4" w:space="0" w:color="000000" tmln="10, 20, 20, 0, 0"/>
-              <w:bottom w:val="single" w:sz="4" w:space="0" w:color="000000" tmln="10, 20, 20, 0, 0"/>
-              <w:right w:val="single" w:sz="4" w:space="0" w:color="000000" tmln="10, 20, 20, 0, 0"/>
-            </w:tcBorders>
-            <w:tmTcPr id="1792316937" protected="0"/>
-          </w:tcPr>
-          <w:p>
-            <w:pPr>
-              <w:spacing w:before="0" w:after="0" w:line="240" w:lineRule="auto"/>
-              <w:jc w:val="center"/>
-              <w:keepNext/>
             </w:pPr>
             <w:r>
               <w:rPr>
@@ -1250,16 +1290,50 @@
           </w:tcPr>
           <w:p>
             <w:pPr>
+              <w:keepNext/>
+              <w:wordWrap w:val="1"/>
               <w:spacing w:before="0" w:after="0" w:line="240" w:lineRule="auto"/>
               <w:jc w:val="left"/>
+            </w:pPr>
+            <w:r>
+              <w:rPr>
+                <w:rFonts w:ascii="함초롬돋움" w:hAnsi="함초롬돋움" w:eastAsia="함초롬돋움" w:cs="함초롬돋움"/>
+                <w:sz w:val="18"/>
+              </w:rPr>
+              <w:t>Hybrid</w:t>
+            </w:r>
+            <w:r/>
+          </w:p>
+        </w:tc>
+        <w:tc>
+          <w:tcPr>
+            <w:tcW w:w="1268" w:type="dxa"/>
+            <w:vAlign w:val="center"/>
+            <w:tcMar>
+              <w:left w:w="57" w:type="dxa"/>
+              <w:right w:w="57" w:type="dxa"/>
+            </w:tcMar>
+            <w:tcBorders>
+              <w:top w:val="single" w:sz="4" w:space="0" w:color="000000" tmln="10, 20, 20, 0, 0"/>
+              <w:left w:val="single" w:sz="4" w:space="0" w:color="000000" tmln="10, 20, 20, 0, 0"/>
+              <w:bottom w:val="single" w:sz="4" w:space="0" w:color="000000" tmln="10, 20, 20, 0, 0"/>
+              <w:right w:val="single" w:sz="4" w:space="0" w:color="000000" tmln="10, 20, 20, 0, 0"/>
+            </w:tcBorders>
+            <w:tmTcPr id="1792316937" protected="0"/>
+          </w:tcPr>
+          <w:p>
+            <w:pPr>
               <w:keepNext/>
-            </w:pPr>
-            <w:r>
-              <w:rPr>
-                <w:rFonts w:ascii="함초롬돋움" w:hAnsi="함초롬돋움" w:eastAsia="함초롬돋움" w:cs="함초롬돋움"/>
-                <w:sz w:val="18"/>
-              </w:rPr>
-              <w:t>Hybrid</w:t>
+              <w:wordWrap w:val="1"/>
+              <w:spacing w:before="0" w:after="0" w:line="240" w:lineRule="auto"/>
+              <w:jc w:val="center"/>
+            </w:pPr>
+            <w:r>
+              <w:rPr>
+                <w:rFonts w:ascii="함초롬돋움" w:hAnsi="함초롬돋움" w:eastAsia="함초롬돋움" w:cs="함초롬돋움"/>
+                <w:sz w:val="18"/>
+              </w:rPr>
+              <w:t>0.521±.000</w:t>
             </w:r>
             <w:r/>
           </w:p>
@@ -1282,73 +1356,43 @@
           </w:tcPr>
           <w:p>
             <w:pPr>
+              <w:keepNext/>
+              <w:wordWrap w:val="1"/>
               <w:spacing w:before="0" w:after="0" w:line="240" w:lineRule="auto"/>
               <w:jc w:val="center"/>
+            </w:pPr>
+            <w:r>
+              <w:rPr>
+                <w:rFonts w:ascii="함초롬돋움" w:hAnsi="함초롬돋움" w:eastAsia="함초롬돋움" w:cs="함초롬돋움"/>
+                <w:sz w:val="18"/>
+              </w:rPr>
+              <w:t>0.150±.000</w:t>
+            </w:r>
+            <w:r/>
+          </w:p>
+        </w:tc>
+        <w:tc>
+          <w:tcPr>
+            <w:tcW w:w="1268" w:type="dxa"/>
+            <w:vAlign w:val="center"/>
+            <w:tcMar>
+              <w:left w:w="57" w:type="dxa"/>
+              <w:right w:w="57" w:type="dxa"/>
+            </w:tcMar>
+            <w:tcBorders>
+              <w:top w:val="single" w:sz="4" w:space="0" w:color="000000" tmln="10, 20, 20, 0, 0"/>
+              <w:left w:val="single" w:sz="4" w:space="0" w:color="000000" tmln="10, 20, 20, 0, 0"/>
+              <w:bottom w:val="single" w:sz="4" w:space="0" w:color="000000" tmln="10, 20, 20, 0, 0"/>
+              <w:right w:val="single" w:sz="4" w:space="0" w:color="000000" tmln="10, 20, 20, 0, 0"/>
+            </w:tcBorders>
+            <w:tmTcPr id="1792316937" protected="0"/>
+          </w:tcPr>
+          <w:p>
+            <w:pPr>
               <w:keepNext/>
-            </w:pPr>
-            <w:r>
-              <w:rPr>
-                <w:rFonts w:ascii="함초롬돋움" w:hAnsi="함초롬돋움" w:eastAsia="함초롬돋움" w:cs="함초롬돋움"/>
-                <w:sz w:val="18"/>
-              </w:rPr>
-              <w:t>0.521±.000</w:t>
-            </w:r>
-            <w:r/>
-          </w:p>
-        </w:tc>
-        <w:tc>
-          <w:tcPr>
-            <w:tcW w:w="1268" w:type="dxa"/>
-            <w:vAlign w:val="center"/>
-            <w:tcMar>
-              <w:left w:w="57" w:type="dxa"/>
-              <w:right w:w="57" w:type="dxa"/>
-            </w:tcMar>
-            <w:tcBorders>
-              <w:top w:val="single" w:sz="4" w:space="0" w:color="000000" tmln="10, 20, 20, 0, 0"/>
-              <w:left w:val="single" w:sz="4" w:space="0" w:color="000000" tmln="10, 20, 20, 0, 0"/>
-              <w:bottom w:val="single" w:sz="4" w:space="0" w:color="000000" tmln="10, 20, 20, 0, 0"/>
-              <w:right w:val="single" w:sz="4" w:space="0" w:color="000000" tmln="10, 20, 20, 0, 0"/>
-            </w:tcBorders>
-            <w:tmTcPr id="1792316937" protected="0"/>
-          </w:tcPr>
-          <w:p>
-            <w:pPr>
+              <w:wordWrap w:val="1"/>
               <w:spacing w:before="0" w:after="0" w:line="240" w:lineRule="auto"/>
               <w:jc w:val="center"/>
-              <w:keepNext/>
-            </w:pPr>
-            <w:r>
-              <w:rPr>
-                <w:rFonts w:ascii="함초롬돋움" w:hAnsi="함초롬돋움" w:eastAsia="함초롬돋움" w:cs="함초롬돋움"/>
-                <w:sz w:val="18"/>
-              </w:rPr>
-              <w:t>0.150±.000</w:t>
-            </w:r>
-            <w:r/>
-          </w:p>
-        </w:tc>
-        <w:tc>
-          <w:tcPr>
-            <w:tcW w:w="1268" w:type="dxa"/>
-            <w:vAlign w:val="center"/>
-            <w:tcMar>
-              <w:left w:w="57" w:type="dxa"/>
-              <w:right w:w="57" w:type="dxa"/>
-            </w:tcMar>
-            <w:tcBorders>
-              <w:top w:val="single" w:sz="4" w:space="0" w:color="000000" tmln="10, 20, 20, 0, 0"/>
-              <w:left w:val="single" w:sz="4" w:space="0" w:color="000000" tmln="10, 20, 20, 0, 0"/>
-              <w:bottom w:val="single" w:sz="4" w:space="0" w:color="000000" tmln="10, 20, 20, 0, 0"/>
-              <w:right w:val="single" w:sz="4" w:space="0" w:color="000000" tmln="10, 20, 20, 0, 0"/>
-            </w:tcBorders>
-            <w:tmTcPr id="1792316937" protected="0"/>
-          </w:tcPr>
-          <w:p>
-            <w:pPr>
-              <w:spacing w:before="0" w:after="0" w:line="240" w:lineRule="auto"/>
-              <w:jc w:val="center"/>
-              <w:keepNext/>
             </w:pPr>
             <w:r>
               <w:rPr>
@@ -1385,16 +1429,50 @@
           </w:tcPr>
           <w:p>
             <w:pPr>
+              <w:keepNext/>
+              <w:wordWrap w:val="1"/>
               <w:spacing w:before="0" w:after="0" w:line="240" w:lineRule="auto"/>
               <w:jc w:val="left"/>
+            </w:pPr>
+            <w:r>
+              <w:rPr>
+                <w:rFonts w:ascii="함초롬돋움" w:hAnsi="함초롬돋움" w:eastAsia="함초롬돋움" w:cs="함초롬돋움"/>
+                <w:sz w:val="18"/>
+              </w:rPr>
+              <w:t>H+RR</w:t>
+            </w:r>
+            <w:r/>
+          </w:p>
+        </w:tc>
+        <w:tc>
+          <w:tcPr>
+            <w:tcW w:w="1268" w:type="dxa"/>
+            <w:vAlign w:val="center"/>
+            <w:tcMar>
+              <w:left w:w="57" w:type="dxa"/>
+              <w:right w:w="57" w:type="dxa"/>
+            </w:tcMar>
+            <w:tcBorders>
+              <w:top w:val="single" w:sz="4" w:space="0" w:color="000000" tmln="10, 20, 20, 0, 0"/>
+              <w:left w:val="single" w:sz="4" w:space="0" w:color="000000" tmln="10, 20, 20, 0, 0"/>
+              <w:bottom w:val="single" w:sz="4" w:space="0" w:color="000000" tmln="10, 20, 20, 0, 0"/>
+              <w:right w:val="single" w:sz="4" w:space="0" w:color="000000" tmln="10, 20, 20, 0, 0"/>
+            </w:tcBorders>
+            <w:tmTcPr id="1792316937" protected="0"/>
+          </w:tcPr>
+          <w:p>
+            <w:pPr>
               <w:keepNext/>
-            </w:pPr>
-            <w:r>
-              <w:rPr>
-                <w:rFonts w:ascii="함초롬돋움" w:hAnsi="함초롬돋움" w:eastAsia="함초롬돋움" w:cs="함초롬돋움"/>
-                <w:sz w:val="18"/>
-              </w:rPr>
-              <w:t>H+RR</w:t>
+              <w:wordWrap w:val="1"/>
+              <w:spacing w:before="0" w:after="0" w:line="240" w:lineRule="auto"/>
+              <w:jc w:val="center"/>
+            </w:pPr>
+            <w:r>
+              <w:rPr>
+                <w:rFonts w:ascii="함초롬돋움" w:hAnsi="함초롬돋움" w:eastAsia="함초롬돋움" w:cs="함초롬돋움"/>
+                <w:sz w:val="18"/>
+              </w:rPr>
+              <w:t>0.586±.019</w:t>
             </w:r>
             <w:r/>
           </w:p>
@@ -1417,73 +1495,43 @@
           </w:tcPr>
           <w:p>
             <w:pPr>
+              <w:keepNext/>
+              <w:wordWrap w:val="1"/>
               <w:spacing w:before="0" w:after="0" w:line="240" w:lineRule="auto"/>
               <w:jc w:val="center"/>
+            </w:pPr>
+            <w:r>
+              <w:rPr>
+                <w:rFonts w:ascii="함초롬돋움" w:hAnsi="함초롬돋움" w:eastAsia="함초롬돋움" w:cs="함초롬돋움"/>
+                <w:sz w:val="18"/>
+              </w:rPr>
+              <w:t>0.233±.014</w:t>
+            </w:r>
+            <w:r/>
+          </w:p>
+        </w:tc>
+        <w:tc>
+          <w:tcPr>
+            <w:tcW w:w="1268" w:type="dxa"/>
+            <w:vAlign w:val="center"/>
+            <w:tcMar>
+              <w:left w:w="57" w:type="dxa"/>
+              <w:right w:w="57" w:type="dxa"/>
+            </w:tcMar>
+            <w:tcBorders>
+              <w:top w:val="single" w:sz="4" w:space="0" w:color="000000" tmln="10, 20, 20, 0, 0"/>
+              <w:left w:val="single" w:sz="4" w:space="0" w:color="000000" tmln="10, 20, 20, 0, 0"/>
+              <w:bottom w:val="single" w:sz="4" w:space="0" w:color="000000" tmln="10, 20, 20, 0, 0"/>
+              <w:right w:val="single" w:sz="4" w:space="0" w:color="000000" tmln="10, 20, 20, 0, 0"/>
+            </w:tcBorders>
+            <w:tmTcPr id="1792316937" protected="0"/>
+          </w:tcPr>
+          <w:p>
+            <w:pPr>
               <w:keepNext/>
-            </w:pPr>
-            <w:r>
-              <w:rPr>
-                <w:rFonts w:ascii="함초롬돋움" w:hAnsi="함초롬돋움" w:eastAsia="함초롬돋움" w:cs="함초롬돋움"/>
-                <w:sz w:val="18"/>
-              </w:rPr>
-              <w:t>0.586±.019</w:t>
-            </w:r>
-            <w:r/>
-          </w:p>
-        </w:tc>
-        <w:tc>
-          <w:tcPr>
-            <w:tcW w:w="1268" w:type="dxa"/>
-            <w:vAlign w:val="center"/>
-            <w:tcMar>
-              <w:left w:w="57" w:type="dxa"/>
-              <w:right w:w="57" w:type="dxa"/>
-            </w:tcMar>
-            <w:tcBorders>
-              <w:top w:val="single" w:sz="4" w:space="0" w:color="000000" tmln="10, 20, 20, 0, 0"/>
-              <w:left w:val="single" w:sz="4" w:space="0" w:color="000000" tmln="10, 20, 20, 0, 0"/>
-              <w:bottom w:val="single" w:sz="4" w:space="0" w:color="000000" tmln="10, 20, 20, 0, 0"/>
-              <w:right w:val="single" w:sz="4" w:space="0" w:color="000000" tmln="10, 20, 20, 0, 0"/>
-            </w:tcBorders>
-            <w:tmTcPr id="1792316937" protected="0"/>
-          </w:tcPr>
-          <w:p>
-            <w:pPr>
+              <w:wordWrap w:val="1"/>
               <w:spacing w:before="0" w:after="0" w:line="240" w:lineRule="auto"/>
               <w:jc w:val="center"/>
-              <w:keepNext/>
-            </w:pPr>
-            <w:r>
-              <w:rPr>
-                <w:rFonts w:ascii="함초롬돋움" w:hAnsi="함초롬돋움" w:eastAsia="함초롬돋움" w:cs="함초롬돋움"/>
-                <w:sz w:val="18"/>
-              </w:rPr>
-              <w:t>0.233±.014</w:t>
-            </w:r>
-            <w:r/>
-          </w:p>
-        </w:tc>
-        <w:tc>
-          <w:tcPr>
-            <w:tcW w:w="1268" w:type="dxa"/>
-            <w:vAlign w:val="center"/>
-            <w:tcMar>
-              <w:left w:w="57" w:type="dxa"/>
-              <w:right w:w="57" w:type="dxa"/>
-            </w:tcMar>
-            <w:tcBorders>
-              <w:top w:val="single" w:sz="4" w:space="0" w:color="000000" tmln="10, 20, 20, 0, 0"/>
-              <w:left w:val="single" w:sz="4" w:space="0" w:color="000000" tmln="10, 20, 20, 0, 0"/>
-              <w:bottom w:val="single" w:sz="4" w:space="0" w:color="000000" tmln="10, 20, 20, 0, 0"/>
-              <w:right w:val="single" w:sz="4" w:space="0" w:color="000000" tmln="10, 20, 20, 0, 0"/>
-            </w:tcBorders>
-            <w:tmTcPr id="1792316937" protected="0"/>
-          </w:tcPr>
-          <w:p>
-            <w:pPr>
-              <w:spacing w:before="0" w:after="0" w:line="240" w:lineRule="auto"/>
-              <w:jc w:val="center"/>
-              <w:keepNext/>
             </w:pPr>
             <w:r>
               <w:rPr>
@@ -1520,16 +1568,50 @@
           </w:tcPr>
           <w:p>
             <w:pPr>
+              <w:keepNext/>
+              <w:wordWrap w:val="1"/>
               <w:spacing w:before="0" w:after="0" w:line="240" w:lineRule="auto"/>
               <w:jc w:val="left"/>
+            </w:pPr>
+            <w:r>
+              <w:rPr>
+                <w:rFonts w:ascii="함초롬돋움" w:hAnsi="함초롬돋움" w:eastAsia="함초롬돋움" w:cs="함초롬돋움"/>
+                <w:sz w:val="18"/>
+              </w:rPr>
+              <w:t>K3</w:t>
+            </w:r>
+            <w:r/>
+          </w:p>
+        </w:tc>
+        <w:tc>
+          <w:tcPr>
+            <w:tcW w:w="1268" w:type="dxa"/>
+            <w:vAlign w:val="center"/>
+            <w:tcMar>
+              <w:left w:w="57" w:type="dxa"/>
+              <w:right w:w="57" w:type="dxa"/>
+            </w:tcMar>
+            <w:tcBorders>
+              <w:top w:val="single" w:sz="4" w:space="0" w:color="000000" tmln="10, 20, 20, 0, 0"/>
+              <w:left w:val="single" w:sz="4" w:space="0" w:color="000000" tmln="10, 20, 20, 0, 0"/>
+              <w:bottom w:val="single" w:sz="4" w:space="0" w:color="000000" tmln="10, 20, 20, 0, 0"/>
+              <w:right w:val="single" w:sz="4" w:space="0" w:color="000000" tmln="10, 20, 20, 0, 0"/>
+            </w:tcBorders>
+            <w:tmTcPr id="1792316937" protected="0"/>
+          </w:tcPr>
+          <w:p>
+            <w:pPr>
               <w:keepNext/>
-            </w:pPr>
-            <w:r>
-              <w:rPr>
-                <w:rFonts w:ascii="함초롬돋움" w:hAnsi="함초롬돋움" w:eastAsia="함초롬돋움" w:cs="함초롬돋움"/>
-                <w:sz w:val="18"/>
-              </w:rPr>
-              <w:t>K3</w:t>
+              <w:wordWrap w:val="1"/>
+              <w:spacing w:before="0" w:after="0" w:line="240" w:lineRule="auto"/>
+              <w:jc w:val="center"/>
+            </w:pPr>
+            <w:r>
+              <w:rPr>
+                <w:rFonts w:ascii="함초롬돋움" w:hAnsi="함초롬돋움" w:eastAsia="함초롬돋움" w:cs="함초롬돋움"/>
+                <w:sz w:val="18"/>
+              </w:rPr>
+              <w:t>0.618±.017</w:t>
             </w:r>
             <w:r/>
           </w:p>
@@ -1552,73 +1634,43 @@
           </w:tcPr>
           <w:p>
             <w:pPr>
+              <w:keepNext/>
+              <w:wordWrap w:val="1"/>
               <w:spacing w:before="0" w:after="0" w:line="240" w:lineRule="auto"/>
               <w:jc w:val="center"/>
+            </w:pPr>
+            <w:r>
+              <w:rPr>
+                <w:rFonts w:ascii="함초롬돋움" w:hAnsi="함초롬돋움" w:eastAsia="함초롬돋움" w:cs="함초롬돋움"/>
+                <w:sz w:val="18"/>
+              </w:rPr>
+              <w:t>0.225±.043</w:t>
+            </w:r>
+            <w:r/>
+          </w:p>
+        </w:tc>
+        <w:tc>
+          <w:tcPr>
+            <w:tcW w:w="1268" w:type="dxa"/>
+            <w:vAlign w:val="center"/>
+            <w:tcMar>
+              <w:left w:w="57" w:type="dxa"/>
+              <w:right w:w="57" w:type="dxa"/>
+            </w:tcMar>
+            <w:tcBorders>
+              <w:top w:val="single" w:sz="4" w:space="0" w:color="000000" tmln="10, 20, 20, 0, 0"/>
+              <w:left w:val="single" w:sz="4" w:space="0" w:color="000000" tmln="10, 20, 20, 0, 0"/>
+              <w:bottom w:val="single" w:sz="4" w:space="0" w:color="000000" tmln="10, 20, 20, 0, 0"/>
+              <w:right w:val="single" w:sz="4" w:space="0" w:color="000000" tmln="10, 20, 20, 0, 0"/>
+            </w:tcBorders>
+            <w:tmTcPr id="1792316937" protected="0"/>
+          </w:tcPr>
+          <w:p>
+            <w:pPr>
               <w:keepNext/>
-            </w:pPr>
-            <w:r>
-              <w:rPr>
-                <w:rFonts w:ascii="함초롬돋움" w:hAnsi="함초롬돋움" w:eastAsia="함초롬돋움" w:cs="함초롬돋움"/>
-                <w:sz w:val="18"/>
-              </w:rPr>
-              <w:t>0.618±.017</w:t>
-            </w:r>
-            <w:r/>
-          </w:p>
-        </w:tc>
-        <w:tc>
-          <w:tcPr>
-            <w:tcW w:w="1268" w:type="dxa"/>
-            <w:vAlign w:val="center"/>
-            <w:tcMar>
-              <w:left w:w="57" w:type="dxa"/>
-              <w:right w:w="57" w:type="dxa"/>
-            </w:tcMar>
-            <w:tcBorders>
-              <w:top w:val="single" w:sz="4" w:space="0" w:color="000000" tmln="10, 20, 20, 0, 0"/>
-              <w:left w:val="single" w:sz="4" w:space="0" w:color="000000" tmln="10, 20, 20, 0, 0"/>
-              <w:bottom w:val="single" w:sz="4" w:space="0" w:color="000000" tmln="10, 20, 20, 0, 0"/>
-              <w:right w:val="single" w:sz="4" w:space="0" w:color="000000" tmln="10, 20, 20, 0, 0"/>
-            </w:tcBorders>
-            <w:tmTcPr id="1792316937" protected="0"/>
-          </w:tcPr>
-          <w:p>
-            <w:pPr>
+              <w:wordWrap w:val="1"/>
               <w:spacing w:before="0" w:after="0" w:line="240" w:lineRule="auto"/>
               <w:jc w:val="center"/>
-              <w:keepNext/>
-            </w:pPr>
-            <w:r>
-              <w:rPr>
-                <w:rFonts w:ascii="함초롬돋움" w:hAnsi="함초롬돋움" w:eastAsia="함초롬돋움" w:cs="함초롬돋움"/>
-                <w:sz w:val="18"/>
-              </w:rPr>
-              <w:t>0.225±.043</w:t>
-            </w:r>
-            <w:r/>
-          </w:p>
-        </w:tc>
-        <w:tc>
-          <w:tcPr>
-            <w:tcW w:w="1268" w:type="dxa"/>
-            <w:vAlign w:val="center"/>
-            <w:tcMar>
-              <w:left w:w="57" w:type="dxa"/>
-              <w:right w:w="57" w:type="dxa"/>
-            </w:tcMar>
-            <w:tcBorders>
-              <w:top w:val="single" w:sz="4" w:space="0" w:color="000000" tmln="10, 20, 20, 0, 0"/>
-              <w:left w:val="single" w:sz="4" w:space="0" w:color="000000" tmln="10, 20, 20, 0, 0"/>
-              <w:bottom w:val="single" w:sz="4" w:space="0" w:color="000000" tmln="10, 20, 20, 0, 0"/>
-              <w:right w:val="single" w:sz="4" w:space="0" w:color="000000" tmln="10, 20, 20, 0, 0"/>
-            </w:tcBorders>
-            <w:tmTcPr id="1792316937" protected="0"/>
-          </w:tcPr>
-          <w:p>
-            <w:pPr>
-              <w:spacing w:before="0" w:after="0" w:line="240" w:lineRule="auto"/>
-              <w:jc w:val="center"/>
-              <w:keepNext/>
             </w:pPr>
             <w:r>
               <w:rPr>
@@ -1655,16 +1707,50 @@
           </w:tcPr>
           <w:p>
             <w:pPr>
+              <w:keepNext/>
+              <w:wordWrap w:val="1"/>
               <w:spacing w:before="0" w:after="0" w:line="240" w:lineRule="auto"/>
               <w:jc w:val="left"/>
+            </w:pPr>
+            <w:r>
+              <w:rPr>
+                <w:rFonts w:ascii="함초롬돋움" w:hAnsi="함초롬돋움" w:eastAsia="함초롬돋움" w:cs="함초롬돋움"/>
+                <w:sz w:val="18"/>
+              </w:rPr>
+              <w:t>link_all</w:t>
+            </w:r>
+            <w:r/>
+          </w:p>
+        </w:tc>
+        <w:tc>
+          <w:tcPr>
+            <w:tcW w:w="1268" w:type="dxa"/>
+            <w:vAlign w:val="center"/>
+            <w:tcMar>
+              <w:left w:w="57" w:type="dxa"/>
+              <w:right w:w="57" w:type="dxa"/>
+            </w:tcMar>
+            <w:tcBorders>
+              <w:top w:val="single" w:sz="4" w:space="0" w:color="000000" tmln="10, 20, 20, 0, 0"/>
+              <w:left w:val="single" w:sz="4" w:space="0" w:color="000000" tmln="10, 20, 20, 0, 0"/>
+              <w:bottom w:val="single" w:sz="4" w:space="0" w:color="000000" tmln="10, 20, 20, 0, 0"/>
+              <w:right w:val="single" w:sz="4" w:space="0" w:color="000000" tmln="10, 20, 20, 0, 0"/>
+            </w:tcBorders>
+            <w:tmTcPr id="1792316937" protected="0"/>
+          </w:tcPr>
+          <w:p>
+            <w:pPr>
               <w:keepNext/>
-            </w:pPr>
-            <w:r>
-              <w:rPr>
-                <w:rFonts w:ascii="함초롬돋움" w:hAnsi="함초롬돋움" w:eastAsia="함초롬돋움" w:cs="함초롬돋움"/>
-                <w:sz w:val="18"/>
-              </w:rPr>
-              <w:t>link_all</w:t>
+              <w:wordWrap w:val="1"/>
+              <w:spacing w:before="0" w:after="0" w:line="240" w:lineRule="auto"/>
+              <w:jc w:val="center"/>
+            </w:pPr>
+            <w:r>
+              <w:rPr>
+                <w:rFonts w:ascii="함초롬돋움" w:hAnsi="함초롬돋움" w:eastAsia="함초롬돋움" w:cs="함초롬돋움"/>
+                <w:sz w:val="18"/>
+              </w:rPr>
+              <w:t>0.850±.014</w:t>
             </w:r>
             <w:r/>
           </w:p>
@@ -1687,73 +1773,43 @@
           </w:tcPr>
           <w:p>
             <w:pPr>
+              <w:keepNext/>
+              <w:wordWrap w:val="1"/>
               <w:spacing w:before="0" w:after="0" w:line="240" w:lineRule="auto"/>
               <w:jc w:val="center"/>
+            </w:pPr>
+            <w:r>
+              <w:rPr>
+                <w:rFonts w:ascii="함초롬돋움" w:hAnsi="함초롬돋움" w:eastAsia="함초롬돋움" w:cs="함초롬돋움"/>
+                <w:sz w:val="18"/>
+              </w:rPr>
+              <w:t>0.750±.000</w:t>
+            </w:r>
+            <w:r/>
+          </w:p>
+        </w:tc>
+        <w:tc>
+          <w:tcPr>
+            <w:tcW w:w="1268" w:type="dxa"/>
+            <w:vAlign w:val="center"/>
+            <w:tcMar>
+              <w:left w:w="57" w:type="dxa"/>
+              <w:right w:w="57" w:type="dxa"/>
+            </w:tcMar>
+            <w:tcBorders>
+              <w:top w:val="single" w:sz="4" w:space="0" w:color="000000" tmln="10, 20, 20, 0, 0"/>
+              <w:left w:val="single" w:sz="4" w:space="0" w:color="000000" tmln="10, 20, 20, 0, 0"/>
+              <w:bottom w:val="single" w:sz="4" w:space="0" w:color="000000" tmln="10, 20, 20, 0, 0"/>
+              <w:right w:val="single" w:sz="4" w:space="0" w:color="000000" tmln="10, 20, 20, 0, 0"/>
+            </w:tcBorders>
+            <w:tmTcPr id="1792316937" protected="0"/>
+          </w:tcPr>
+          <w:p>
+            <w:pPr>
               <w:keepNext/>
-            </w:pPr>
-            <w:r>
-              <w:rPr>
-                <w:rFonts w:ascii="함초롬돋움" w:hAnsi="함초롬돋움" w:eastAsia="함초롬돋움" w:cs="함초롬돋움"/>
-                <w:sz w:val="18"/>
-              </w:rPr>
-              <w:t>0.850±.014</w:t>
-            </w:r>
-            <w:r/>
-          </w:p>
-        </w:tc>
-        <w:tc>
-          <w:tcPr>
-            <w:tcW w:w="1268" w:type="dxa"/>
-            <w:vAlign w:val="center"/>
-            <w:tcMar>
-              <w:left w:w="57" w:type="dxa"/>
-              <w:right w:w="57" w:type="dxa"/>
-            </w:tcMar>
-            <w:tcBorders>
-              <w:top w:val="single" w:sz="4" w:space="0" w:color="000000" tmln="10, 20, 20, 0, 0"/>
-              <w:left w:val="single" w:sz="4" w:space="0" w:color="000000" tmln="10, 20, 20, 0, 0"/>
-              <w:bottom w:val="single" w:sz="4" w:space="0" w:color="000000" tmln="10, 20, 20, 0, 0"/>
-              <w:right w:val="single" w:sz="4" w:space="0" w:color="000000" tmln="10, 20, 20, 0, 0"/>
-            </w:tcBorders>
-            <w:tmTcPr id="1792316937" protected="0"/>
-          </w:tcPr>
-          <w:p>
-            <w:pPr>
+              <w:wordWrap w:val="1"/>
               <w:spacing w:before="0" w:after="0" w:line="240" w:lineRule="auto"/>
               <w:jc w:val="center"/>
-              <w:keepNext/>
-            </w:pPr>
-            <w:r>
-              <w:rPr>
-                <w:rFonts w:ascii="함초롬돋움" w:hAnsi="함초롬돋움" w:eastAsia="함초롬돋움" w:cs="함초롬돋움"/>
-                <w:sz w:val="18"/>
-              </w:rPr>
-              <w:t>0.750±.000</w:t>
-            </w:r>
-            <w:r/>
-          </w:p>
-        </w:tc>
-        <w:tc>
-          <w:tcPr>
-            <w:tcW w:w="1268" w:type="dxa"/>
-            <w:vAlign w:val="center"/>
-            <w:tcMar>
-              <w:left w:w="57" w:type="dxa"/>
-              <w:right w:w="57" w:type="dxa"/>
-            </w:tcMar>
-            <w:tcBorders>
-              <w:top w:val="single" w:sz="4" w:space="0" w:color="000000" tmln="10, 20, 20, 0, 0"/>
-              <w:left w:val="single" w:sz="4" w:space="0" w:color="000000" tmln="10, 20, 20, 0, 0"/>
-              <w:bottom w:val="single" w:sz="4" w:space="0" w:color="000000" tmln="10, 20, 20, 0, 0"/>
-              <w:right w:val="single" w:sz="4" w:space="0" w:color="000000" tmln="10, 20, 20, 0, 0"/>
-            </w:tcBorders>
-            <w:tmTcPr id="1792316937" protected="0"/>
-          </w:tcPr>
-          <w:p>
-            <w:pPr>
-              <w:spacing w:before="0" w:after="0" w:line="240" w:lineRule="auto"/>
-              <w:jc w:val="center"/>
-              <w:keepNext/>
             </w:pPr>
             <w:r>
               <w:rPr>
@@ -1790,16 +1846,50 @@
           </w:tcPr>
           <w:p>
             <w:pPr>
+              <w:keepNext w:val="0"/>
+              <w:wordWrap w:val="1"/>
               <w:spacing w:before="0" w:after="0" w:line="240" w:lineRule="auto"/>
               <w:jc w:val="left"/>
+            </w:pPr>
+            <w:r>
+              <w:rPr>
+                <w:rFonts w:ascii="함초롬돋움" w:hAnsi="함초롬돋움" w:eastAsia="함초롬돋움" w:cs="함초롬돋움"/>
+                <w:sz w:val="18"/>
+              </w:rPr>
+              <w:t>proposed</w:t>
+            </w:r>
+            <w:r/>
+          </w:p>
+        </w:tc>
+        <w:tc>
+          <w:tcPr>
+            <w:tcW w:w="1268" w:type="dxa"/>
+            <w:vAlign w:val="center"/>
+            <w:tcMar>
+              <w:left w:w="57" w:type="dxa"/>
+              <w:right w:w="57" w:type="dxa"/>
+            </w:tcMar>
+            <w:tcBorders>
+              <w:top w:val="single" w:sz="4" w:space="0" w:color="000000" tmln="10, 20, 20, 0, 0"/>
+              <w:left w:val="single" w:sz="4" w:space="0" w:color="000000" tmln="10, 20, 20, 0, 0"/>
+              <w:bottom w:val="single" w:sz="4" w:space="0" w:color="000000" tmln="10, 20, 20, 0, 0"/>
+              <w:right w:val="single" w:sz="4" w:space="0" w:color="000000" tmln="10, 20, 20, 0, 0"/>
+            </w:tcBorders>
+            <w:tmTcPr id="1792316937" protected="0"/>
+          </w:tcPr>
+          <w:p>
+            <w:pPr>
               <w:keepNext w:val="0"/>
-            </w:pPr>
-            <w:r>
-              <w:rPr>
-                <w:rFonts w:ascii="함초롬돋움" w:hAnsi="함초롬돋움" w:eastAsia="함초롬돋움" w:cs="함초롬돋움"/>
-                <w:sz w:val="18"/>
-              </w:rPr>
-              <w:t>proposed</w:t>
+              <w:wordWrap w:val="1"/>
+              <w:spacing w:before="0" w:after="0" w:line="240" w:lineRule="auto"/>
+              <w:jc w:val="center"/>
+            </w:pPr>
+            <w:r>
+              <w:rPr>
+                <w:rFonts w:ascii="함초롬돋움" w:hAnsi="함초롬돋움" w:eastAsia="함초롬돋움" w:cs="함초롬돋움"/>
+                <w:sz w:val="18"/>
+              </w:rPr>
+              <w:t>0.839±.046</w:t>
             </w:r>
             <w:r/>
           </w:p>
@@ -1822,73 +1912,43 @@
           </w:tcPr>
           <w:p>
             <w:pPr>
+              <w:keepNext w:val="0"/>
+              <w:wordWrap w:val="1"/>
               <w:spacing w:before="0" w:after="0" w:line="240" w:lineRule="auto"/>
               <w:jc w:val="center"/>
+            </w:pPr>
+            <w:r>
+              <w:rPr>
+                <w:rFonts w:ascii="함초롬돋움" w:hAnsi="함초롬돋움" w:eastAsia="함초롬돋움" w:cs="함초롬돋움"/>
+                <w:sz w:val="18"/>
+              </w:rPr>
+              <w:t>0.708±.063</w:t>
+            </w:r>
+            <w:r/>
+          </w:p>
+        </w:tc>
+        <w:tc>
+          <w:tcPr>
+            <w:tcW w:w="1268" w:type="dxa"/>
+            <w:vAlign w:val="center"/>
+            <w:tcMar>
+              <w:left w:w="57" w:type="dxa"/>
+              <w:right w:w="57" w:type="dxa"/>
+            </w:tcMar>
+            <w:tcBorders>
+              <w:top w:val="single" w:sz="4" w:space="0" w:color="000000" tmln="10, 20, 20, 0, 0"/>
+              <w:left w:val="single" w:sz="4" w:space="0" w:color="000000" tmln="10, 20, 20, 0, 0"/>
+              <w:bottom w:val="single" w:sz="4" w:space="0" w:color="000000" tmln="10, 20, 20, 0, 0"/>
+              <w:right w:val="single" w:sz="4" w:space="0" w:color="000000" tmln="10, 20, 20, 0, 0"/>
+            </w:tcBorders>
+            <w:tmTcPr id="1792316937" protected="0"/>
+          </w:tcPr>
+          <w:p>
+            <w:pPr>
               <w:keepNext w:val="0"/>
-            </w:pPr>
-            <w:r>
-              <w:rPr>
-                <w:rFonts w:ascii="함초롬돋움" w:hAnsi="함초롬돋움" w:eastAsia="함초롬돋움" w:cs="함초롬돋움"/>
-                <w:sz w:val="18"/>
-              </w:rPr>
-              <w:t>0.839±.046</w:t>
-            </w:r>
-            <w:r/>
-          </w:p>
-        </w:tc>
-        <w:tc>
-          <w:tcPr>
-            <w:tcW w:w="1268" w:type="dxa"/>
-            <w:vAlign w:val="center"/>
-            <w:tcMar>
-              <w:left w:w="57" w:type="dxa"/>
-              <w:right w:w="57" w:type="dxa"/>
-            </w:tcMar>
-            <w:tcBorders>
-              <w:top w:val="single" w:sz="4" w:space="0" w:color="000000" tmln="10, 20, 20, 0, 0"/>
-              <w:left w:val="single" w:sz="4" w:space="0" w:color="000000" tmln="10, 20, 20, 0, 0"/>
-              <w:bottom w:val="single" w:sz="4" w:space="0" w:color="000000" tmln="10, 20, 20, 0, 0"/>
-              <w:right w:val="single" w:sz="4" w:space="0" w:color="000000" tmln="10, 20, 20, 0, 0"/>
-            </w:tcBorders>
-            <w:tmTcPr id="1792316937" protected="0"/>
-          </w:tcPr>
-          <w:p>
-            <w:pPr>
+              <w:wordWrap w:val="1"/>
               <w:spacing w:before="0" w:after="0" w:line="240" w:lineRule="auto"/>
               <w:jc w:val="center"/>
-              <w:keepNext w:val="0"/>
-            </w:pPr>
-            <w:r>
-              <w:rPr>
-                <w:rFonts w:ascii="함초롬돋움" w:hAnsi="함초롬돋움" w:eastAsia="함초롬돋움" w:cs="함초롬돋움"/>
-                <w:sz w:val="18"/>
-              </w:rPr>
-              <w:t>0.708±.063</w:t>
-            </w:r>
-            <w:r/>
-          </w:p>
-        </w:tc>
-        <w:tc>
-          <w:tcPr>
-            <w:tcW w:w="1268" w:type="dxa"/>
-            <w:vAlign w:val="center"/>
-            <w:tcMar>
-              <w:left w:w="57" w:type="dxa"/>
-              <w:right w:w="57" w:type="dxa"/>
-            </w:tcMar>
-            <w:tcBorders>
-              <w:top w:val="single" w:sz="4" w:space="0" w:color="000000" tmln="10, 20, 20, 0, 0"/>
-              <w:left w:val="single" w:sz="4" w:space="0" w:color="000000" tmln="10, 20, 20, 0, 0"/>
-              <w:bottom w:val="single" w:sz="4" w:space="0" w:color="000000" tmln="10, 20, 20, 0, 0"/>
-              <w:right w:val="single" w:sz="4" w:space="0" w:color="000000" tmln="10, 20, 20, 0, 0"/>
-            </w:tcBorders>
-            <w:tmTcPr id="1792316937" protected="0"/>
-          </w:tcPr>
-          <w:p>
-            <w:pPr>
-              <w:spacing w:before="0" w:after="0" w:line="240" w:lineRule="auto"/>
-              <w:jc w:val="center"/>
-              <w:keepNext w:val="0"/>
             </w:pPr>
             <w:r>
               <w:rPr>
@@ -1904,15 +1964,17 @@
     </w:tbl>
     <w:p>
       <w:pPr>
+        <w:wordWrap w:val="1"/>
         <w:spacing w:line="60" w:lineRule="exact"/>
       </w:pPr>
       <w:r/>
     </w:p>
     <w:p>
       <w:pPr>
+        <w:keepNext/>
+        <w:wordWrap w:val="1"/>
         <w:spacing w:before="80" w:after="40"/>
         <w:jc w:val="center"/>
-        <w:keepNext/>
         <w:rPr>
           <w:sz w:val="14"/>
           <w:szCs w:val="14"/>
@@ -1976,9 +2038,44 @@
           </w:tcPr>
           <w:p>
             <w:pPr>
+              <w:keepNext/>
+              <w:wordWrap w:val="1"/>
               <w:spacing w:before="0" w:after="0" w:line="240" w:lineRule="auto"/>
               <w:jc w:val="left"/>
+            </w:pPr>
+            <w:r>
+              <w:rPr>
+                <w:rFonts w:ascii="함초롬돋움" w:hAnsi="함초롬돋움" w:eastAsia="함초롬돋움" w:cs="함초롬돋움"/>
+                <w:b/>
+                <w:sz w:val="18"/>
+              </w:rPr>
+              <w:t>비교</w:t>
+            </w:r>
+            <w:r/>
+          </w:p>
+        </w:tc>
+        <w:tc>
+          <w:tcPr>
+            <w:tcW w:w="1755" w:type="dxa"/>
+            <w:vAlign w:val="center"/>
+            <w:tcMar>
+              <w:left w:w="57" w:type="dxa"/>
+              <w:right w:w="57" w:type="dxa"/>
+            </w:tcMar>
+            <w:tcBorders>
+              <w:top w:val="single" w:sz="4" w:space="0" w:color="000000" tmln="10, 20, 20, 0, 0"/>
+              <w:left w:val="single" w:sz="4" w:space="0" w:color="000000" tmln="10, 20, 20, 0, 0"/>
+              <w:bottom w:val="single" w:sz="4" w:space="0" w:color="000000" tmln="10, 20, 20, 0, 0"/>
+              <w:right w:val="single" w:sz="4" w:space="0" w:color="000000" tmln="10, 20, 20, 0, 0"/>
+            </w:tcBorders>
+            <w:tmTcPr id="1792316937" protected="0"/>
+          </w:tcPr>
+          <w:p>
+            <w:pPr>
               <w:keepNext/>
+              <w:wordWrap w:val="1"/>
+              <w:spacing w:before="0" w:after="0" w:line="240" w:lineRule="auto"/>
+              <w:jc w:val="center"/>
             </w:pPr>
             <w:r>
               <w:rPr>
@@ -1986,7 +2083,7 @@
                 <w:b/>
                 <w:sz w:val="18"/>
               </w:rPr>
-              <w:t>비교</w:t>
+              <w:t>ΔRecall</w:t>
             </w:r>
             <w:r/>
           </w:p>
@@ -2009,42 +2106,10 @@
           </w:tcPr>
           <w:p>
             <w:pPr>
+              <w:keepNext/>
+              <w:wordWrap w:val="1"/>
               <w:spacing w:before="0" w:after="0" w:line="240" w:lineRule="auto"/>
               <w:jc w:val="center"/>
-              <w:keepNext/>
-            </w:pPr>
-            <w:r>
-              <w:rPr>
-                <w:rFonts w:ascii="함초롬돋움" w:hAnsi="함초롬돋움" w:eastAsia="함초롬돋움" w:cs="함초롬돋움"/>
-                <w:b/>
-                <w:sz w:val="18"/>
-              </w:rPr>
-              <w:t>ΔRecall</w:t>
-            </w:r>
-            <w:r/>
-          </w:p>
-        </w:tc>
-        <w:tc>
-          <w:tcPr>
-            <w:tcW w:w="1755" w:type="dxa"/>
-            <w:vAlign w:val="center"/>
-            <w:tcMar>
-              <w:left w:w="57" w:type="dxa"/>
-              <w:right w:w="57" w:type="dxa"/>
-            </w:tcMar>
-            <w:tcBorders>
-              <w:top w:val="single" w:sz="4" w:space="0" w:color="000000" tmln="10, 20, 20, 0, 0"/>
-              <w:left w:val="single" w:sz="4" w:space="0" w:color="000000" tmln="10, 20, 20, 0, 0"/>
-              <w:bottom w:val="single" w:sz="4" w:space="0" w:color="000000" tmln="10, 20, 20, 0, 0"/>
-              <w:right w:val="single" w:sz="4" w:space="0" w:color="000000" tmln="10, 20, 20, 0, 0"/>
-            </w:tcBorders>
-            <w:tmTcPr id="1792316937" protected="0"/>
-          </w:tcPr>
-          <w:p>
-            <w:pPr>
-              <w:spacing w:before="0" w:after="0" w:line="240" w:lineRule="auto"/>
-              <w:jc w:val="center"/>
-              <w:keepNext/>
             </w:pPr>
             <w:r>
               <w:rPr>
@@ -2082,8 +2147,9 @@
           </w:tcPr>
           <w:p>
             <w:pPr>
-              <w:spacing w:before="0" w:after="0" w:line="240" w:lineRule="auto"/>
               <w:keepNext/>
+              <w:wordWrap w:val="1"/>
+              <w:spacing w:before="0" w:after="0" w:line="240" w:lineRule="auto"/>
             </w:pPr>
             <w:r>
               <w:rPr>
@@ -2121,16 +2187,60 @@
           </w:tcPr>
           <w:p>
             <w:pPr>
+              <w:keepNext/>
+              <w:wordWrap w:val="1"/>
               <w:spacing w:before="0" w:after="0" w:line="240" w:lineRule="auto"/>
               <w:jc w:val="left"/>
+            </w:pPr>
+            <w:r>
+              <w:rPr>
+                <w:rFonts w:ascii="함초롬돋움" w:hAnsi="함초롬돋움" w:eastAsia="함초롬돋움" w:cs="함초롬돋움"/>
+                <w:sz w:val="18"/>
+              </w:rPr>
+              <w:t>L − K3</w:t>
+            </w:r>
+            <w:r/>
+          </w:p>
+        </w:tc>
+        <w:tc>
+          <w:tcPr>
+            <w:tcW w:w="1755" w:type="dxa"/>
+            <w:vAlign w:val="center"/>
+            <w:tcMar>
+              <w:left w:w="57" w:type="dxa"/>
+              <w:right w:w="57" w:type="dxa"/>
+            </w:tcMar>
+            <w:tcBorders>
+              <w:top w:val="single" w:sz="4" w:space="0" w:color="000000" tmln="10, 20, 20, 0, 0"/>
+              <w:left w:val="single" w:sz="4" w:space="0" w:color="000000" tmln="10, 20, 20, 0, 0"/>
+              <w:bottom w:val="single" w:sz="4" w:space="0" w:color="000000" tmln="10, 20, 20, 0, 0"/>
+              <w:right w:val="single" w:sz="4" w:space="0" w:color="000000" tmln="10, 20, 20, 0, 0"/>
+            </w:tcBorders>
+            <w:tmTcPr id="1792316937" protected="0"/>
+          </w:tcPr>
+          <w:p>
+            <w:pPr>
               <w:keepNext/>
-            </w:pPr>
-            <w:r>
-              <w:rPr>
-                <w:rFonts w:ascii="함초롬돋움" w:hAnsi="함초롬돋움" w:eastAsia="함초롬돋움" w:cs="함초롬돋움"/>
-                <w:sz w:val="18"/>
-              </w:rPr>
-              <w:t>L − K3</w:t>
+              <w:wordWrap w:val="1"/>
+              <w:spacing w:before="0" w:after="0" w:line="240" w:lineRule="auto"/>
+              <w:jc w:val="center"/>
+            </w:pPr>
+            <w:r>
+              <w:rPr>
+                <w:rFonts w:ascii="함초롬돋움" w:hAnsi="함초롬돋움" w:eastAsia="함초롬돋움" w:cs="함초롬돋움"/>
+                <w:sz w:val="18"/>
+              </w:rPr>
+              <w:t>+0.128</w:t>
+            </w:r>
+            <w:r>
+              <w:br w:type="textWrapping"/>
+            </w:r>
+            <w:r>
+              <w:rPr>
+                <w:rFonts w:ascii="함초롬돋움" w:hAnsi="함초롬돋움" w:eastAsia="함초롬돋움" w:cs="함초롬돋움"/>
+                <w:sz w:val="18"/>
+              </w:rPr>
+              <w:t>[+0.017, +0.244]</w:t>
             </w:r>
             <w:r/>
           </w:p>
@@ -2153,51 +2263,10 @@
           </w:tcPr>
           <w:p>
             <w:pPr>
+              <w:keepNext/>
+              <w:wordWrap w:val="1"/>
               <w:spacing w:before="0" w:after="0" w:line="240" w:lineRule="auto"/>
               <w:jc w:val="center"/>
-              <w:keepNext/>
-            </w:pPr>
-            <w:r>
-              <w:rPr>
-                <w:rFonts w:ascii="함초롬돋움" w:hAnsi="함초롬돋움" w:eastAsia="함초롬돋움" w:cs="함초롬돋움"/>
-                <w:sz w:val="18"/>
-              </w:rPr>
-              <w:t>+0.128</w:t>
-            </w:r>
-            <w:r>
-              <w:br w:type="textWrapping"/>
-            </w:r>
-            <w:r>
-              <w:rPr>
-                <w:rFonts w:ascii="함초롬돋움" w:hAnsi="함초롬돋움" w:eastAsia="함초롬돋움" w:cs="함초롬돋움"/>
-                <w:sz w:val="18"/>
-              </w:rPr>
-              <w:t>[+0.017, +0.244]</w:t>
-            </w:r>
-            <w:r/>
-          </w:p>
-        </w:tc>
-        <w:tc>
-          <w:tcPr>
-            <w:tcW w:w="1755" w:type="dxa"/>
-            <w:vAlign w:val="center"/>
-            <w:tcMar>
-              <w:left w:w="57" w:type="dxa"/>
-              <w:right w:w="57" w:type="dxa"/>
-            </w:tcMar>
-            <w:tcBorders>
-              <w:top w:val="single" w:sz="4" w:space="0" w:color="000000" tmln="10, 20, 20, 0, 0"/>
-              <w:left w:val="single" w:sz="4" w:space="0" w:color="000000" tmln="10, 20, 20, 0, 0"/>
-              <w:bottom w:val="single" w:sz="4" w:space="0" w:color="000000" tmln="10, 20, 20, 0, 0"/>
-              <w:right w:val="single" w:sz="4" w:space="0" w:color="000000" tmln="10, 20, 20, 0, 0"/>
-            </w:tcBorders>
-            <w:tmTcPr id="1792316937" protected="0"/>
-          </w:tcPr>
-          <w:p>
-            <w:pPr>
-              <w:spacing w:before="0" w:after="0" w:line="240" w:lineRule="auto"/>
-              <w:jc w:val="center"/>
-              <w:keepNext/>
             </w:pPr>
             <w:r>
               <w:rPr>
@@ -2244,16 +2313,60 @@
           </w:tcPr>
           <w:p>
             <w:pPr>
+              <w:keepNext/>
+              <w:wordWrap w:val="1"/>
               <w:spacing w:before="0" w:after="0" w:line="240" w:lineRule="auto"/>
               <w:jc w:val="left"/>
+            </w:pPr>
+            <w:r>
+              <w:rPr>
+                <w:rFonts w:ascii="함초롬돋움" w:hAnsi="함초롬돋움" w:eastAsia="함초롬돋움" w:cs="함초롬돋움"/>
+                <w:sz w:val="18"/>
+              </w:rPr>
+              <w:t>P − K3</w:t>
+            </w:r>
+            <w:r/>
+          </w:p>
+        </w:tc>
+        <w:tc>
+          <w:tcPr>
+            <w:tcW w:w="1755" w:type="dxa"/>
+            <w:vAlign w:val="center"/>
+            <w:tcMar>
+              <w:left w:w="57" w:type="dxa"/>
+              <w:right w:w="57" w:type="dxa"/>
+            </w:tcMar>
+            <w:tcBorders>
+              <w:top w:val="single" w:sz="4" w:space="0" w:color="000000" tmln="10, 20, 20, 0, 0"/>
+              <w:left w:val="single" w:sz="4" w:space="0" w:color="000000" tmln="10, 20, 20, 0, 0"/>
+              <w:bottom w:val="single" w:sz="4" w:space="0" w:color="000000" tmln="10, 20, 20, 0, 0"/>
+              <w:right w:val="single" w:sz="4" w:space="0" w:color="000000" tmln="10, 20, 20, 0, 0"/>
+            </w:tcBorders>
+            <w:tmTcPr id="1792316937" protected="0"/>
+          </w:tcPr>
+          <w:p>
+            <w:pPr>
               <w:keepNext/>
-            </w:pPr>
-            <w:r>
-              <w:rPr>
-                <w:rFonts w:ascii="함초롬돋움" w:hAnsi="함초롬돋움" w:eastAsia="함초롬돋움" w:cs="함초롬돋움"/>
-                <w:sz w:val="18"/>
-              </w:rPr>
-              <w:t>P − K3</w:t>
+              <w:wordWrap w:val="1"/>
+              <w:spacing w:before="0" w:after="0" w:line="240" w:lineRule="auto"/>
+              <w:jc w:val="center"/>
+            </w:pPr>
+            <w:r>
+              <w:rPr>
+                <w:rFonts w:ascii="함초롬돋움" w:hAnsi="함초롬돋움" w:eastAsia="함초롬돋움" w:cs="함초롬돋움"/>
+                <w:sz w:val="18"/>
+              </w:rPr>
+              <w:t>+0.150</w:t>
+            </w:r>
+            <w:r>
+              <w:br w:type="textWrapping"/>
+            </w:r>
+            <w:r>
+              <w:rPr>
+                <w:rFonts w:ascii="함초롬돋움" w:hAnsi="함초롬돋움" w:eastAsia="함초롬돋움" w:cs="함초롬돋움"/>
+                <w:sz w:val="18"/>
+              </w:rPr>
+              <w:t>[+0.017, +0.283]</w:t>
             </w:r>
             <w:r/>
           </w:p>
@@ -2276,51 +2389,10 @@
           </w:tcPr>
           <w:p>
             <w:pPr>
+              <w:keepNext/>
+              <w:wordWrap w:val="1"/>
               <w:spacing w:before="0" w:after="0" w:line="240" w:lineRule="auto"/>
               <w:jc w:val="center"/>
-              <w:keepNext/>
-            </w:pPr>
-            <w:r>
-              <w:rPr>
-                <w:rFonts w:ascii="함초롬돋움" w:hAnsi="함초롬돋움" w:eastAsia="함초롬돋움" w:cs="함초롬돋움"/>
-                <w:sz w:val="18"/>
-              </w:rPr>
-              <w:t>+0.150</w:t>
-            </w:r>
-            <w:r>
-              <w:br w:type="textWrapping"/>
-            </w:r>
-            <w:r>
-              <w:rPr>
-                <w:rFonts w:ascii="함초롬돋움" w:hAnsi="함초롬돋움" w:eastAsia="함초롬돋움" w:cs="함초롬돋움"/>
-                <w:sz w:val="18"/>
-              </w:rPr>
-              <w:t>[+0.017, +0.283]</w:t>
-            </w:r>
-            <w:r/>
-          </w:p>
-        </w:tc>
-        <w:tc>
-          <w:tcPr>
-            <w:tcW w:w="1755" w:type="dxa"/>
-            <w:vAlign w:val="center"/>
-            <w:tcMar>
-              <w:left w:w="57" w:type="dxa"/>
-              <w:right w:w="57" w:type="dxa"/>
-            </w:tcMar>
-            <w:tcBorders>
-              <w:top w:val="single" w:sz="4" w:space="0" w:color="000000" tmln="10, 20, 20, 0, 0"/>
-              <w:left w:val="single" w:sz="4" w:space="0" w:color="000000" tmln="10, 20, 20, 0, 0"/>
-              <w:bottom w:val="single" w:sz="4" w:space="0" w:color="000000" tmln="10, 20, 20, 0, 0"/>
-              <w:right w:val="single" w:sz="4" w:space="0" w:color="000000" tmln="10, 20, 20, 0, 0"/>
-            </w:tcBorders>
-            <w:tmTcPr id="1792316937" protected="0"/>
-          </w:tcPr>
-          <w:p>
-            <w:pPr>
-              <w:spacing w:before="0" w:after="0" w:line="240" w:lineRule="auto"/>
-              <w:jc w:val="center"/>
-              <w:keepNext/>
             </w:pPr>
             <w:r>
               <w:rPr>
@@ -2367,16 +2439,60 @@
           </w:tcPr>
           <w:p>
             <w:pPr>
+              <w:keepNext/>
+              <w:wordWrap w:val="1"/>
               <w:spacing w:before="0" w:after="0" w:line="240" w:lineRule="auto"/>
               <w:jc w:val="left"/>
+            </w:pPr>
+            <w:r>
+              <w:rPr>
+                <w:rFonts w:ascii="함초롬돋움" w:hAnsi="함초롬돋움" w:eastAsia="함초롬돋움" w:cs="함초롬돋움"/>
+                <w:sz w:val="18"/>
+              </w:rPr>
+              <w:t>P − L</w:t>
+            </w:r>
+            <w:r/>
+          </w:p>
+        </w:tc>
+        <w:tc>
+          <w:tcPr>
+            <w:tcW w:w="1755" w:type="dxa"/>
+            <w:vAlign w:val="center"/>
+            <w:tcMar>
+              <w:left w:w="57" w:type="dxa"/>
+              <w:right w:w="57" w:type="dxa"/>
+            </w:tcMar>
+            <w:tcBorders>
+              <w:top w:val="single" w:sz="4" w:space="0" w:color="000000" tmln="10, 20, 20, 0, 0"/>
+              <w:left w:val="single" w:sz="4" w:space="0" w:color="000000" tmln="10, 20, 20, 0, 0"/>
+              <w:bottom w:val="single" w:sz="4" w:space="0" w:color="000000" tmln="10, 20, 20, 0, 0"/>
+              <w:right w:val="single" w:sz="4" w:space="0" w:color="000000" tmln="10, 20, 20, 0, 0"/>
+            </w:tcBorders>
+            <w:tmTcPr id="1792316937" protected="0"/>
+          </w:tcPr>
+          <w:p>
+            <w:pPr>
               <w:keepNext/>
-            </w:pPr>
-            <w:r>
-              <w:rPr>
-                <w:rFonts w:ascii="함초롬돋움" w:hAnsi="함초롬돋움" w:eastAsia="함초롬돋움" w:cs="함초롬돋움"/>
-                <w:sz w:val="18"/>
-              </w:rPr>
-              <w:t>P − L</w:t>
+              <w:wordWrap w:val="1"/>
+              <w:spacing w:before="0" w:after="0" w:line="240" w:lineRule="auto"/>
+              <w:jc w:val="center"/>
+            </w:pPr>
+            <w:r>
+              <w:rPr>
+                <w:rFonts w:ascii="함초롬돋움" w:hAnsi="함초롬돋움" w:eastAsia="함초롬돋움" w:cs="함초롬돋움"/>
+                <w:sz w:val="18"/>
+              </w:rPr>
+              <w:t>+0.022</w:t>
+            </w:r>
+            <w:r>
+              <w:br w:type="textWrapping"/>
+            </w:r>
+            <w:r>
+              <w:rPr>
+                <w:rFonts w:ascii="함초롬돋움" w:hAnsi="함초롬돋움" w:eastAsia="함초롬돋움" w:cs="함초롬돋움"/>
+                <w:sz w:val="18"/>
+              </w:rPr>
+              <w:t>[+0.000, +0.067]</w:t>
             </w:r>
             <w:r/>
           </w:p>
@@ -2399,51 +2515,10 @@
           </w:tcPr>
           <w:p>
             <w:pPr>
+              <w:keepNext/>
+              <w:wordWrap w:val="1"/>
               <w:spacing w:before="0" w:after="0" w:line="240" w:lineRule="auto"/>
               <w:jc w:val="center"/>
-              <w:keepNext/>
-            </w:pPr>
-            <w:r>
-              <w:rPr>
-                <w:rFonts w:ascii="함초롬돋움" w:hAnsi="함초롬돋움" w:eastAsia="함초롬돋움" w:cs="함초롬돋움"/>
-                <w:sz w:val="18"/>
-              </w:rPr>
-              <w:t>+0.022</w:t>
-            </w:r>
-            <w:r>
-              <w:br w:type="textWrapping"/>
-            </w:r>
-            <w:r>
-              <w:rPr>
-                <w:rFonts w:ascii="함초롬돋움" w:hAnsi="함초롬돋움" w:eastAsia="함초롬돋움" w:cs="함초롬돋움"/>
-                <w:sz w:val="18"/>
-              </w:rPr>
-              <w:t>[+0.000, +0.067]</w:t>
-            </w:r>
-            <w:r/>
-          </w:p>
-        </w:tc>
-        <w:tc>
-          <w:tcPr>
-            <w:tcW w:w="1755" w:type="dxa"/>
-            <w:vAlign w:val="center"/>
-            <w:tcMar>
-              <w:left w:w="57" w:type="dxa"/>
-              <w:right w:w="57" w:type="dxa"/>
-            </w:tcMar>
-            <w:tcBorders>
-              <w:top w:val="single" w:sz="4" w:space="0" w:color="000000" tmln="10, 20, 20, 0, 0"/>
-              <w:left w:val="single" w:sz="4" w:space="0" w:color="000000" tmln="10, 20, 20, 0, 0"/>
-              <w:bottom w:val="single" w:sz="4" w:space="0" w:color="000000" tmln="10, 20, 20, 0, 0"/>
-              <w:right w:val="single" w:sz="4" w:space="0" w:color="000000" tmln="10, 20, 20, 0, 0"/>
-            </w:tcBorders>
-            <w:tmTcPr id="1792316937" protected="0"/>
-          </w:tcPr>
-          <w:p>
-            <w:pPr>
-              <w:spacing w:before="0" w:after="0" w:line="240" w:lineRule="auto"/>
-              <w:jc w:val="center"/>
-              <w:keepNext/>
             </w:pPr>
             <w:r>
               <w:rPr>
@@ -2490,8 +2565,9 @@
           </w:tcPr>
           <w:p>
             <w:pPr>
-              <w:spacing w:before="0" w:after="0" w:line="240" w:lineRule="auto"/>
               <w:keepNext/>
+              <w:wordWrap w:val="1"/>
+              <w:spacing w:before="0" w:after="0" w:line="240" w:lineRule="auto"/>
             </w:pPr>
             <w:r>
               <w:rPr>
@@ -2529,16 +2605,60 @@
           </w:tcPr>
           <w:p>
             <w:pPr>
+              <w:keepNext/>
+              <w:wordWrap w:val="1"/>
               <w:spacing w:before="0" w:after="0" w:line="240" w:lineRule="auto"/>
               <w:jc w:val="left"/>
+            </w:pPr>
+            <w:r>
+              <w:rPr>
+                <w:rFonts w:ascii="함초롬돋움" w:hAnsi="함초롬돋움" w:eastAsia="함초롬돋움" w:cs="함초롬돋움"/>
+                <w:sz w:val="18"/>
+              </w:rPr>
+              <w:t>L − K3</w:t>
+            </w:r>
+            <w:r/>
+          </w:p>
+        </w:tc>
+        <w:tc>
+          <w:tcPr>
+            <w:tcW w:w="1755" w:type="dxa"/>
+            <w:vAlign w:val="center"/>
+            <w:tcMar>
+              <w:left w:w="57" w:type="dxa"/>
+              <w:right w:w="57" w:type="dxa"/>
+            </w:tcMar>
+            <w:tcBorders>
+              <w:top w:val="single" w:sz="4" w:space="0" w:color="000000" tmln="10, 20, 20, 0, 0"/>
+              <w:left w:val="single" w:sz="4" w:space="0" w:color="000000" tmln="10, 20, 20, 0, 0"/>
+              <w:bottom w:val="single" w:sz="4" w:space="0" w:color="000000" tmln="10, 20, 20, 0, 0"/>
+              <w:right w:val="single" w:sz="4" w:space="0" w:color="000000" tmln="10, 20, 20, 0, 0"/>
+            </w:tcBorders>
+            <w:tmTcPr id="1792316937" protected="0"/>
+          </w:tcPr>
+          <w:p>
+            <w:pPr>
               <w:keepNext/>
-            </w:pPr>
-            <w:r>
-              <w:rPr>
-                <w:rFonts w:ascii="함초롬돋움" w:hAnsi="함초롬돋움" w:eastAsia="함초롬돋움" w:cs="함초롬돋움"/>
-                <w:sz w:val="18"/>
-              </w:rPr>
-              <w:t>L − K3</w:t>
+              <w:wordWrap w:val="1"/>
+              <w:spacing w:before="0" w:after="0" w:line="240" w:lineRule="auto"/>
+              <w:jc w:val="center"/>
+            </w:pPr>
+            <w:r>
+              <w:rPr>
+                <w:rFonts w:ascii="함초롬돋움" w:hAnsi="함초롬돋움" w:eastAsia="함초롬돋움" w:cs="함초롬돋움"/>
+                <w:sz w:val="18"/>
+              </w:rPr>
+              <w:t>+0.267</w:t>
+            </w:r>
+            <w:r>
+              <w:br w:type="textWrapping"/>
+            </w:r>
+            <w:r>
+              <w:rPr>
+                <w:rFonts w:ascii="함초롬돋움" w:hAnsi="함초롬돋움" w:eastAsia="함초롬돋움" w:cs="함초롬돋움"/>
+                <w:sz w:val="18"/>
+              </w:rPr>
+              <w:t>[+0.083, +0.440]</w:t>
             </w:r>
             <w:r/>
           </w:p>
@@ -2561,51 +2681,10 @@
           </w:tcPr>
           <w:p>
             <w:pPr>
+              <w:keepNext/>
+              <w:wordWrap w:val="1"/>
               <w:spacing w:before="0" w:after="0" w:line="240" w:lineRule="auto"/>
               <w:jc w:val="center"/>
-              <w:keepNext/>
-            </w:pPr>
-            <w:r>
-              <w:rPr>
-                <w:rFonts w:ascii="함초롬돋움" w:hAnsi="함초롬돋움" w:eastAsia="함초롬돋움" w:cs="함초롬돋움"/>
-                <w:sz w:val="18"/>
-              </w:rPr>
-              <w:t>+0.267</w:t>
-            </w:r>
-            <w:r>
-              <w:br w:type="textWrapping"/>
-            </w:r>
-            <w:r>
-              <w:rPr>
-                <w:rFonts w:ascii="함초롬돋움" w:hAnsi="함초롬돋움" w:eastAsia="함초롬돋움" w:cs="함초롬돋움"/>
-                <w:sz w:val="18"/>
-              </w:rPr>
-              <w:t>[+0.083, +0.440]</w:t>
-            </w:r>
-            <w:r/>
-          </w:p>
-        </w:tc>
-        <w:tc>
-          <w:tcPr>
-            <w:tcW w:w="1755" w:type="dxa"/>
-            <w:vAlign w:val="center"/>
-            <w:tcMar>
-              <w:left w:w="57" w:type="dxa"/>
-              <w:right w:w="57" w:type="dxa"/>
-            </w:tcMar>
-            <w:tcBorders>
-              <w:top w:val="single" w:sz="4" w:space="0" w:color="000000" tmln="10, 20, 20, 0, 0"/>
-              <w:left w:val="single" w:sz="4" w:space="0" w:color="000000" tmln="10, 20, 20, 0, 0"/>
-              <w:bottom w:val="single" w:sz="4" w:space="0" w:color="000000" tmln="10, 20, 20, 0, 0"/>
-              <w:right w:val="single" w:sz="4" w:space="0" w:color="000000" tmln="10, 20, 20, 0, 0"/>
-            </w:tcBorders>
-            <w:tmTcPr id="1792316937" protected="0"/>
-          </w:tcPr>
-          <w:p>
-            <w:pPr>
-              <w:spacing w:before="0" w:after="0" w:line="240" w:lineRule="auto"/>
-              <w:jc w:val="center"/>
-              <w:keepNext/>
             </w:pPr>
             <w:r>
               <w:rPr>
@@ -2652,16 +2731,60 @@
           </w:tcPr>
           <w:p>
             <w:pPr>
+              <w:keepNext/>
+              <w:wordWrap w:val="1"/>
               <w:spacing w:before="0" w:after="0" w:line="240" w:lineRule="auto"/>
               <w:jc w:val="left"/>
+            </w:pPr>
+            <w:r>
+              <w:rPr>
+                <w:rFonts w:ascii="함초롬돋움" w:hAnsi="함초롬돋움" w:eastAsia="함초롬돋움" w:cs="함초롬돋움"/>
+                <w:sz w:val="18"/>
+              </w:rPr>
+              <w:t>P − K3</w:t>
+            </w:r>
+            <w:r/>
+          </w:p>
+        </w:tc>
+        <w:tc>
+          <w:tcPr>
+            <w:tcW w:w="1755" w:type="dxa"/>
+            <w:vAlign w:val="center"/>
+            <w:tcMar>
+              <w:left w:w="57" w:type="dxa"/>
+              <w:right w:w="57" w:type="dxa"/>
+            </w:tcMar>
+            <w:tcBorders>
+              <w:top w:val="single" w:sz="4" w:space="0" w:color="000000" tmln="10, 20, 20, 0, 0"/>
+              <w:left w:val="single" w:sz="4" w:space="0" w:color="000000" tmln="10, 20, 20, 0, 0"/>
+              <w:bottom w:val="single" w:sz="4" w:space="0" w:color="000000" tmln="10, 20, 20, 0, 0"/>
+              <w:right w:val="single" w:sz="4" w:space="0" w:color="000000" tmln="10, 20, 20, 0, 0"/>
+            </w:tcBorders>
+            <w:tmTcPr id="1792316937" protected="0"/>
+          </w:tcPr>
+          <w:p>
+            <w:pPr>
               <w:keepNext/>
-            </w:pPr>
-            <w:r>
-              <w:rPr>
-                <w:rFonts w:ascii="함초롬돋움" w:hAnsi="함초롬돋움" w:eastAsia="함초롬돋움" w:cs="함초롬돋움"/>
-                <w:sz w:val="18"/>
-              </w:rPr>
-              <w:t>P − K3</w:t>
+              <w:wordWrap w:val="1"/>
+              <w:spacing w:before="0" w:after="0" w:line="240" w:lineRule="auto"/>
+              <w:jc w:val="center"/>
+            </w:pPr>
+            <w:r>
+              <w:rPr>
+                <w:rFonts w:ascii="함초롬돋움" w:hAnsi="함초롬돋움" w:eastAsia="함초롬돋움" w:cs="함초롬돋움"/>
+                <w:sz w:val="18"/>
+              </w:rPr>
+              <w:t>+0.244</w:t>
+            </w:r>
+            <w:r>
+              <w:br w:type="textWrapping"/>
+            </w:r>
+            <w:r>
+              <w:rPr>
+                <w:rFonts w:ascii="함초롬돋움" w:hAnsi="함초롬돋움" w:eastAsia="함초롬돋움" w:cs="함초롬돋움"/>
+                <w:sz w:val="18"/>
+              </w:rPr>
+              <w:t>[+0.098, +0.400]</w:t>
             </w:r>
             <w:r/>
           </w:p>
@@ -2684,51 +2807,10 @@
           </w:tcPr>
           <w:p>
             <w:pPr>
+              <w:keepNext/>
+              <w:wordWrap w:val="1"/>
               <w:spacing w:before="0" w:after="0" w:line="240" w:lineRule="auto"/>
               <w:jc w:val="center"/>
-              <w:keepNext/>
-            </w:pPr>
-            <w:r>
-              <w:rPr>
-                <w:rFonts w:ascii="함초롬돋움" w:hAnsi="함초롬돋움" w:eastAsia="함초롬돋움" w:cs="함초롬돋움"/>
-                <w:sz w:val="18"/>
-              </w:rPr>
-              <w:t>+0.244</w:t>
-            </w:r>
-            <w:r>
-              <w:br w:type="textWrapping"/>
-            </w:r>
-            <w:r>
-              <w:rPr>
-                <w:rFonts w:ascii="함초롬돋움" w:hAnsi="함초롬돋움" w:eastAsia="함초롬돋움" w:cs="함초롬돋움"/>
-                <w:sz w:val="18"/>
-              </w:rPr>
-              <w:t>[+0.098, +0.400]</w:t>
-            </w:r>
-            <w:r/>
-          </w:p>
-        </w:tc>
-        <w:tc>
-          <w:tcPr>
-            <w:tcW w:w="1755" w:type="dxa"/>
-            <w:vAlign w:val="center"/>
-            <w:tcMar>
-              <w:left w:w="57" w:type="dxa"/>
-              <w:right w:w="57" w:type="dxa"/>
-            </w:tcMar>
-            <w:tcBorders>
-              <w:top w:val="single" w:sz="4" w:space="0" w:color="000000" tmln="10, 20, 20, 0, 0"/>
-              <w:left w:val="single" w:sz="4" w:space="0" w:color="000000" tmln="10, 20, 20, 0, 0"/>
-              <w:bottom w:val="single" w:sz="4" w:space="0" w:color="000000" tmln="10, 20, 20, 0, 0"/>
-              <w:right w:val="single" w:sz="4" w:space="0" w:color="000000" tmln="10, 20, 20, 0, 0"/>
-            </w:tcBorders>
-            <w:tmTcPr id="1792316937" protected="0"/>
-          </w:tcPr>
-          <w:p>
-            <w:pPr>
-              <w:spacing w:before="0" w:after="0" w:line="240" w:lineRule="auto"/>
-              <w:jc w:val="center"/>
-              <w:keepNext/>
             </w:pPr>
             <w:r>
               <w:rPr>
@@ -2775,16 +2857,60 @@
           </w:tcPr>
           <w:p>
             <w:pPr>
+              <w:keepNext w:val="0"/>
+              <w:wordWrap w:val="1"/>
               <w:spacing w:before="0" w:after="0" w:line="240" w:lineRule="auto"/>
               <w:jc w:val="left"/>
+            </w:pPr>
+            <w:r>
+              <w:rPr>
+                <w:rFonts w:ascii="함초롬돋움" w:hAnsi="함초롬돋움" w:eastAsia="함초롬돋움" w:cs="함초롬돋움"/>
+                <w:sz w:val="18"/>
+              </w:rPr>
+              <w:t>P − L</w:t>
+            </w:r>
+            <w:r/>
+          </w:p>
+        </w:tc>
+        <w:tc>
+          <w:tcPr>
+            <w:tcW w:w="1755" w:type="dxa"/>
+            <w:vAlign w:val="center"/>
+            <w:tcMar>
+              <w:left w:w="57" w:type="dxa"/>
+              <w:right w:w="57" w:type="dxa"/>
+            </w:tcMar>
+            <w:tcBorders>
+              <w:top w:val="single" w:sz="4" w:space="0" w:color="000000" tmln="10, 20, 20, 0, 0"/>
+              <w:left w:val="single" w:sz="4" w:space="0" w:color="000000" tmln="10, 20, 20, 0, 0"/>
+              <w:bottom w:val="single" w:sz="4" w:space="0" w:color="000000" tmln="10, 20, 20, 0, 0"/>
+              <w:right w:val="single" w:sz="4" w:space="0" w:color="000000" tmln="10, 20, 20, 0, 0"/>
+            </w:tcBorders>
+            <w:tmTcPr id="1792316937" protected="0"/>
+          </w:tcPr>
+          <w:p>
+            <w:pPr>
               <w:keepNext w:val="0"/>
-            </w:pPr>
-            <w:r>
-              <w:rPr>
-                <w:rFonts w:ascii="함초롬돋움" w:hAnsi="함초롬돋움" w:eastAsia="함초롬돋움" w:cs="함초롬돋움"/>
-                <w:sz w:val="18"/>
-              </w:rPr>
-              <w:t>P − L</w:t>
+              <w:wordWrap w:val="1"/>
+              <w:spacing w:before="0" w:after="0" w:line="240" w:lineRule="auto"/>
+              <w:jc w:val="center"/>
+            </w:pPr>
+            <w:r>
+              <w:rPr>
+                <w:rFonts w:ascii="함초롬돋움" w:hAnsi="함초롬돋움" w:eastAsia="함초롬돋움" w:cs="함초롬돋움"/>
+                <w:sz w:val="18"/>
+              </w:rPr>
+              <w:t>−0.022</w:t>
+            </w:r>
+            <w:r>
+              <w:br w:type="textWrapping"/>
+            </w:r>
+            <w:r>
+              <w:rPr>
+                <w:rFonts w:ascii="함초롬돋움" w:hAnsi="함초롬돋움" w:eastAsia="함초롬돋움" w:cs="함초롬돋움"/>
+                <w:sz w:val="18"/>
+              </w:rPr>
+              <w:t>[−0.083, +0.026]</w:t>
             </w:r>
             <w:r/>
           </w:p>
@@ -2807,51 +2933,10 @@
           </w:tcPr>
           <w:p>
             <w:pPr>
+              <w:keepNext w:val="0"/>
+              <w:wordWrap w:val="1"/>
               <w:spacing w:before="0" w:after="0" w:line="240" w:lineRule="auto"/>
               <w:jc w:val="center"/>
-              <w:keepNext w:val="0"/>
-            </w:pPr>
-            <w:r>
-              <w:rPr>
-                <w:rFonts w:ascii="함초롬돋움" w:hAnsi="함초롬돋움" w:eastAsia="함초롬돋움" w:cs="함초롬돋움"/>
-                <w:sz w:val="18"/>
-              </w:rPr>
-              <w:t>−0.022</w:t>
-            </w:r>
-            <w:r>
-              <w:br w:type="textWrapping"/>
-            </w:r>
-            <w:r>
-              <w:rPr>
-                <w:rFonts w:ascii="함초롬돋움" w:hAnsi="함초롬돋움" w:eastAsia="함초롬돋움" w:cs="함초롬돋움"/>
-                <w:sz w:val="18"/>
-              </w:rPr>
-              <w:t>[−0.083, +0.026]</w:t>
-            </w:r>
-            <w:r/>
-          </w:p>
-        </w:tc>
-        <w:tc>
-          <w:tcPr>
-            <w:tcW w:w="1755" w:type="dxa"/>
-            <w:vAlign w:val="center"/>
-            <w:tcMar>
-              <w:left w:w="57" w:type="dxa"/>
-              <w:right w:w="57" w:type="dxa"/>
-            </w:tcMar>
-            <w:tcBorders>
-              <w:top w:val="single" w:sz="4" w:space="0" w:color="000000" tmln="10, 20, 20, 0, 0"/>
-              <w:left w:val="single" w:sz="4" w:space="0" w:color="000000" tmln="10, 20, 20, 0, 0"/>
-              <w:bottom w:val="single" w:sz="4" w:space="0" w:color="000000" tmln="10, 20, 20, 0, 0"/>
-              <w:right w:val="single" w:sz="4" w:space="0" w:color="000000" tmln="10, 20, 20, 0, 0"/>
-            </w:tcBorders>
-            <w:tmTcPr id="1792316937" protected="0"/>
-          </w:tcPr>
-          <w:p>
-            <w:pPr>
-              <w:spacing w:before="0" w:after="0" w:line="240" w:lineRule="auto"/>
-              <w:jc w:val="center"/>
-              <w:keepNext w:val="0"/>
             </w:pPr>
             <w:r>
               <w:rPr>
@@ -2877,14 +2962,16 @@
     </w:tbl>
     <w:p>
       <w:pPr>
+        <w:wordWrap w:val="1"/>
         <w:spacing w:line="60" w:lineRule="exact"/>
       </w:pPr>
       <w:r/>
     </w:p>
     <w:p>
       <w:pPr>
+        <w:wordWrap w:val="1"/>
+        <w:spacing w:line="300" w:lineRule="exact"/>
         <w:ind w:firstLine="180"/>
-        <w:spacing w:line="300" w:lineRule="exact"/>
       </w:pPr>
       <w:r>
         <w:rPr>
@@ -2897,9 +2984,10 @@
     </w:p>
     <w:p>
       <w:pPr>
+        <w:keepNext/>
+        <w:wordWrap w:val="1"/>
         <w:spacing w:before="80" w:after="40"/>
         <w:jc w:val="center"/>
-        <w:keepNext/>
         <w:rPr>
           <w:sz w:val="14"/>
           <w:szCs w:val="14"/>
@@ -2965,9 +3053,44 @@
           </w:tcPr>
           <w:p>
             <w:pPr>
+              <w:keepNext/>
+              <w:wordWrap w:val="1"/>
               <w:spacing w:before="0" w:after="0" w:line="240" w:lineRule="auto"/>
               <w:jc w:val="left"/>
+            </w:pPr>
+            <w:r>
+              <w:rPr>
+                <w:rFonts w:ascii="함초롬돋움" w:hAnsi="함초롬돋움" w:eastAsia="함초롬돋움" w:cs="함초롬돋움"/>
+                <w:b/>
+                <w:sz w:val="18"/>
+              </w:rPr>
+              <w:t>지표</w:t>
+            </w:r>
+            <w:r/>
+          </w:p>
+        </w:tc>
+        <w:tc>
+          <w:tcPr>
+            <w:tcW w:w="1755" w:type="dxa"/>
+            <w:vAlign w:val="center"/>
+            <w:tcMar>
+              <w:left w:w="57" w:type="dxa"/>
+              <w:right w:w="57" w:type="dxa"/>
+            </w:tcMar>
+            <w:tcBorders>
+              <w:top w:val="single" w:sz="4" w:space="0" w:color="000000" tmln="10, 20, 20, 0, 0"/>
+              <w:left w:val="single" w:sz="4" w:space="0" w:color="000000" tmln="10, 20, 20, 0, 0"/>
+              <w:bottom w:val="single" w:sz="4" w:space="0" w:color="000000" tmln="10, 20, 20, 0, 0"/>
+              <w:right w:val="single" w:sz="4" w:space="0" w:color="000000" tmln="10, 20, 20, 0, 0"/>
+            </w:tcBorders>
+            <w:tmTcPr id="1792316937" protected="0"/>
+          </w:tcPr>
+          <w:p>
+            <w:pPr>
               <w:keepNext/>
+              <w:wordWrap w:val="1"/>
+              <w:spacing w:before="0" w:after="0" w:line="240" w:lineRule="auto"/>
+              <w:jc w:val="center"/>
             </w:pPr>
             <w:r>
               <w:rPr>
@@ -2975,7 +3098,18 @@
                 <w:b/>
                 <w:sz w:val="18"/>
               </w:rPr>
-              <w:t>지표</w:t>
+              <w:t>기존 사례</w:t>
+            </w:r>
+            <w:r>
+              <w:br w:type="textWrapping"/>
+            </w:r>
+            <w:r>
+              <w:rPr>
+                <w:rFonts w:ascii="함초롬돋움" w:hAnsi="함초롬돋움" w:eastAsia="함초롬돋움" w:cs="함초롬돋움"/>
+                <w:b/>
+                <w:sz w:val="18"/>
+              </w:rPr>
+              <w:t>(5/5)</w:t>
             </w:r>
             <w:r/>
           </w:p>
@@ -2998,53 +3132,10 @@
           </w:tcPr>
           <w:p>
             <w:pPr>
+              <w:keepNext/>
+              <w:wordWrap w:val="1"/>
               <w:spacing w:before="0" w:after="0" w:line="240" w:lineRule="auto"/>
               <w:jc w:val="center"/>
-              <w:keepNext/>
-            </w:pPr>
-            <w:r>
-              <w:rPr>
-                <w:rFonts w:ascii="함초롬돋움" w:hAnsi="함초롬돋움" w:eastAsia="함초롬돋움" w:cs="함초롬돋움"/>
-                <w:b/>
-                <w:sz w:val="18"/>
-              </w:rPr>
-              <w:t>기존 사례</w:t>
-            </w:r>
-            <w:r>
-              <w:br w:type="textWrapping"/>
-            </w:r>
-            <w:r>
-              <w:rPr>
-                <w:rFonts w:ascii="함초롬돋움" w:hAnsi="함초롬돋움" w:eastAsia="함초롬돋움" w:cs="함초롬돋움"/>
-                <w:b/>
-                <w:sz w:val="18"/>
-              </w:rPr>
-              <w:t>(5/5)</w:t>
-            </w:r>
-            <w:r/>
-          </w:p>
-        </w:tc>
-        <w:tc>
-          <w:tcPr>
-            <w:tcW w:w="1755" w:type="dxa"/>
-            <w:vAlign w:val="center"/>
-            <w:tcMar>
-              <w:left w:w="57" w:type="dxa"/>
-              <w:right w:w="57" w:type="dxa"/>
-            </w:tcMar>
-            <w:tcBorders>
-              <w:top w:val="single" w:sz="4" w:space="0" w:color="000000" tmln="10, 20, 20, 0, 0"/>
-              <w:left w:val="single" w:sz="4" w:space="0" w:color="000000" tmln="10, 20, 20, 0, 0"/>
-              <w:bottom w:val="single" w:sz="4" w:space="0" w:color="000000" tmln="10, 20, 20, 0, 0"/>
-              <w:right w:val="single" w:sz="4" w:space="0" w:color="000000" tmln="10, 20, 20, 0, 0"/>
-            </w:tcBorders>
-            <w:tmTcPr id="1792316937" protected="0"/>
-          </w:tcPr>
-          <w:p>
-            <w:pPr>
-              <w:spacing w:before="0" w:after="0" w:line="240" w:lineRule="auto"/>
-              <w:jc w:val="center"/>
-              <w:keepNext/>
             </w:pPr>
             <w:r>
               <w:rPr>
@@ -3093,16 +3184,60 @@
           </w:tcPr>
           <w:p>
             <w:pPr>
+              <w:keepNext/>
+              <w:wordWrap w:val="1"/>
               <w:spacing w:before="0" w:after="0" w:line="240" w:lineRule="auto"/>
               <w:jc w:val="left"/>
+            </w:pPr>
+            <w:r>
+              <w:rPr>
+                <w:rFonts w:ascii="함초롬돋움" w:hAnsi="함초롬돋움" w:eastAsia="함초롬돋움" w:cs="함초롬돋움"/>
+                <w:sz w:val="18"/>
+              </w:rPr>
+              <w:t>ΔContext</w:t>
+            </w:r>
+            <w:r>
+              <w:br w:type="textWrapping"/>
+            </w:r>
+            <w:r>
+              <w:rPr>
+                <w:rFonts w:ascii="함초롬돋움" w:hAnsi="함초롬돋움" w:eastAsia="함초롬돋움" w:cs="함초롬돋움"/>
+                <w:sz w:val="18"/>
+              </w:rPr>
+              <w:t>Precision</w:t>
+            </w:r>
+            <w:r/>
+          </w:p>
+        </w:tc>
+        <w:tc>
+          <w:tcPr>
+            <w:tcW w:w="1755" w:type="dxa"/>
+            <w:vAlign w:val="center"/>
+            <w:tcMar>
+              <w:left w:w="57" w:type="dxa"/>
+              <w:right w:w="57" w:type="dxa"/>
+            </w:tcMar>
+            <w:tcBorders>
+              <w:top w:val="single" w:sz="4" w:space="0" w:color="000000" tmln="10, 20, 20, 0, 0"/>
+              <w:left w:val="single" w:sz="4" w:space="0" w:color="000000" tmln="10, 20, 20, 0, 0"/>
+              <w:bottom w:val="single" w:sz="4" w:space="0" w:color="000000" tmln="10, 20, 20, 0, 0"/>
+              <w:right w:val="single" w:sz="4" w:space="0" w:color="000000" tmln="10, 20, 20, 0, 0"/>
+            </w:tcBorders>
+            <w:tmTcPr id="1792316937" protected="0"/>
+          </w:tcPr>
+          <w:p>
+            <w:pPr>
               <w:keepNext/>
-            </w:pPr>
-            <w:r>
-              <w:rPr>
-                <w:rFonts w:ascii="함초롬돋움" w:hAnsi="함초롬돋움" w:eastAsia="함초롬돋움" w:cs="함초롬돋움"/>
-                <w:sz w:val="18"/>
-              </w:rPr>
-              <w:t>ΔContext</w:t>
+              <w:wordWrap w:val="1"/>
+              <w:spacing w:before="0" w:after="0" w:line="240" w:lineRule="auto"/>
+              <w:jc w:val="center"/>
+            </w:pPr>
+            <w:r>
+              <w:rPr>
+                <w:rFonts w:ascii="함초롬돋움" w:hAnsi="함초롬돋움" w:eastAsia="함초롬돋움" w:cs="함초롬돋움"/>
+                <w:sz w:val="18"/>
+              </w:rPr>
+              <w:t>+0.109</w:t>
             </w:r>
             <w:r>
               <w:br w:type="textWrapping"/>
@@ -3112,7 +3247,7 @@
                 <w:rFonts w:ascii="함초롬돋움" w:hAnsi="함초롬돋움" w:eastAsia="함초롬돋움" w:cs="함초롬돋움"/>
                 <w:sz w:val="18"/>
               </w:rPr>
-              <w:t>Precision</w:t>
+              <w:t>[+0.002, +0.220]</w:t>
             </w:r>
             <w:r/>
           </w:p>
@@ -3135,51 +3270,10 @@
           </w:tcPr>
           <w:p>
             <w:pPr>
+              <w:keepNext/>
+              <w:wordWrap w:val="1"/>
               <w:spacing w:before="0" w:after="0" w:line="240" w:lineRule="auto"/>
               <w:jc w:val="center"/>
-              <w:keepNext/>
-            </w:pPr>
-            <w:r>
-              <w:rPr>
-                <w:rFonts w:ascii="함초롬돋움" w:hAnsi="함초롬돋움" w:eastAsia="함초롬돋움" w:cs="함초롬돋움"/>
-                <w:sz w:val="18"/>
-              </w:rPr>
-              <w:t>+0.109</w:t>
-            </w:r>
-            <w:r>
-              <w:br w:type="textWrapping"/>
-            </w:r>
-            <w:r>
-              <w:rPr>
-                <w:rFonts w:ascii="함초롬돋움" w:hAnsi="함초롬돋움" w:eastAsia="함초롬돋움" w:cs="함초롬돋움"/>
-                <w:sz w:val="18"/>
-              </w:rPr>
-              <w:t>[+0.002, +0.220]</w:t>
-            </w:r>
-            <w:r/>
-          </w:p>
-        </w:tc>
-        <w:tc>
-          <w:tcPr>
-            <w:tcW w:w="1755" w:type="dxa"/>
-            <w:vAlign w:val="center"/>
-            <w:tcMar>
-              <w:left w:w="57" w:type="dxa"/>
-              <w:right w:w="57" w:type="dxa"/>
-            </w:tcMar>
-            <w:tcBorders>
-              <w:top w:val="single" w:sz="4" w:space="0" w:color="000000" tmln="10, 20, 20, 0, 0"/>
-              <w:left w:val="single" w:sz="4" w:space="0" w:color="000000" tmln="10, 20, 20, 0, 0"/>
-              <w:bottom w:val="single" w:sz="4" w:space="0" w:color="000000" tmln="10, 20, 20, 0, 0"/>
-              <w:right w:val="single" w:sz="4" w:space="0" w:color="000000" tmln="10, 20, 20, 0, 0"/>
-            </w:tcBorders>
-            <w:tmTcPr id="1792316937" protected="0"/>
-          </w:tcPr>
-          <w:p>
-            <w:pPr>
-              <w:spacing w:before="0" w:after="0" w:line="240" w:lineRule="auto"/>
-              <w:jc w:val="center"/>
-              <w:keepNext/>
             </w:pPr>
             <w:r>
               <w:rPr>
@@ -3226,16 +3320,60 @@
           </w:tcPr>
           <w:p>
             <w:pPr>
+              <w:keepNext/>
+              <w:wordWrap w:val="1"/>
               <w:spacing w:before="0" w:after="0" w:line="240" w:lineRule="auto"/>
               <w:jc w:val="left"/>
+            </w:pPr>
+            <w:r>
+              <w:rPr>
+                <w:rFonts w:ascii="함초롬돋움" w:hAnsi="함초롬돋움" w:eastAsia="함초롬돋움" w:cs="함초롬돋움"/>
+                <w:sz w:val="18"/>
+              </w:rPr>
+              <w:t>ΔAnswer</w:t>
+            </w:r>
+            <w:r>
+              <w:br w:type="textWrapping"/>
+            </w:r>
+            <w:r>
+              <w:rPr>
+                <w:rFonts w:ascii="함초롬돋움" w:hAnsi="함초롬돋움" w:eastAsia="함초롬돋움" w:cs="함초롬돋움"/>
+                <w:sz w:val="18"/>
+              </w:rPr>
+              <w:t>Correctness</w:t>
+            </w:r>
+            <w:r/>
+          </w:p>
+        </w:tc>
+        <w:tc>
+          <w:tcPr>
+            <w:tcW w:w="1755" w:type="dxa"/>
+            <w:vAlign w:val="center"/>
+            <w:tcMar>
+              <w:left w:w="57" w:type="dxa"/>
+              <w:right w:w="57" w:type="dxa"/>
+            </w:tcMar>
+            <w:tcBorders>
+              <w:top w:val="single" w:sz="4" w:space="0" w:color="000000" tmln="10, 20, 20, 0, 0"/>
+              <w:left w:val="single" w:sz="4" w:space="0" w:color="000000" tmln="10, 20, 20, 0, 0"/>
+              <w:bottom w:val="single" w:sz="4" w:space="0" w:color="000000" tmln="10, 20, 20, 0, 0"/>
+              <w:right w:val="single" w:sz="4" w:space="0" w:color="000000" tmln="10, 20, 20, 0, 0"/>
+            </w:tcBorders>
+            <w:tmTcPr id="1792316937" protected="0"/>
+          </w:tcPr>
+          <w:p>
+            <w:pPr>
               <w:keepNext/>
-            </w:pPr>
-            <w:r>
-              <w:rPr>
-                <w:rFonts w:ascii="함초롬돋움" w:hAnsi="함초롬돋움" w:eastAsia="함초롬돋움" w:cs="함초롬돋움"/>
-                <w:sz w:val="18"/>
-              </w:rPr>
-              <w:t>ΔAnswer</w:t>
+              <w:wordWrap w:val="1"/>
+              <w:spacing w:before="0" w:after="0" w:line="240" w:lineRule="auto"/>
+              <w:jc w:val="center"/>
+            </w:pPr>
+            <w:r>
+              <w:rPr>
+                <w:rFonts w:ascii="함초롬돋움" w:hAnsi="함초롬돋움" w:eastAsia="함초롬돋움" w:cs="함초롬돋움"/>
+                <w:sz w:val="18"/>
+              </w:rPr>
+              <w:t>−0.003</w:t>
             </w:r>
             <w:r>
               <w:br w:type="textWrapping"/>
@@ -3245,7 +3383,7 @@
                 <w:rFonts w:ascii="함초롬돋움" w:hAnsi="함초롬돋움" w:eastAsia="함초롬돋움" w:cs="함초롬돋움"/>
                 <w:sz w:val="18"/>
               </w:rPr>
-              <w:t>Correctness</w:t>
+              <w:t>[−0.040, +0.042]</w:t>
             </w:r>
             <w:r/>
           </w:p>
@@ -3268,51 +3406,10 @@
           </w:tcPr>
           <w:p>
             <w:pPr>
+              <w:keepNext/>
+              <w:wordWrap w:val="1"/>
               <w:spacing w:before="0" w:after="0" w:line="240" w:lineRule="auto"/>
               <w:jc w:val="center"/>
-              <w:keepNext/>
-            </w:pPr>
-            <w:r>
-              <w:rPr>
-                <w:rFonts w:ascii="함초롬돋움" w:hAnsi="함초롬돋움" w:eastAsia="함초롬돋움" w:cs="함초롬돋움"/>
-                <w:sz w:val="18"/>
-              </w:rPr>
-              <w:t>−0.003</w:t>
-            </w:r>
-            <w:r>
-              <w:br w:type="textWrapping"/>
-            </w:r>
-            <w:r>
-              <w:rPr>
-                <w:rFonts w:ascii="함초롬돋움" w:hAnsi="함초롬돋움" w:eastAsia="함초롬돋움" w:cs="함초롬돋움"/>
-                <w:sz w:val="18"/>
-              </w:rPr>
-              <w:t>[−0.040, +0.042]</w:t>
-            </w:r>
-            <w:r/>
-          </w:p>
-        </w:tc>
-        <w:tc>
-          <w:tcPr>
-            <w:tcW w:w="1755" w:type="dxa"/>
-            <w:vAlign w:val="center"/>
-            <w:tcMar>
-              <w:left w:w="57" w:type="dxa"/>
-              <w:right w:w="57" w:type="dxa"/>
-            </w:tcMar>
-            <w:tcBorders>
-              <w:top w:val="single" w:sz="4" w:space="0" w:color="000000" tmln="10, 20, 20, 0, 0"/>
-              <w:left w:val="single" w:sz="4" w:space="0" w:color="000000" tmln="10, 20, 20, 0, 0"/>
-              <w:bottom w:val="single" w:sz="4" w:space="0" w:color="000000" tmln="10, 20, 20, 0, 0"/>
-              <w:right w:val="single" w:sz="4" w:space="0" w:color="000000" tmln="10, 20, 20, 0, 0"/>
-            </w:tcBorders>
-            <w:tmTcPr id="1792316937" protected="0"/>
-          </w:tcPr>
-          <w:p>
-            <w:pPr>
-              <w:spacing w:before="0" w:after="0" w:line="240" w:lineRule="auto"/>
-              <w:jc w:val="center"/>
-              <w:keepNext/>
             </w:pPr>
             <w:r>
               <w:rPr>
@@ -3359,16 +3456,60 @@
           </w:tcPr>
           <w:p>
             <w:pPr>
+              <w:keepNext w:val="0"/>
+              <w:wordWrap w:val="1"/>
               <w:spacing w:before="0" w:after="0" w:line="240" w:lineRule="auto"/>
               <w:jc w:val="left"/>
+            </w:pPr>
+            <w:r>
+              <w:rPr>
+                <w:rFonts w:ascii="함초롬돋움" w:hAnsi="함초롬돋움" w:eastAsia="함초롬돋움" w:cs="함초롬돋움"/>
+                <w:sz w:val="18"/>
+              </w:rPr>
+              <w:t>Δ응답 시간</w:t>
+            </w:r>
+            <w:r>
+              <w:br w:type="textWrapping"/>
+            </w:r>
+            <w:r>
+              <w:rPr>
+                <w:rFonts w:ascii="함초롬돋움" w:hAnsi="함초롬돋움" w:eastAsia="함초롬돋움" w:cs="함초롬돋움"/>
+                <w:sz w:val="18"/>
+              </w:rPr>
+              <w:t>(초/질의)</w:t>
+            </w:r>
+            <w:r/>
+          </w:p>
+        </w:tc>
+        <w:tc>
+          <w:tcPr>
+            <w:tcW w:w="1755" w:type="dxa"/>
+            <w:vAlign w:val="center"/>
+            <w:tcMar>
+              <w:left w:w="57" w:type="dxa"/>
+              <w:right w:w="57" w:type="dxa"/>
+            </w:tcMar>
+            <w:tcBorders>
+              <w:top w:val="single" w:sz="4" w:space="0" w:color="000000" tmln="10, 20, 20, 0, 0"/>
+              <w:left w:val="single" w:sz="4" w:space="0" w:color="000000" tmln="10, 20, 20, 0, 0"/>
+              <w:bottom w:val="single" w:sz="4" w:space="0" w:color="000000" tmln="10, 20, 20, 0, 0"/>
+              <w:right w:val="single" w:sz="4" w:space="0" w:color="000000" tmln="10, 20, 20, 0, 0"/>
+            </w:tcBorders>
+            <w:tmTcPr id="1792316937" protected="0"/>
+          </w:tcPr>
+          <w:p>
+            <w:pPr>
               <w:keepNext w:val="0"/>
-            </w:pPr>
-            <w:r>
-              <w:rPr>
-                <w:rFonts w:ascii="함초롬돋움" w:hAnsi="함초롬돋움" w:eastAsia="함초롬돋움" w:cs="함초롬돋움"/>
-                <w:sz w:val="18"/>
-              </w:rPr>
-              <w:t>Δ응답 시간</w:t>
+              <w:wordWrap w:val="1"/>
+              <w:spacing w:before="0" w:after="0" w:line="240" w:lineRule="auto"/>
+              <w:jc w:val="center"/>
+            </w:pPr>
+            <w:r>
+              <w:rPr>
+                <w:rFonts w:ascii="함초롬돋움" w:hAnsi="함초롬돋움" w:eastAsia="함초롬돋움" w:cs="함초롬돋움"/>
+                <w:sz w:val="18"/>
+              </w:rPr>
+              <w:t>+1.057</w:t>
             </w:r>
             <w:r>
               <w:br w:type="textWrapping"/>
@@ -3378,7 +3519,7 @@
                 <w:rFonts w:ascii="함초롬돋움" w:hAnsi="함초롬돋움" w:eastAsia="함초롬돋움" w:cs="함초롬돋움"/>
                 <w:sz w:val="18"/>
               </w:rPr>
-              <w:t>(초/질의)</w:t>
+              <w:t>[+0.904, +1.211]</w:t>
             </w:r>
             <w:r/>
           </w:p>
@@ -3401,51 +3542,10 @@
           </w:tcPr>
           <w:p>
             <w:pPr>
+              <w:keepNext w:val="0"/>
+              <w:wordWrap w:val="1"/>
               <w:spacing w:before="0" w:after="0" w:line="240" w:lineRule="auto"/>
               <w:jc w:val="center"/>
-              <w:keepNext w:val="0"/>
-            </w:pPr>
-            <w:r>
-              <w:rPr>
-                <w:rFonts w:ascii="함초롬돋움" w:hAnsi="함초롬돋움" w:eastAsia="함초롬돋움" w:cs="함초롬돋움"/>
-                <w:sz w:val="18"/>
-              </w:rPr>
-              <w:t>+1.057</w:t>
-            </w:r>
-            <w:r>
-              <w:br w:type="textWrapping"/>
-            </w:r>
-            <w:r>
-              <w:rPr>
-                <w:rFonts w:ascii="함초롬돋움" w:hAnsi="함초롬돋움" w:eastAsia="함초롬돋움" w:cs="함초롬돋움"/>
-                <w:sz w:val="18"/>
-              </w:rPr>
-              <w:t>[+0.904, +1.211]</w:t>
-            </w:r>
-            <w:r/>
-          </w:p>
-        </w:tc>
-        <w:tc>
-          <w:tcPr>
-            <w:tcW w:w="1755" w:type="dxa"/>
-            <w:vAlign w:val="center"/>
-            <w:tcMar>
-              <w:left w:w="57" w:type="dxa"/>
-              <w:right w:w="57" w:type="dxa"/>
-            </w:tcMar>
-            <w:tcBorders>
-              <w:top w:val="single" w:sz="4" w:space="0" w:color="000000" tmln="10, 20, 20, 0, 0"/>
-              <w:left w:val="single" w:sz="4" w:space="0" w:color="000000" tmln="10, 20, 20, 0, 0"/>
-              <w:bottom w:val="single" w:sz="4" w:space="0" w:color="000000" tmln="10, 20, 20, 0, 0"/>
-              <w:right w:val="single" w:sz="4" w:space="0" w:color="000000" tmln="10, 20, 20, 0, 0"/>
-            </w:tcBorders>
-            <w:tmTcPr id="1792316937" protected="0"/>
-          </w:tcPr>
-          <w:p>
-            <w:pPr>
-              <w:spacing w:before="0" w:after="0" w:line="240" w:lineRule="auto"/>
-              <w:jc w:val="center"/>
-              <w:keepNext w:val="0"/>
             </w:pPr>
             <w:r>
               <w:rPr>
@@ -3471,21 +3571,24 @@
     </w:tbl>
     <w:p>
       <w:pPr>
+        <w:wordWrap w:val="1"/>
         <w:spacing w:line="60" w:lineRule="exact"/>
       </w:pPr>
       <w:r/>
     </w:p>
     <w:p>
       <w:pPr>
+        <w:wordWrap w:val="1"/>
+        <w:spacing w:line="300" w:lineRule="exact"/>
         <w:ind w:firstLine="180"/>
-        <w:spacing w:line="300" w:lineRule="exact"/>
       </w:pPr>
       <w:r/>
     </w:p>
     <w:p>
       <w:pPr>
+        <w:wordWrap w:val="1"/>
+        <w:spacing w:line="300" w:lineRule="exact"/>
         <w:ind w:firstLine="180"/>
-        <w:spacing w:line="300" w:lineRule="exact"/>
       </w:pPr>
       <w:r>
         <w:rPr>
@@ -3498,8 +3601,9 @@
     </w:p>
     <w:p>
       <w:pPr>
+        <w:wordWrap w:val="1"/>
+        <w:spacing w:line="300" w:lineRule="exact"/>
         <w:ind w:firstLine="180"/>
-        <w:spacing w:line="300" w:lineRule="exact"/>
         <w:rPr>
           <w:rFonts w:ascii="함초롬돋움" w:hAnsi="함초롬돋움" w:eastAsia="함초롬돋움" w:cs="함초롬돋움"/>
           <w:sz w:val="18"/>
@@ -3521,15 +3625,17 @@
     </w:p>
     <w:p>
       <w:pPr>
+        <w:wordWrap w:val="1"/>
+        <w:spacing w:line="300" w:lineRule="exact"/>
         <w:ind w:firstLine="180"/>
-        <w:spacing w:line="300" w:lineRule="exact"/>
       </w:pPr>
       <w:r/>
     </w:p>
     <w:p>
       <w:pPr>
+        <w:keepNext/>
+        <w:wordWrap w:val="1"/>
         <w:spacing w:before="80" w:line="300" w:lineRule="exact"/>
-        <w:keepNext/>
       </w:pPr>
       <w:r>
         <w:rPr>
@@ -3542,8 +3648,9 @@
     </w:p>
     <w:p>
       <w:pPr>
+        <w:wordWrap w:val="1"/>
+        <w:spacing w:line="300" w:lineRule="exact"/>
         <w:ind w:firstLine="180"/>
-        <w:spacing w:line="300" w:lineRule="exact"/>
       </w:pPr>
       <w:r>
         <w:rPr>
@@ -3556,8 +3663,9 @@
     </w:p>
     <w:p>
       <w:pPr>
+        <w:wordWrap w:val="1"/>
+        <w:spacing w:line="300" w:lineRule="exact"/>
         <w:ind w:firstLine="180"/>
-        <w:spacing w:line="300" w:lineRule="exact"/>
       </w:pPr>
       <w:r>
         <w:rPr>
@@ -3570,8 +3678,9 @@
     </w:p>
     <w:p>
       <w:pPr>
+        <w:wordWrap w:val="1"/>
+        <w:spacing w:line="300" w:lineRule="exact"/>
         <w:ind w:firstLine="180"/>
-        <w:spacing w:line="300" w:lineRule="exact"/>
       </w:pPr>
       <w:r>
         <w:rPr>
@@ -3584,15 +3693,17 @@
     </w:p>
     <w:p>
       <w:pPr>
+        <w:keepNext/>
+        <w:wordWrap w:val="1"/>
         <w:spacing w:before="80" w:line="300" w:lineRule="exact"/>
-        <w:keepNext/>
       </w:pPr>
       <w:r/>
     </w:p>
     <w:p>
       <w:pPr>
+        <w:keepNext/>
+        <w:wordWrap w:val="1"/>
         <w:spacing w:before="80" w:line="300" w:lineRule="exact"/>
-        <w:keepNext/>
       </w:pPr>
       <w:r>
         <w:rPr>
@@ -3605,8 +3716,9 @@
     </w:p>
     <w:p>
       <w:pPr>
+        <w:wordWrap w:val="1"/>
+        <w:spacing w:after="20" w:line="240" w:lineRule="exact"/>
         <w:ind w:left="340" w:hanging="340"/>
-        <w:spacing w:after="20" w:line="240" w:lineRule="exact"/>
       </w:pPr>
       <w:r>
         <w:rPr>
@@ -3634,8 +3746,9 @@
     </w:p>
     <w:p>
       <w:pPr>
+        <w:wordWrap w:val="1"/>
+        <w:spacing w:after="20" w:line="240" w:lineRule="exact"/>
         <w:ind w:left="340" w:hanging="340"/>
-        <w:spacing w:after="20" w:line="240" w:lineRule="exact"/>
       </w:pPr>
       <w:r>
         <w:rPr>
@@ -3663,8 +3776,9 @@
     </w:p>
     <w:p>
       <w:pPr>
+        <w:wordWrap w:val="1"/>
+        <w:spacing w:after="20" w:line="240" w:lineRule="exact"/>
         <w:ind w:left="340" w:hanging="340"/>
-        <w:spacing w:after="20" w:line="240" w:lineRule="exact"/>
       </w:pPr>
       <w:r>
         <w:rPr>
@@ -3677,8 +3791,9 @@
     </w:p>
     <w:p>
       <w:pPr>
+        <w:wordWrap w:val="1"/>
+        <w:spacing w:after="20" w:line="240" w:lineRule="exact"/>
         <w:ind w:left="340" w:hanging="340"/>
-        <w:spacing w:after="20" w:line="240" w:lineRule="exact"/>
       </w:pPr>
       <w:r>
         <w:rPr>
@@ -3706,8 +3821,9 @@
     </w:p>
     <w:p>
       <w:pPr>
+        <w:wordWrap w:val="1"/>
+        <w:spacing w:after="20" w:line="240" w:lineRule="exact"/>
         <w:ind w:left="340" w:hanging="340"/>
-        <w:spacing w:after="20" w:line="240" w:lineRule="exact"/>
       </w:pPr>
       <w:r>
         <w:rPr>
@@ -3735,8 +3851,9 @@
     </w:p>
     <w:p>
       <w:pPr>
+        <w:wordWrap w:val="1"/>
+        <w:spacing w:after="20" w:line="240" w:lineRule="exact"/>
         <w:ind w:left="340" w:hanging="340"/>
-        <w:spacing w:after="20" w:line="240" w:lineRule="exact"/>
       </w:pPr>
       <w:r>
         <w:rPr>
@@ -3764,8 +3881,9 @@
     </w:p>
     <w:p>
       <w:pPr>
+        <w:wordWrap w:val="1"/>
+        <w:spacing w:after="20" w:line="240" w:lineRule="exact"/>
         <w:ind w:left="340" w:hanging="340"/>
-        <w:spacing w:after="20" w:line="240" w:lineRule="exact"/>
       </w:pPr>
       <w:r>
         <w:rPr>
@@ -3793,8 +3911,9 @@
     </w:p>
     <w:p>
       <w:pPr>
+        <w:wordWrap w:val="1"/>
+        <w:spacing w:after="20" w:line="240" w:lineRule="exact"/>
         <w:ind w:left="340" w:hanging="340"/>
-        <w:spacing w:after="20" w:line="240" w:lineRule="exact"/>
       </w:pPr>
       <w:r>
         <w:rPr>
@@ -3807,8 +3926,9 @@
     </w:p>
     <w:p>
       <w:pPr>
+        <w:wordWrap w:val="1"/>
+        <w:spacing w:after="20" w:line="240" w:lineRule="exact"/>
         <w:ind w:left="340" w:hanging="340"/>
-        <w:spacing w:after="20" w:line="240" w:lineRule="exact"/>
       </w:pPr>
       <w:r>
         <w:rPr>
@@ -3836,8 +3956,9 @@
     </w:p>
     <w:p>
       <w:pPr>
+        <w:wordWrap w:val="1"/>
+        <w:spacing w:after="20" w:line="240" w:lineRule="exact"/>
         <w:ind w:left="340" w:hanging="340"/>
-        <w:spacing w:after="20" w:line="240" w:lineRule="exact"/>
       </w:pPr>
       <w:r>
         <w:rPr>
@@ -4232,9 +4353,9 @@
     </w:rPrDefault>
     <w:pPrDefault>
       <w:pPr>
+        <w:widowControl w:val="0"/>
         <w:spacing/>
         <w:jc w:val="both"/>
-        <w:widowControl w:val="0"/>
       </w:pPr>
     </w:pPrDefault>
   </w:docDefaults>
@@ -4625,14 +4746,14 @@
     <w:basedOn w:val="para0"/>
     <w:next w:val="para0"/>
     <w:pPr>
-      <w:spacing/>
-      <w:jc w:val="center"/>
       <w:keepNext/>
-      <w:outlineLvl w:val="0"/>
       <w:tabs defTabSz="800">
         <w:tab w:val="left" w:pos="1260" w:leader="none"/>
         <w:tab w:val="left" w:pos="9180" w:leader="none"/>
       </w:tabs>
+      <w:spacing/>
+      <w:jc w:val="center"/>
+      <w:outlineLvl w:val="0"/>
     </w:pPr>
     <w:rPr>
       <w:rFonts w:ascii="½Å¸íÁ¶" w:hAnsi="½Å¸íÁ¶" w:cs="½Å¸íÁ¶"/>
@@ -4690,8 +4811,8 @@
     <w:qFormat/>
     <w:basedOn w:val="para0"/>
     <w:pPr>
+      <w:spacing w:before="60" w:after="60"/>
       <w:ind w:left="288" w:hanging="288"/>
-      <w:spacing w:before="60" w:after="60"/>
     </w:pPr>
     <w:rPr>
       <w:rFonts w:ascii="Times New Roman" w:hAnsi="Times New Roman" w:eastAsia="바탕체" w:cs="Times New Roman"/>
@@ -4702,11 +4823,11 @@
     <w:qFormat/>
     <w:basedOn w:val="para0"/>
     <w:pPr>
-      <w:ind w:left="340" w:hanging="340"/>
-      <w:spacing w:line="264" w:lineRule="auto"/>
       <w:tabs defTabSz="800">
         <w:tab w:val="left" w:pos="340" w:leader="none"/>
       </w:tabs>
+      <w:spacing w:line="264" w:lineRule="auto"/>
+      <w:ind w:left="340" w:hanging="340"/>
     </w:pPr>
     <w:rPr>
       <w:rFonts w:ascii="Times New Roman" w:hAnsi="Times New Roman" w:eastAsia="바탕체" w:cs="Times New Roman"/>
@@ -4719,9 +4840,9 @@
     <w:qFormat/>
     <w:basedOn w:val="para0"/>
     <w:pPr>
+      <w:widowControl/>
       <w:spacing w:before="100" w:after="100" w:beforeAutospacing="1" w:afterAutospacing="1"/>
       <w:jc w:val="left"/>
-      <w:widowControl/>
     </w:pPr>
     <w:rPr>
       <w:rFonts w:ascii="굴림" w:hAnsi="굴림" w:eastAsia="굴림" w:cs="굴림"/>

</xml_diff>

<commit_message>
paper: switch v2 to Batang; LibreOffice submission PDF
</commit_message>
<xml_diff>
--- a/paper/final/다알지_논문_v2.docx
+++ b/paper/final/다알지_논문_v2.docx
@@ -70,7 +70,7 @@
               <w:spacing w:line="276" w:lineRule="auto"/>
               <w:jc w:val="center"/>
               <w:rPr>
-                <w:rFonts w:ascii="함초롬돋움" w:hAnsi="함초롬돋움" w:eastAsia="함초롬돋움" w:cs="함초롬돋움"/>
+                <w:rFonts w:ascii="바탕" w:hAnsi="바탕" w:eastAsia="바탕" w:cs="바탕"/>
                 <w:b/>
                 <w:bCs/>
                 <w:sz w:val="32"/>
@@ -79,7 +79,7 @@
             </w:pPr>
             <w:r>
               <w:rPr>
-                <w:rFonts w:ascii="함초롬돋움" w:hAnsi="함초롬돋움" w:eastAsia="함초롬돋움" w:cs="함초롬돋움"/>
+                <w:rFonts w:ascii="바탕" w:hAnsi="바탕" w:eastAsia="바탕" w:cs="바탕"/>
                 <w:b/>
                 <w:bCs/>
                 <w:sz w:val="32"/>
@@ -97,7 +97,7 @@
               <w:spacing w:line="276" w:lineRule="auto"/>
               <w:jc w:val="center"/>
               <w:rPr>
-                <w:rFonts w:ascii="함초롬돋움" w:hAnsi="함초롬돋움" w:eastAsia="함초롬돋움" w:cs="함초롬돋움"/>
+                <w:rFonts w:ascii="바탕" w:hAnsi="바탕" w:eastAsia="바탕" w:cs="바탕"/>
                 <w:sz w:val="40"/>
                 <w:szCs w:val="40"/>
                 <w:vertAlign w:val="superscript"/>
@@ -105,7 +105,7 @@
             </w:pPr>
             <w:r>
               <w:rPr>
-                <w:rFonts w:ascii="함초롬돋움" w:hAnsi="함초롬돋움" w:eastAsia="함초롬돋움" w:cs="함초롬돋움" w:hint="eastAsia"/>
+                <w:rFonts w:ascii="바탕" w:hAnsi="바탕" w:eastAsia="바탕" w:cs="바탕"/>
                 <w:b/>
                 <w:bCs/>
                 <w:sz w:val="32"/>
@@ -117,7 +117,7 @@
             </w:r>
             <w:r>
               <w:rPr>
-                <w:rFonts w:ascii="함초롬돋움" w:hAnsi="함초롬돋움" w:eastAsia="함초롬돋움" w:cs="함초롬돋움"/>
+                <w:rFonts w:ascii="바탕" w:hAnsi="바탕" w:eastAsia="바탕" w:cs="바탕"/>
                 <w:sz w:val="40"/>
                 <w:szCs w:val="40"/>
                 <w:vertAlign w:val="superscript"/>
@@ -181,12 +181,12 @@
               <w:spacing w:line="276" w:lineRule="auto"/>
               <w:jc w:val="center"/>
               <w:rPr>
-                <w:rFonts w:ascii="함초롬돋움" w:hAnsi="함초롬돋움" w:eastAsia="함초롬돋움" w:cs="함초롬돋움"/>
-              </w:rPr>
-            </w:pPr>
-            <w:r>
-              <w:rPr>
-                <w:rFonts w:ascii="함초롬돋움" w:hAnsi="함초롬돋움" w:eastAsia="함초롬돋움" w:cs="함초롬돋움"/>
+                <w:rFonts w:ascii="바탕" w:hAnsi="바탕" w:eastAsia="바탕" w:cs="바탕"/>
+              </w:rPr>
+            </w:pPr>
+            <w:r>
+              <w:rPr>
+                <w:rFonts w:ascii="바탕" w:hAnsi="바탕" w:eastAsia="바탕" w:cs="바탕"/>
               </w:rPr>
             </w:r>
           </w:p>
@@ -199,12 +199,12 @@
               <w:spacing w:line="276" w:lineRule="auto"/>
               <w:jc w:val="center"/>
               <w:rPr>
-                <w:rFonts w:ascii="함초롬돋움" w:hAnsi="함초롬돋움" w:eastAsia="함초롬돋움" w:cs="함초롬돋움"/>
-              </w:rPr>
-            </w:pPr>
-            <w:r>
-              <w:rPr>
-                <w:rFonts w:ascii="함초롬돋움" w:hAnsi="함초롬돋움" w:eastAsia="함초롬돋움" w:cs="함초롬돋움"/>
+                <w:rFonts w:ascii="바탕" w:hAnsi="바탕" w:eastAsia="바탕" w:cs="바탕"/>
+              </w:rPr>
+            </w:pPr>
+            <w:r>
+              <w:rPr>
+                <w:rFonts w:ascii="바탕" w:hAnsi="바탕" w:eastAsia="바탕" w:cs="바탕"/>
               </w:rPr>
             </w:r>
           </w:p>
@@ -217,12 +217,12 @@
               <w:spacing w:line="276" w:lineRule="auto"/>
               <w:jc w:val="center"/>
               <w:rPr>
-                <w:rFonts w:ascii="함초롬돋움" w:hAnsi="함초롬돋움" w:eastAsia="함초롬돋움" w:cs="함초롬돋움"/>
-              </w:rPr>
-            </w:pPr>
-            <w:r>
-              <w:rPr>
-                <w:rFonts w:ascii="함초롬돋움" w:hAnsi="함초롬돋움" w:eastAsia="함초롬돋움" w:cs="함초롬돋움"/>
+                <w:rFonts w:ascii="바탕" w:hAnsi="바탕" w:eastAsia="바탕" w:cs="바탕"/>
+              </w:rPr>
+            </w:pPr>
+            <w:r>
+              <w:rPr>
+                <w:rFonts w:ascii="바탕" w:hAnsi="바탕" w:eastAsia="바탕" w:cs="바탕"/>
               </w:rPr>
             </w:r>
           </w:p>
@@ -280,7 +280,7 @@
               <w:spacing/>
               <w:jc w:val="center"/>
               <w:rPr>
-                <w:rFonts w:ascii="함초롬돋움" w:hAnsi="함초롬돋움" w:eastAsia="함초롬돋움" w:cs="함초롬돋움"/>
+                <w:rFonts w:ascii="바탕" w:hAnsi="바탕" w:eastAsia="바탕" w:cs="바탕"/>
                 <w:b/>
                 <w:sz w:val="28"/>
                 <w:szCs w:val="32"/>
@@ -288,7 +288,7 @@
             </w:pPr>
             <w:r>
               <w:rPr>
-                <w:rFonts w:ascii="함초롬돋움" w:hAnsi="함초롬돋움" w:eastAsia="함초롬돋움" w:cs="함초롬돋움" w:hint="eastAsia"/>
+                <w:rFonts w:ascii="바탕" w:hAnsi="바탕" w:eastAsia="바탕" w:cs="바탕"/>
                 <w:b/>
                 <w:sz w:val="28"/>
                 <w:szCs w:val="32"/>
@@ -299,7 +299,7 @@
             </w:r>
             <w:r>
               <w:rPr>
-                <w:rFonts w:ascii="함초롬돋움" w:hAnsi="함초롬돋움" w:eastAsia="함초롬돋움" w:cs="함초롬돋움"/>
+                <w:rFonts w:ascii="바탕" w:hAnsi="바탕" w:eastAsia="바탕" w:cs="바탕"/>
                 <w:b/>
                 <w:sz w:val="28"/>
                 <w:szCs w:val="32"/>
@@ -363,12 +363,12 @@
               <w:wordWrap w:val="1"/>
               <w:spacing w:line="276" w:lineRule="auto"/>
               <w:rPr>
-                <w:rFonts w:cs="Times New Roman"/>
-              </w:rPr>
-            </w:pPr>
-            <w:r>
-              <w:rPr>
-                <w:rFonts w:cs="Times New Roman"/>
+                <w:rFonts w:cs="바탕" w:ascii="바탕" w:hAnsi="바탕" w:eastAsia="바탕"/>
+              </w:rPr>
+            </w:pPr>
+            <w:r>
+              <w:rPr>
+                <w:rFonts w:cs="바탕" w:ascii="바탕" w:hAnsi="바탕" w:eastAsia="바탕"/>
               </w:rPr>
             </w:r>
           </w:p>
@@ -397,14 +397,14 @@
               <w:spacing w:line="276" w:lineRule="auto"/>
               <w:jc w:val="center"/>
               <w:rPr>
-                <w:rFonts w:ascii="함초롬돋움" w:hAnsi="함초롬돋움" w:eastAsia="함초롬돋움" w:cs="함초롬돋움"/>
+                <w:rFonts w:ascii="바탕" w:hAnsi="바탕" w:eastAsia="바탕" w:cs="바탕"/>
                 <w:b/>
                 <w:bCs/>
               </w:rPr>
             </w:pPr>
             <w:r>
               <w:rPr>
-                <w:rFonts w:ascii="함초롬돋움" w:hAnsi="함초롬돋움" w:eastAsia="함초롬돋움" w:cs="함초롬돋움" w:hint="eastAsia"/>
+                <w:rFonts w:ascii="바탕" w:hAnsi="바탕" w:eastAsia="바탕" w:cs="바탕"/>
                 <w:b/>
                 <w:bCs/>
               </w:rPr>
@@ -412,7 +412,7 @@
             </w:r>
             <w:r>
               <w:rPr>
-                <w:rFonts w:ascii="함초롬돋움" w:hAnsi="함초롬돋움" w:eastAsia="함초롬돋움" w:cs="함초롬돋움"/>
+                <w:rFonts w:ascii="바탕" w:hAnsi="바탕" w:eastAsia="바탕" w:cs="바탕"/>
                 <w:b/>
                 <w:bCs/>
               </w:rPr>
@@ -420,7 +420,7 @@
             </w:r>
             <w:r>
               <w:rPr>
-                <w:rFonts w:ascii="함초롬돋움" w:hAnsi="함초롬돋움" w:eastAsia="함초롬돋움" w:cs="함초롬돋움" w:hint="eastAsia"/>
+                <w:rFonts w:ascii="바탕" w:hAnsi="바탕" w:eastAsia="바탕" w:cs="바탕"/>
                 <w:b/>
                 <w:bCs/>
               </w:rPr>
@@ -428,7 +428,7 @@
             </w:r>
             <w:r>
               <w:rPr>
-                <w:rFonts w:ascii="함초롬돋움" w:hAnsi="함초롬돋움" w:eastAsia="함초롬돋움" w:cs="함초롬돋움"/>
+                <w:rFonts w:ascii="바탕" w:hAnsi="바탕" w:eastAsia="바탕" w:cs="바탕"/>
                 <w:b/>
                 <w:bCs/>
               </w:rPr>
@@ -440,14 +440,14 @@
               <w:spacing w:line="276" w:lineRule="auto"/>
               <w:ind w:firstLine="97"/>
               <w:rPr>
-                <w:rFonts w:ascii="함초롬돋움" w:hAnsi="함초롬돋움" w:eastAsia="함초롬돋움" w:cs="함초롬돋움"/>
+                <w:rFonts w:ascii="바탕" w:hAnsi="바탕" w:eastAsia="바탕" w:cs="바탕"/>
                 <w:sz w:val="18"/>
                 <w:szCs w:val="18"/>
               </w:rPr>
             </w:pPr>
             <w:r>
               <w:rPr>
-                <w:rFonts w:ascii="함초롬돋움" w:hAnsi="함초롬돋움" w:eastAsia="함초롬돋움" w:cs="함초롬돋움"/>
+                <w:rFonts w:ascii="바탕" w:hAnsi="바탕" w:eastAsia="바탕" w:cs="바탕"/>
                 <w:sz w:val="18"/>
                 <w:szCs w:val="18"/>
               </w:rPr>
@@ -460,14 +460,14 @@
               <w:spacing w:line="276" w:lineRule="auto"/>
               <w:ind w:firstLine="90"/>
               <w:rPr>
-                <w:rFonts w:ascii="굴림" w:hAnsi="굴림" w:eastAsia="굴림" w:cs="굴림"/>
+                <w:rFonts w:ascii="바탕" w:hAnsi="바탕" w:eastAsia="바탕" w:cs="바탕"/>
                 <w:sz w:val="18"/>
                 <w:szCs w:val="18"/>
               </w:rPr>
             </w:pPr>
             <w:r>
               <w:rPr>
-                <w:rFonts w:ascii="굴림" w:hAnsi="굴림" w:eastAsia="굴림" w:cs="굴림"/>
+                <w:rFonts w:ascii="바탕" w:hAnsi="바탕" w:eastAsia="바탕" w:cs="바탕"/>
                 <w:sz w:val="18"/>
                 <w:szCs w:val="18"/>
               </w:rPr>
@@ -514,7 +514,7 @@
       </w:pPr>
       <w:r>
         <w:rPr>
-          <w:rFonts w:ascii="함초롬돋움" w:hAnsi="함초롬돋움" w:eastAsia="함초롬돋움" w:cs="함초롬돋움"/>
+          <w:rFonts w:ascii="바탕" w:hAnsi="바탕" w:eastAsia="바탕" w:cs="바탕"/>
           <w:b/>
         </w:rPr>
         <w:t>1. 서론 및 관련 연구</w:t>
@@ -529,7 +529,7 @@
       </w:pPr>
       <w:r>
         <w:rPr>
-          <w:rFonts w:ascii="함초롬돋움" w:hAnsi="함초롬돋움" w:eastAsia="함초롬돋움" w:cs="함초롬돋움"/>
+          <w:rFonts w:ascii="바탕" w:hAnsi="바탕" w:eastAsia="바탕" w:cs="바탕"/>
           <w:sz w:val="18"/>
         </w:rPr>
         <w:t>기관사와 관제원이 설비 고장 대응 절차를 확인하려면 현장 길라잡이의 구체적인 조치와 규정의 보고·운전 조건을 함께 찾아야 한다. 본 연구는 이러한 근거를 챗봇으로 찾을 때, 관리자가 등록한 문서 간 링크가 검색에 얼마나 도움이 되는지를 다룬다.</w:t>
@@ -542,20 +542,20 @@
         <w:spacing w:line="300" w:lineRule="exact"/>
         <w:ind w:firstLine="180"/>
         <w:rPr>
-          <w:rFonts w:ascii="함초롬돋움" w:hAnsi="함초롬돋움" w:eastAsia="함초롬돋움" w:cs="함초롬돋움"/>
+          <w:rFonts w:ascii="바탕" w:hAnsi="바탕" w:eastAsia="바탕" w:cs="바탕"/>
           <w:sz w:val="18"/>
         </w:rPr>
       </w:pPr>
       <w:r>
         <w:rPr>
-          <w:rFonts w:ascii="함초롬돋움" w:hAnsi="함초롬돋움" w:eastAsia="함초롬돋움" w:cs="함초롬돋움"/>
+          <w:rFonts w:ascii="바탕" w:hAnsi="바탕" w:eastAsia="바탕" w:cs="바탕"/>
           <w:sz w:val="18"/>
         </w:rPr>
         <w:t>검색 증강 생성(RAG)은 외부 문서에서 찾은 근거로 답변을 만들며[1], 최근에는 LLM으로 검색 후보의 순위를 다시 매기는 방식도 널리 쓰인다[2]. 문서 간 관계를 검색에 반영하려는 연구도 이어지고 있다. GraphRAG와 LightRAG는 문서에서 관계 그래프를 자동으로 구축하고[3,4], KG²RAG는 처음 찾은 청크에서 지식그래프를 따라 주변 청크로 검색 범위를 넓힌다[5]. 철도 분야에서는 공간 지식그래프를 탐색하는 CARAG와 출입문 고장 이력을 활용하는 도시철도 RAG가 제안되었고[6,7], 법률 분야에서도 근거 검색 평가셋과 한국어 하이브리드 검색 연구가 나왔다[8,9]. 다만 이들 방법은 문서 간 관계를 모델이 추출하거나 별도로 구축한 지식그래프에 의존한다. 본 시스템에서는 관리자가 규정과 길라잡이의 대응 구간을 직접 연결해 둔다. 본 연구는 새로운 그래프 알고리즘을 제안하기보다, 이렇게 사람이 등록한 링크로 검색을 확장했을 때 필요한 근거를 얼마나 더 찾을 수 있는지 살펴본다.</w:t>
       </w:r>
       <w:r>
         <w:rPr>
-          <w:rFonts w:ascii="함초롬돋움" w:hAnsi="함초롬돋움" w:eastAsia="함초롬돋움" w:cs="함초롬돋움"/>
+          <w:rFonts w:ascii="바탕" w:hAnsi="바탕" w:eastAsia="바탕" w:cs="바탕"/>
           <w:sz w:val="18"/>
         </w:rPr>
       </w:r>
@@ -576,7 +576,7 @@
       </w:pPr>
       <w:r>
         <w:rPr>
-          <w:rFonts w:ascii="함초롬돋움" w:hAnsi="함초롬돋움" w:eastAsia="함초롬돋움" w:cs="함초롬돋움"/>
+          <w:rFonts w:ascii="바탕" w:hAnsi="바탕" w:eastAsia="바탕" w:cs="바탕"/>
           <w:b/>
         </w:rPr>
         <w:t>2. 방법</w:t>
@@ -591,7 +591,7 @@
       </w:pPr>
       <w:r>
         <w:rPr>
-          <w:rFonts w:ascii="함초롬돋움" w:hAnsi="함초롬돋움" w:eastAsia="함초롬돋움" w:cs="함초롬돋움"/>
+          <w:rFonts w:ascii="바탕" w:hAnsi="바탕" w:eastAsia="바탕" w:cs="바탕"/>
           <w:sz w:val="18"/>
         </w:rPr>
         <w:t>비교에는 일곱 가지 검색 방식을 사용했다. 기준선인 BM25와 Dense는 각각 어휘 일치와 임베딩 유사도로 문서 구간을 찾고, Hybrid는 두 점수를 0.6(Dense)과 0.4(BM25)의 가중치로 합친다. H+RR은 Hybrid로 찾은 상위 20개 후보를 LLM에 보여 주고, 질문에 직접 답하는 근거를 최대 5개까지 고르게 한 방식이다.</w:t>
@@ -606,7 +606,7 @@
       </w:pPr>
       <w:r>
         <w:rPr>
-          <w:rFonts w:ascii="함초롬돋움" w:hAnsi="함초롬돋움" w:eastAsia="함초롬돋움" w:cs="함초롬돋움"/>
+          <w:rFonts w:ascii="바탕" w:hAnsi="바탕" w:eastAsia="바탕" w:cs="바탕"/>
           <w:sz w:val="18"/>
         </w:rPr>
         <w:t>link_all과 proposed는 H+RR이 고른 직접 근거를 그대로 두고, 여기에 승인 링크로 연결된 문서 구간을 최대 2단계까지 따라가 덧붙인다(그림 1). 두 방식은 연결 구간을 다루는 방법이 다르다. link_all은 연결된 구간을 모두 붙이되 전체 근거가 15개를 넘지 않도록 자르고, proposed는 연결 구간만 질문과의 관련성에 따라 다시 순위를 매겨 최대 10개를 고른다. H+RR은 LLM이 근거를 적게 고르는 경우가 많아 질의당 평균 근거 수가 링크 방식보다 적다. 근거 개수의 차이만으로 결과가 달라지는지 확인하기 위해, 선택된 근거가 3개보다 적으면 Hybrid 순위에서 모자란 만큼 채우는 K3를 함께 비교했다.</w:t>
@@ -685,7 +685,7 @@
       </w:pPr>
       <w:r>
         <w:rPr>
-          <w:rFonts w:ascii="함초롬돋움" w:hAnsi="함초롬돋움" w:eastAsia="함초롬돋움" w:cs="함초롬돋움"/>
+          <w:rFonts w:ascii="바탕" w:hAnsi="바탕" w:eastAsia="바탕" w:cs="바탕"/>
           <w:sz w:val="18"/>
           <w:szCs w:val="18"/>
         </w:rPr>
@@ -693,7 +693,7 @@
       </w:r>
       <w:r>
         <w:rPr>
-          <w:rFonts w:ascii="함초롬돋움" w:hAnsi="함초롬돋움" w:eastAsia="함초롬돋움" w:cs="함초롬돋움" w:hint="eastAsia"/>
+          <w:rFonts w:ascii="바탕" w:hAnsi="바탕" w:eastAsia="바탕" w:cs="바탕"/>
           <w:sz w:val="18"/>
           <w:szCs w:val="18"/>
         </w:rPr>
@@ -702,7 +702,7 @@
       </w:r>
       <w:r>
         <w:rPr>
-          <w:rFonts w:ascii="함초롬돋움" w:hAnsi="함초롬돋움" w:eastAsia="함초롬돋움" w:cs="함초롬돋움"/>
+          <w:rFonts w:ascii="바탕" w:hAnsi="바탕" w:eastAsia="바탕" w:cs="바탕"/>
           <w:sz w:val="18"/>
           <w:szCs w:val="18"/>
         </w:rPr>
@@ -731,7 +731,7 @@
       </w:pPr>
       <w:r>
         <w:rPr>
-          <w:rFonts w:ascii="함초롬돋움" w:hAnsi="함초롬돋움" w:eastAsia="함초롬돋움" w:cs="함초롬돋움"/>
+          <w:rFonts w:ascii="바탕" w:hAnsi="바탕" w:eastAsia="바탕" w:cs="바탕"/>
           <w:b/>
         </w:rPr>
         <w:t>3. 평가 및 결과</w:t>
@@ -746,7 +746,7 @@
       </w:pPr>
       <w:r>
         <w:rPr>
-          <w:rFonts w:ascii="함초롬돋움" w:hAnsi="함초롬돋움" w:eastAsia="함초롬돋움" w:cs="함초롬돋움"/>
+          <w:rFonts w:ascii="바탕" w:hAnsi="바탕" w:eastAsia="바탕" w:cs="바탕"/>
           <w:sz w:val="18"/>
         </w:rPr>
         <w:t>평가에는 질의 37건을 사용했다. 기존 사례 17건은 시스템 개발 과정에서 만든 질의이고(문서형 12건, 그래프형 5건), 나머지 20건은 LLM으로 초안을 작성한 신규 질의다(문서형 5건, 그래프형 15건). 문서형은 한 문서 안에서 답을 찾을 수 있는 질의이고, 그래프형은 링크로 연결된 다른 문서의 구간까지 봐야 답할 수 있는 질의다. 신규 그래프형 15건은 승인 링크 하나를 정한 뒤 그 양쪽 원문을 바탕으로 만들었다. 링크로 연결된 구간 가운데 정답에 해당하는 구간은 따로 '링크 정답 근거'로 표시했다. 신규 20건은 철도 운영기관의 현업 전문가 1인이 체크리스트로 검토했다. 질문이 현실적인지, 정답 근거와 참조 답변이 정확한지, 링크가 실제로 필요한지를 확인했으며, 모두 적합 판정을 받아 고치거나 뺀 사례는 없었다. 링크의 효과를 보려는 것이므로 결과는 그래프형 20건을 중심으로 보고한다.</w:t>
@@ -761,7 +761,7 @@
       </w:pPr>
       <w:r>
         <w:rPr>
-          <w:rFonts w:ascii="함초롬돋움" w:hAnsi="함초롬돋움" w:eastAsia="함초롬돋움" w:cs="함초롬돋움"/>
+          <w:rFonts w:ascii="바탕" w:hAnsi="바탕" w:eastAsia="바탕" w:cs="바탕"/>
           <w:sz w:val="18"/>
         </w:rPr>
         <w:t>일곱 가지 방식으로 37건을 각각 세 번씩 검색했고, 검색 지표는 세 번의 평균으로 보고한다. 답변은 gpt-5.6-luna로 생성했고, 같은 모델을 평가자로 쓰는 RAGAS[10]로 채점했다. 임베딩은 text-embedding-3-small(검색)과 text-embedding-3-large(평가)를 썼다. 실험에 쓴 승인 링크는 36개이며, 재현을 위해 평가 시점의 링크 목록과 해시를 따로 보관했다.</w:t>
@@ -776,7 +776,7 @@
       </w:pPr>
       <w:r>
         <w:rPr>
-          <w:rFonts w:ascii="함초롬돋움" w:hAnsi="함초롬돋움" w:eastAsia="함초롬돋움" w:cs="함초롬돋움"/>
+          <w:rFonts w:ascii="바탕" w:hAnsi="바탕" w:eastAsia="바탕" w:cs="바탕"/>
           <w:sz w:val="18"/>
         </w:rPr>
         <w:t>그래프형 질의 20건의 검색 결과를 표 1에 정리했다. 링크를 쓰지 않는 방식 가운데서는 K3의 Recall이 0.618로 가장 높았고, 링크로 확장한 link_all과 proposed는 각각 0.850과 0.839였다. 링크 정답 근거만 보면 차이가 더 커서, K3는 0.225에 그친 반면 link_all은 0.750이었다. 출처별로 나눈 표 2에서도 link_all의 Recall은 K3보다 기존 사례에서 0.128, 신규 사례에서 0.267 높았다.</w:t>
@@ -796,7 +796,7 @@
       </w:pPr>
       <w:r>
         <w:rPr>
-          <w:rFonts w:ascii="함초롬돋움" w:hAnsi="함초롬돋움" w:eastAsia="함초롬돋움" w:cs="함초롬돋움"/>
+          <w:rFonts w:ascii="바탕" w:hAnsi="바탕" w:eastAsia="바탕" w:cs="바탕"/>
           <w:sz w:val="18"/>
           <w:szCs w:val="18"/>
         </w:rPr>
@@ -854,7 +854,7 @@
             </w:pPr>
             <w:r>
               <w:rPr>
-                <w:rFonts w:ascii="함초롬돋움" w:hAnsi="함초롬돋움" w:eastAsia="함초롬돋움" w:cs="함초롬돋움"/>
+                <w:rFonts w:ascii="바탕" w:hAnsi="바탕" w:eastAsia="바탕" w:cs="바탕"/>
                 <w:b/>
                 <w:sz w:val="18"/>
               </w:rPr>
@@ -888,7 +888,7 @@
             </w:pPr>
             <w:r>
               <w:rPr>
-                <w:rFonts w:ascii="함초롬돋움" w:hAnsi="함초롬돋움" w:eastAsia="함초롬돋움" w:cs="함초롬돋움"/>
+                <w:rFonts w:ascii="바탕" w:hAnsi="바탕" w:eastAsia="바탕" w:cs="바탕"/>
                 <w:b/>
                 <w:sz w:val="18"/>
               </w:rPr>
@@ -922,7 +922,7 @@
             </w:pPr>
             <w:r>
               <w:rPr>
-                <w:rFonts w:ascii="함초롬돋움" w:hAnsi="함초롬돋움" w:eastAsia="함초롬돋움" w:cs="함초롬돋움"/>
+                <w:rFonts w:ascii="바탕" w:hAnsi="바탕" w:eastAsia="바탕" w:cs="바탕"/>
                 <w:b/>
                 <w:sz w:val="18"/>
               </w:rPr>
@@ -933,7 +933,7 @@
             </w:r>
             <w:r>
               <w:rPr>
-                <w:rFonts w:ascii="함초롬돋움" w:hAnsi="함초롬돋움" w:eastAsia="함초롬돋움" w:cs="함초롬돋움"/>
+                <w:rFonts w:ascii="바탕" w:hAnsi="바탕" w:eastAsia="바탕" w:cs="바탕"/>
                 <w:b/>
                 <w:sz w:val="18"/>
               </w:rPr>
@@ -967,7 +967,7 @@
             </w:pPr>
             <w:r>
               <w:rPr>
-                <w:rFonts w:ascii="함초롬돋움" w:hAnsi="함초롬돋움" w:eastAsia="함초롬돋움" w:cs="함초롬돋움"/>
+                <w:rFonts w:ascii="바탕" w:hAnsi="바탕" w:eastAsia="바탕" w:cs="바탕"/>
                 <w:b/>
                 <w:sz w:val="18"/>
               </w:rPr>
@@ -978,7 +978,7 @@
             </w:r>
             <w:r>
               <w:rPr>
-                <w:rFonts w:ascii="함초롬돋움" w:hAnsi="함초롬돋움" w:eastAsia="함초롬돋움" w:cs="함초롬돋움"/>
+                <w:rFonts w:ascii="바탕" w:hAnsi="바탕" w:eastAsia="바탕" w:cs="바탕"/>
                 <w:b/>
                 <w:sz w:val="18"/>
               </w:rPr>
@@ -1019,7 +1019,7 @@
             </w:pPr>
             <w:r>
               <w:rPr>
-                <w:rFonts w:ascii="함초롬돋움" w:hAnsi="함초롬돋움" w:eastAsia="함초롬돋움" w:cs="함초롬돋움"/>
+                <w:rFonts w:ascii="바탕" w:hAnsi="바탕" w:eastAsia="바탕" w:cs="바탕"/>
                 <w:sz w:val="18"/>
               </w:rPr>
               <w:t>BM25</w:t>
@@ -1052,7 +1052,7 @@
             </w:pPr>
             <w:r>
               <w:rPr>
-                <w:rFonts w:ascii="함초롬돋움" w:hAnsi="함초롬돋움" w:eastAsia="함초롬돋움" w:cs="함초롬돋움"/>
+                <w:rFonts w:ascii="바탕" w:hAnsi="바탕" w:eastAsia="바탕" w:cs="바탕"/>
                 <w:sz w:val="18"/>
               </w:rPr>
               <w:t>0.592±.000</w:t>
@@ -1085,7 +1085,7 @@
             </w:pPr>
             <w:r>
               <w:rPr>
-                <w:rFonts w:ascii="함초롬돋움" w:hAnsi="함초롬돋움" w:eastAsia="함초롬돋움" w:cs="함초롬돋움"/>
+                <w:rFonts w:ascii="바탕" w:hAnsi="바탕" w:eastAsia="바탕" w:cs="바탕"/>
                 <w:sz w:val="18"/>
               </w:rPr>
               <w:t>0.275±.000</w:t>
@@ -1118,7 +1118,7 @@
             </w:pPr>
             <w:r>
               <w:rPr>
-                <w:rFonts w:ascii="함초롬돋움" w:hAnsi="함초롬돋움" w:eastAsia="함초롬돋움" w:cs="함초롬돋움"/>
+                <w:rFonts w:ascii="바탕" w:hAnsi="바탕" w:eastAsia="바탕" w:cs="바탕"/>
                 <w:sz w:val="18"/>
               </w:rPr>
               <w:t>5.00±.00</w:t>
@@ -1158,7 +1158,7 @@
             </w:pPr>
             <w:r>
               <w:rPr>
-                <w:rFonts w:ascii="함초롬돋움" w:hAnsi="함초롬돋움" w:eastAsia="함초롬돋움" w:cs="함초롬돋움"/>
+                <w:rFonts w:ascii="바탕" w:hAnsi="바탕" w:eastAsia="바탕" w:cs="바탕"/>
                 <w:sz w:val="18"/>
               </w:rPr>
               <w:t>Dense</w:t>
@@ -1191,7 +1191,7 @@
             </w:pPr>
             <w:r>
               <w:rPr>
-                <w:rFonts w:ascii="함초롬돋움" w:hAnsi="함초롬돋움" w:eastAsia="함초롬돋움" w:cs="함초롬돋움"/>
+                <w:rFonts w:ascii="바탕" w:hAnsi="바탕" w:eastAsia="바탕" w:cs="바탕"/>
                 <w:sz w:val="18"/>
               </w:rPr>
               <w:t>0.383±.000</w:t>
@@ -1224,7 +1224,7 @@
             </w:pPr>
             <w:r>
               <w:rPr>
-                <w:rFonts w:ascii="함초롬돋움" w:hAnsi="함초롬돋움" w:eastAsia="함초롬돋움" w:cs="함초롬돋움"/>
+                <w:rFonts w:ascii="바탕" w:hAnsi="바탕" w:eastAsia="바탕" w:cs="바탕"/>
                 <w:sz w:val="18"/>
               </w:rPr>
               <w:t>0.000±.000</w:t>
@@ -1257,7 +1257,7 @@
             </w:pPr>
             <w:r>
               <w:rPr>
-                <w:rFonts w:ascii="함초롬돋움" w:hAnsi="함초롬돋움" w:eastAsia="함초롬돋움" w:cs="함초롬돋움"/>
+                <w:rFonts w:ascii="바탕" w:hAnsi="바탕" w:eastAsia="바탕" w:cs="바탕"/>
                 <w:sz w:val="18"/>
               </w:rPr>
               <w:t>5.00±.00</w:t>
@@ -1297,7 +1297,7 @@
             </w:pPr>
             <w:r>
               <w:rPr>
-                <w:rFonts w:ascii="함초롬돋움" w:hAnsi="함초롬돋움" w:eastAsia="함초롬돋움" w:cs="함초롬돋움"/>
+                <w:rFonts w:ascii="바탕" w:hAnsi="바탕" w:eastAsia="바탕" w:cs="바탕"/>
                 <w:sz w:val="18"/>
               </w:rPr>
               <w:t>Hybrid</w:t>
@@ -1330,7 +1330,7 @@
             </w:pPr>
             <w:r>
               <w:rPr>
-                <w:rFonts w:ascii="함초롬돋움" w:hAnsi="함초롬돋움" w:eastAsia="함초롬돋움" w:cs="함초롬돋움"/>
+                <w:rFonts w:ascii="바탕" w:hAnsi="바탕" w:eastAsia="바탕" w:cs="바탕"/>
                 <w:sz w:val="18"/>
               </w:rPr>
               <w:t>0.521±.000</w:t>
@@ -1363,7 +1363,7 @@
             </w:pPr>
             <w:r>
               <w:rPr>
-                <w:rFonts w:ascii="함초롬돋움" w:hAnsi="함초롬돋움" w:eastAsia="함초롬돋움" w:cs="함초롬돋움"/>
+                <w:rFonts w:ascii="바탕" w:hAnsi="바탕" w:eastAsia="바탕" w:cs="바탕"/>
                 <w:sz w:val="18"/>
               </w:rPr>
               <w:t>0.150±.000</w:t>
@@ -1396,7 +1396,7 @@
             </w:pPr>
             <w:r>
               <w:rPr>
-                <w:rFonts w:ascii="함초롬돋움" w:hAnsi="함초롬돋움" w:eastAsia="함초롬돋움" w:cs="함초롬돋움"/>
+                <w:rFonts w:ascii="바탕" w:hAnsi="바탕" w:eastAsia="바탕" w:cs="바탕"/>
                 <w:sz w:val="18"/>
               </w:rPr>
               <w:t>5.00±.00</w:t>
@@ -1436,7 +1436,7 @@
             </w:pPr>
             <w:r>
               <w:rPr>
-                <w:rFonts w:ascii="함초롬돋움" w:hAnsi="함초롬돋움" w:eastAsia="함초롬돋움" w:cs="함초롬돋움"/>
+                <w:rFonts w:ascii="바탕" w:hAnsi="바탕" w:eastAsia="바탕" w:cs="바탕"/>
                 <w:sz w:val="18"/>
               </w:rPr>
               <w:t>H+RR</w:t>
@@ -1469,7 +1469,7 @@
             </w:pPr>
             <w:r>
               <w:rPr>
-                <w:rFonts w:ascii="함초롬돋움" w:hAnsi="함초롬돋움" w:eastAsia="함초롬돋움" w:cs="함초롬돋움"/>
+                <w:rFonts w:ascii="바탕" w:hAnsi="바탕" w:eastAsia="바탕" w:cs="바탕"/>
                 <w:sz w:val="18"/>
               </w:rPr>
               <w:t>0.586±.019</w:t>
@@ -1502,7 +1502,7 @@
             </w:pPr>
             <w:r>
               <w:rPr>
-                <w:rFonts w:ascii="함초롬돋움" w:hAnsi="함초롬돋움" w:eastAsia="함초롬돋움" w:cs="함초롬돋움"/>
+                <w:rFonts w:ascii="바탕" w:hAnsi="바탕" w:eastAsia="바탕" w:cs="바탕"/>
                 <w:sz w:val="18"/>
               </w:rPr>
               <w:t>0.233±.014</w:t>
@@ -1535,7 +1535,7 @@
             </w:pPr>
             <w:r>
               <w:rPr>
-                <w:rFonts w:ascii="함초롬돋움" w:hAnsi="함초롬돋움" w:eastAsia="함초롬돋움" w:cs="함초롬돋움"/>
+                <w:rFonts w:ascii="바탕" w:hAnsi="바탕" w:eastAsia="바탕" w:cs="바탕"/>
                 <w:sz w:val="18"/>
               </w:rPr>
               <w:t>2.08±.06</w:t>
@@ -1575,7 +1575,7 @@
             </w:pPr>
             <w:r>
               <w:rPr>
-                <w:rFonts w:ascii="함초롬돋움" w:hAnsi="함초롬돋움" w:eastAsia="함초롬돋움" w:cs="함초롬돋움"/>
+                <w:rFonts w:ascii="바탕" w:hAnsi="바탕" w:eastAsia="바탕" w:cs="바탕"/>
                 <w:sz w:val="18"/>
               </w:rPr>
               <w:t>K3</w:t>
@@ -1608,7 +1608,7 @@
             </w:pPr>
             <w:r>
               <w:rPr>
-                <w:rFonts w:ascii="함초롬돋움" w:hAnsi="함초롬돋움" w:eastAsia="함초롬돋움" w:cs="함초롬돋움"/>
+                <w:rFonts w:ascii="바탕" w:hAnsi="바탕" w:eastAsia="바탕" w:cs="바탕"/>
                 <w:sz w:val="18"/>
               </w:rPr>
               <w:t>0.618±.017</w:t>
@@ -1641,7 +1641,7 @@
             </w:pPr>
             <w:r>
               <w:rPr>
-                <w:rFonts w:ascii="함초롬돋움" w:hAnsi="함초롬돋움" w:eastAsia="함초롬돋움" w:cs="함초롬돋움"/>
+                <w:rFonts w:ascii="바탕" w:hAnsi="바탕" w:eastAsia="바탕" w:cs="바탕"/>
                 <w:sz w:val="18"/>
               </w:rPr>
               <w:t>0.225±.043</w:t>
@@ -1674,7 +1674,7 @@
             </w:pPr>
             <w:r>
               <w:rPr>
-                <w:rFonts w:ascii="함초롬돋움" w:hAnsi="함초롬돋움" w:eastAsia="함초롬돋움" w:cs="함초롬돋움"/>
+                <w:rFonts w:ascii="바탕" w:hAnsi="바탕" w:eastAsia="바탕" w:cs="바탕"/>
                 <w:sz w:val="18"/>
               </w:rPr>
               <w:t>3.15±.05</w:t>
@@ -1714,7 +1714,7 @@
             </w:pPr>
             <w:r>
               <w:rPr>
-                <w:rFonts w:ascii="함초롬돋움" w:hAnsi="함초롬돋움" w:eastAsia="함초롬돋움" w:cs="함초롬돋움"/>
+                <w:rFonts w:ascii="바탕" w:hAnsi="바탕" w:eastAsia="바탕" w:cs="바탕"/>
                 <w:sz w:val="18"/>
               </w:rPr>
               <w:t>link_all</w:t>
@@ -1747,7 +1747,7 @@
             </w:pPr>
             <w:r>
               <w:rPr>
-                <w:rFonts w:ascii="함초롬돋움" w:hAnsi="함초롬돋움" w:eastAsia="함초롬돋움" w:cs="함초롬돋움"/>
+                <w:rFonts w:ascii="바탕" w:hAnsi="바탕" w:eastAsia="바탕" w:cs="바탕"/>
                 <w:sz w:val="18"/>
               </w:rPr>
               <w:t>0.850±.014</w:t>
@@ -1780,7 +1780,7 @@
             </w:pPr>
             <w:r>
               <w:rPr>
-                <w:rFonts w:ascii="함초롬돋움" w:hAnsi="함초롬돋움" w:eastAsia="함초롬돋움" w:cs="함초롬돋움"/>
+                <w:rFonts w:ascii="바탕" w:hAnsi="바탕" w:eastAsia="바탕" w:cs="바탕"/>
                 <w:sz w:val="18"/>
               </w:rPr>
               <w:t>0.750±.000</w:t>
@@ -1813,7 +1813,7 @@
             </w:pPr>
             <w:r>
               <w:rPr>
-                <w:rFonts w:ascii="함초롬돋움" w:hAnsi="함초롬돋움" w:eastAsia="함초롬돋움" w:cs="함초롬돋움"/>
+                <w:rFonts w:ascii="바탕" w:hAnsi="바탕" w:eastAsia="바탕" w:cs="바탕"/>
                 <w:sz w:val="18"/>
               </w:rPr>
               <w:t>3.08±.03</w:t>
@@ -1853,7 +1853,7 @@
             </w:pPr>
             <w:r>
               <w:rPr>
-                <w:rFonts w:ascii="함초롬돋움" w:hAnsi="함초롬돋움" w:eastAsia="함초롬돋움" w:cs="함초롬돋움"/>
+                <w:rFonts w:ascii="바탕" w:hAnsi="바탕" w:eastAsia="바탕" w:cs="바탕"/>
                 <w:sz w:val="18"/>
               </w:rPr>
               <w:t>proposed</w:t>
@@ -1886,7 +1886,7 @@
             </w:pPr>
             <w:r>
               <w:rPr>
-                <w:rFonts w:ascii="함초롬돋움" w:hAnsi="함초롬돋움" w:eastAsia="함초롬돋움" w:cs="함초롬돋움"/>
+                <w:rFonts w:ascii="바탕" w:hAnsi="바탕" w:eastAsia="바탕" w:cs="바탕"/>
                 <w:sz w:val="18"/>
               </w:rPr>
               <w:t>0.839±.046</w:t>
@@ -1919,7 +1919,7 @@
             </w:pPr>
             <w:r>
               <w:rPr>
-                <w:rFonts w:ascii="함초롬돋움" w:hAnsi="함초롬돋움" w:eastAsia="함초롬돋움" w:cs="함초롬돋움"/>
+                <w:rFonts w:ascii="바탕" w:hAnsi="바탕" w:eastAsia="바탕" w:cs="바탕"/>
                 <w:sz w:val="18"/>
               </w:rPr>
               <w:t>0.708±.063</w:t>
@@ -1952,7 +1952,7 @@
             </w:pPr>
             <w:r>
               <w:rPr>
-                <w:rFonts w:ascii="함초롬돋움" w:hAnsi="함초롬돋움" w:eastAsia="함초롬돋움" w:cs="함초롬돋움"/>
+                <w:rFonts w:ascii="바탕" w:hAnsi="바탕" w:eastAsia="바탕" w:cs="바탕"/>
                 <w:sz w:val="18"/>
               </w:rPr>
               <w:t>3.00±.17</w:t>
@@ -1982,7 +1982,7 @@
       </w:pPr>
       <w:r>
         <w:rPr>
-          <w:rFonts w:ascii="함초롬돋움" w:hAnsi="함초롬돋움" w:eastAsia="함초롬돋움" w:cs="함초롬돋움"/>
+          <w:rFonts w:ascii="바탕" w:hAnsi="바탕" w:eastAsia="바탕" w:cs="바탕"/>
           <w:sz w:val="18"/>
           <w:szCs w:val="18"/>
         </w:rPr>
@@ -2045,7 +2045,7 @@
             </w:pPr>
             <w:r>
               <w:rPr>
-                <w:rFonts w:ascii="함초롬돋움" w:hAnsi="함초롬돋움" w:eastAsia="함초롬돋움" w:cs="함초롬돋움"/>
+                <w:rFonts w:ascii="바탕" w:hAnsi="바탕" w:eastAsia="바탕" w:cs="바탕"/>
                 <w:b/>
                 <w:sz w:val="18"/>
               </w:rPr>
@@ -2079,7 +2079,7 @@
             </w:pPr>
             <w:r>
               <w:rPr>
-                <w:rFonts w:ascii="함초롬돋움" w:hAnsi="함초롬돋움" w:eastAsia="함초롬돋움" w:cs="함초롬돋움"/>
+                <w:rFonts w:ascii="바탕" w:hAnsi="바탕" w:eastAsia="바탕" w:cs="바탕"/>
                 <w:b/>
                 <w:sz w:val="18"/>
               </w:rPr>
@@ -2113,7 +2113,7 @@
             </w:pPr>
             <w:r>
               <w:rPr>
-                <w:rFonts w:ascii="함초롬돋움" w:hAnsi="함초롬돋움" w:eastAsia="함초롬돋움" w:cs="함초롬돋움"/>
+                <w:rFonts w:ascii="바탕" w:hAnsi="바탕" w:eastAsia="바탕" w:cs="바탕"/>
                 <w:b/>
                 <w:sz w:val="18"/>
               </w:rPr>
@@ -2153,7 +2153,7 @@
             </w:pPr>
             <w:r>
               <w:rPr>
-                <w:rFonts w:ascii="함초롬돋움" w:hAnsi="함초롬돋움" w:eastAsia="함초롬돋움" w:cs="함초롬돋움"/>
+                <w:rFonts w:ascii="바탕" w:hAnsi="바탕" w:eastAsia="바탕" w:cs="바탕"/>
                 <w:b/>
                 <w:sz w:val="18"/>
               </w:rPr>
@@ -2194,7 +2194,7 @@
             </w:pPr>
             <w:r>
               <w:rPr>
-                <w:rFonts w:ascii="함초롬돋움" w:hAnsi="함초롬돋움" w:eastAsia="함초롬돋움" w:cs="함초롬돋움"/>
+                <w:rFonts w:ascii="바탕" w:hAnsi="바탕" w:eastAsia="바탕" w:cs="바탕"/>
                 <w:sz w:val="18"/>
               </w:rPr>
               <w:t>L − K3</w:t>
@@ -2227,7 +2227,7 @@
             </w:pPr>
             <w:r>
               <w:rPr>
-                <w:rFonts w:ascii="함초롬돋움" w:hAnsi="함초롬돋움" w:eastAsia="함초롬돋움" w:cs="함초롬돋움"/>
+                <w:rFonts w:ascii="바탕" w:hAnsi="바탕" w:eastAsia="바탕" w:cs="바탕"/>
                 <w:sz w:val="18"/>
               </w:rPr>
               <w:t>+0.128</w:t>
@@ -2237,7 +2237,7 @@
             </w:r>
             <w:r>
               <w:rPr>
-                <w:rFonts w:ascii="함초롬돋움" w:hAnsi="함초롬돋움" w:eastAsia="함초롬돋움" w:cs="함초롬돋움"/>
+                <w:rFonts w:ascii="바탕" w:hAnsi="바탕" w:eastAsia="바탕" w:cs="바탕"/>
                 <w:sz w:val="18"/>
               </w:rPr>
               <w:t>[+0.017, +0.244]</w:t>
@@ -2270,7 +2270,7 @@
             </w:pPr>
             <w:r>
               <w:rPr>
-                <w:rFonts w:ascii="함초롬돋움" w:hAnsi="함초롬돋움" w:eastAsia="함초롬돋움" w:cs="함초롬돋움"/>
+                <w:rFonts w:ascii="바탕" w:hAnsi="바탕" w:eastAsia="바탕" w:cs="바탕"/>
                 <w:sz w:val="18"/>
               </w:rPr>
               <w:t>+0.367</w:t>
@@ -2280,7 +2280,7 @@
             </w:r>
             <w:r>
               <w:rPr>
-                <w:rFonts w:ascii="함초롬돋움" w:hAnsi="함초롬돋움" w:eastAsia="함초롬돋움" w:cs="함초롬돋움"/>
+                <w:rFonts w:ascii="바탕" w:hAnsi="바탕" w:eastAsia="바탕" w:cs="바탕"/>
                 <w:sz w:val="18"/>
               </w:rPr>
               <w:t>[+0.067, +0.700]</w:t>
@@ -2320,7 +2320,7 @@
             </w:pPr>
             <w:r>
               <w:rPr>
-                <w:rFonts w:ascii="함초롬돋움" w:hAnsi="함초롬돋움" w:eastAsia="함초롬돋움" w:cs="함초롬돋움"/>
+                <w:rFonts w:ascii="바탕" w:hAnsi="바탕" w:eastAsia="바탕" w:cs="바탕"/>
                 <w:sz w:val="18"/>
               </w:rPr>
               <w:t>P − K3</w:t>
@@ -2353,7 +2353,7 @@
             </w:pPr>
             <w:r>
               <w:rPr>
-                <w:rFonts w:ascii="함초롬돋움" w:hAnsi="함초롬돋움" w:eastAsia="함초롬돋움" w:cs="함초롬돋움"/>
+                <w:rFonts w:ascii="바탕" w:hAnsi="바탕" w:eastAsia="바탕" w:cs="바탕"/>
                 <w:sz w:val="18"/>
               </w:rPr>
               <w:t>+0.150</w:t>
@@ -2363,7 +2363,7 @@
             </w:r>
             <w:r>
               <w:rPr>
-                <w:rFonts w:ascii="함초롬돋움" w:hAnsi="함초롬돋움" w:eastAsia="함초롬돋움" w:cs="함초롬돋움"/>
+                <w:rFonts w:ascii="바탕" w:hAnsi="바탕" w:eastAsia="바탕" w:cs="바탕"/>
                 <w:sz w:val="18"/>
               </w:rPr>
               <w:t>[+0.017, +0.283]</w:t>
@@ -2396,7 +2396,7 @@
             </w:pPr>
             <w:r>
               <w:rPr>
-                <w:rFonts w:ascii="함초롬돋움" w:hAnsi="함초롬돋움" w:eastAsia="함초롬돋움" w:cs="함초롬돋움"/>
+                <w:rFonts w:ascii="바탕" w:hAnsi="바탕" w:eastAsia="바탕" w:cs="바탕"/>
                 <w:sz w:val="18"/>
               </w:rPr>
               <w:t>+0.400</w:t>
@@ -2406,7 +2406,7 @@
             </w:r>
             <w:r>
               <w:rPr>
-                <w:rFonts w:ascii="함초롬돋움" w:hAnsi="함초롬돋움" w:eastAsia="함초롬돋움" w:cs="함초롬돋움"/>
+                <w:rFonts w:ascii="바탕" w:hAnsi="바탕" w:eastAsia="바탕" w:cs="바탕"/>
                 <w:sz w:val="18"/>
               </w:rPr>
               <w:t>[+0.100, +0.700]</w:t>
@@ -2446,7 +2446,7 @@
             </w:pPr>
             <w:r>
               <w:rPr>
-                <w:rFonts w:ascii="함초롬돋움" w:hAnsi="함초롬돋움" w:eastAsia="함초롬돋움" w:cs="함초롬돋움"/>
+                <w:rFonts w:ascii="바탕" w:hAnsi="바탕" w:eastAsia="바탕" w:cs="바탕"/>
                 <w:sz w:val="18"/>
               </w:rPr>
               <w:t>P − L</w:t>
@@ -2479,7 +2479,7 @@
             </w:pPr>
             <w:r>
               <w:rPr>
-                <w:rFonts w:ascii="함초롬돋움" w:hAnsi="함초롬돋움" w:eastAsia="함초롬돋움" w:cs="함초롬돋움"/>
+                <w:rFonts w:ascii="바탕" w:hAnsi="바탕" w:eastAsia="바탕" w:cs="바탕"/>
                 <w:sz w:val="18"/>
               </w:rPr>
               <w:t>+0.022</w:t>
@@ -2489,7 +2489,7 @@
             </w:r>
             <w:r>
               <w:rPr>
-                <w:rFonts w:ascii="함초롬돋움" w:hAnsi="함초롬돋움" w:eastAsia="함초롬돋움" w:cs="함초롬돋움"/>
+                <w:rFonts w:ascii="바탕" w:hAnsi="바탕" w:eastAsia="바탕" w:cs="바탕"/>
                 <w:sz w:val="18"/>
               </w:rPr>
               <w:t>[+0.000, +0.067]</w:t>
@@ -2522,7 +2522,7 @@
             </w:pPr>
             <w:r>
               <w:rPr>
-                <w:rFonts w:ascii="함초롬돋움" w:hAnsi="함초롬돋움" w:eastAsia="함초롬돋움" w:cs="함초롬돋움"/>
+                <w:rFonts w:ascii="바탕" w:hAnsi="바탕" w:eastAsia="바탕" w:cs="바탕"/>
                 <w:sz w:val="18"/>
               </w:rPr>
               <w:t>+0.033</w:t>
@@ -2532,7 +2532,7 @@
             </w:r>
             <w:r>
               <w:rPr>
-                <w:rFonts w:ascii="함초롬돋움" w:hAnsi="함초롬돋움" w:eastAsia="함초롬돋움" w:cs="함초롬돋움"/>
+                <w:rFonts w:ascii="바탕" w:hAnsi="바탕" w:eastAsia="바탕" w:cs="바탕"/>
                 <w:sz w:val="18"/>
               </w:rPr>
               <w:t>[+0.000, +0.100]</w:t>
@@ -2571,7 +2571,7 @@
             </w:pPr>
             <w:r>
               <w:rPr>
-                <w:rFonts w:ascii="함초롬돋움" w:hAnsi="함초롬돋움" w:eastAsia="함초롬돋움" w:cs="함초롬돋움"/>
+                <w:rFonts w:ascii="바탕" w:hAnsi="바탕" w:eastAsia="바탕" w:cs="바탕"/>
                 <w:b/>
                 <w:sz w:val="18"/>
               </w:rPr>
@@ -2612,7 +2612,7 @@
             </w:pPr>
             <w:r>
               <w:rPr>
-                <w:rFonts w:ascii="함초롬돋움" w:hAnsi="함초롬돋움" w:eastAsia="함초롬돋움" w:cs="함초롬돋움"/>
+                <w:rFonts w:ascii="바탕" w:hAnsi="바탕" w:eastAsia="바탕" w:cs="바탕"/>
                 <w:sz w:val="18"/>
               </w:rPr>
               <w:t>L − K3</w:t>
@@ -2645,7 +2645,7 @@
             </w:pPr>
             <w:r>
               <w:rPr>
-                <w:rFonts w:ascii="함초롬돋움" w:hAnsi="함초롬돋움" w:eastAsia="함초롬돋움" w:cs="함초롬돋움"/>
+                <w:rFonts w:ascii="바탕" w:hAnsi="바탕" w:eastAsia="바탕" w:cs="바탕"/>
                 <w:sz w:val="18"/>
               </w:rPr>
               <w:t>+0.267</w:t>
@@ -2655,7 +2655,7 @@
             </w:r>
             <w:r>
               <w:rPr>
-                <w:rFonts w:ascii="함초롬돋움" w:hAnsi="함초롬돋움" w:eastAsia="함초롬돋움" w:cs="함초롬돋움"/>
+                <w:rFonts w:ascii="바탕" w:hAnsi="바탕" w:eastAsia="바탕" w:cs="바탕"/>
                 <w:sz w:val="18"/>
               </w:rPr>
               <w:t>[+0.083, +0.440]</w:t>
@@ -2688,7 +2688,7 @@
             </w:pPr>
             <w:r>
               <w:rPr>
-                <w:rFonts w:ascii="함초롬돋움" w:hAnsi="함초롬돋움" w:eastAsia="함초롬돋움" w:cs="함초롬돋움"/>
+                <w:rFonts w:ascii="바탕" w:hAnsi="바탕" w:eastAsia="바탕" w:cs="바탕"/>
                 <w:sz w:val="18"/>
               </w:rPr>
               <w:t>+0.578</w:t>
@@ -2698,7 +2698,7 @@
             </w:r>
             <w:r>
               <w:rPr>
-                <w:rFonts w:ascii="함초롬돋움" w:hAnsi="함초롬돋움" w:eastAsia="함초롬돋움" w:cs="함초롬돋움"/>
+                <w:rFonts w:ascii="바탕" w:hAnsi="바탕" w:eastAsia="바탕" w:cs="바탕"/>
                 <w:sz w:val="18"/>
               </w:rPr>
               <w:t>[+0.271, +0.889]</w:t>
@@ -2738,7 +2738,7 @@
             </w:pPr>
             <w:r>
               <w:rPr>
-                <w:rFonts w:ascii="함초롬돋움" w:hAnsi="함초롬돋움" w:eastAsia="함초롬돋움" w:cs="함초롬돋움"/>
+                <w:rFonts w:ascii="바탕" w:hAnsi="바탕" w:eastAsia="바탕" w:cs="바탕"/>
                 <w:sz w:val="18"/>
               </w:rPr>
               <w:t>P − K3</w:t>
@@ -2771,7 +2771,7 @@
             </w:pPr>
             <w:r>
               <w:rPr>
-                <w:rFonts w:ascii="함초롬돋움" w:hAnsi="함초롬돋움" w:eastAsia="함초롬돋움" w:cs="함초롬돋움"/>
+                <w:rFonts w:ascii="바탕" w:hAnsi="바탕" w:eastAsia="바탕" w:cs="바탕"/>
                 <w:sz w:val="18"/>
               </w:rPr>
               <w:t>+0.244</w:t>
@@ -2781,7 +2781,7 @@
             </w:r>
             <w:r>
               <w:rPr>
-                <w:rFonts w:ascii="함초롬돋움" w:hAnsi="함초롬돋움" w:eastAsia="함초롬돋움" w:cs="함초롬돋움"/>
+                <w:rFonts w:ascii="바탕" w:hAnsi="바탕" w:eastAsia="바탕" w:cs="바탕"/>
                 <w:sz w:val="18"/>
               </w:rPr>
               <w:t>[+0.098, +0.400]</w:t>
@@ -2814,7 +2814,7 @@
             </w:pPr>
             <w:r>
               <w:rPr>
-                <w:rFonts w:ascii="함초롬돋움" w:hAnsi="함초롬돋움" w:eastAsia="함초롬돋움" w:cs="함초롬돋움"/>
+                <w:rFonts w:ascii="바탕" w:hAnsi="바탕" w:eastAsia="바탕" w:cs="바탕"/>
                 <w:sz w:val="18"/>
               </w:rPr>
               <w:t>+0.511</w:t>
@@ -2824,7 +2824,7 @@
             </w:r>
             <w:r>
               <w:rPr>
-                <w:rFonts w:ascii="함초롬돋움" w:hAnsi="함초롬돋움" w:eastAsia="함초롬돋움" w:cs="함초롬돋움"/>
+                <w:rFonts w:ascii="바탕" w:hAnsi="바탕" w:eastAsia="바탕" w:cs="바탕"/>
                 <w:sz w:val="18"/>
               </w:rPr>
               <w:t>[+0.246, +0.806]</w:t>
@@ -2864,7 +2864,7 @@
             </w:pPr>
             <w:r>
               <w:rPr>
-                <w:rFonts w:ascii="함초롬돋움" w:hAnsi="함초롬돋움" w:eastAsia="함초롬돋움" w:cs="함초롬돋움"/>
+                <w:rFonts w:ascii="바탕" w:hAnsi="바탕" w:eastAsia="바탕" w:cs="바탕"/>
                 <w:sz w:val="18"/>
               </w:rPr>
               <w:t>P − L</w:t>
@@ -2897,7 +2897,7 @@
             </w:pPr>
             <w:r>
               <w:rPr>
-                <w:rFonts w:ascii="함초롬돋움" w:hAnsi="함초롬돋움" w:eastAsia="함초롬돋움" w:cs="함초롬돋움"/>
+                <w:rFonts w:ascii="바탕" w:hAnsi="바탕" w:eastAsia="바탕" w:cs="바탕"/>
                 <w:sz w:val="18"/>
               </w:rPr>
               <w:t>−0.022</w:t>
@@ -2907,7 +2907,7 @@
             </w:r>
             <w:r>
               <w:rPr>
-                <w:rFonts w:ascii="함초롬돋움" w:hAnsi="함초롬돋움" w:eastAsia="함초롬돋움" w:cs="함초롬돋움"/>
+                <w:rFonts w:ascii="바탕" w:hAnsi="바탕" w:eastAsia="바탕" w:cs="바탕"/>
                 <w:sz w:val="18"/>
               </w:rPr>
               <w:t>[−0.083, +0.026]</w:t>
@@ -2940,7 +2940,7 @@
             </w:pPr>
             <w:r>
               <w:rPr>
-                <w:rFonts w:ascii="함초롬돋움" w:hAnsi="함초롬돋움" w:eastAsia="함초롬돋움" w:cs="함초롬돋움"/>
+                <w:rFonts w:ascii="바탕" w:hAnsi="바탕" w:eastAsia="바탕" w:cs="바탕"/>
                 <w:sz w:val="18"/>
               </w:rPr>
               <w:t>−0.067</w:t>
@@ -2950,7 +2950,7 @@
             </w:r>
             <w:r>
               <w:rPr>
-                <w:rFonts w:ascii="함초롬돋움" w:hAnsi="함초롬돋움" w:eastAsia="함초롬돋움" w:cs="함초롬돋움"/>
+                <w:rFonts w:ascii="바탕" w:hAnsi="바탕" w:eastAsia="바탕" w:cs="바탕"/>
                 <w:sz w:val="18"/>
               </w:rPr>
               <w:t>[−0.167, 0.000]</w:t>
@@ -2975,7 +2975,7 @@
       </w:pPr>
       <w:r>
         <w:rPr>
-          <w:rFonts w:ascii="함초롬돋움" w:hAnsi="함초롬돋움" w:eastAsia="함초롬돋움" w:cs="함초롬돋움"/>
+          <w:rFonts w:ascii="바탕" w:hAnsi="바탕" w:eastAsia="바탕" w:cs="바탕"/>
           <w:sz w:val="18"/>
         </w:rPr>
         <w:t>여러 질의가 같은 링크 정답 근거를 공유하는 경우가 있어서, 질의를 서로 독립인 표본으로 보고 재표집하면 구간이 실제보다 좁아질 수 있다. 그래서 같은 문서 버전의 같은 조항을 링크 정답 근거로 갖는 질의들을 하나로 묶고, 이렇게 이어진 묶음을 군집으로 삼아 군집 단위로 재표집했다. 군집이 기존 사례에서 5개, 신규 사례에서 6개뿐이어서, 표의 구간은 효과의 크기를 가늠하는 참고값으로만 본다.</w:t>
@@ -2995,7 +2995,7 @@
       </w:pPr>
       <w:r>
         <w:rPr>
-          <w:rFonts w:ascii="함초롬돋움" w:hAnsi="함초롬돋움" w:eastAsia="함초롬돋움" w:cs="함초롬돋움"/>
+          <w:rFonts w:ascii="바탕" w:hAnsi="바탕" w:eastAsia="바탕" w:cs="바탕"/>
           <w:sz w:val="18"/>
           <w:szCs w:val="18"/>
         </w:rPr>
@@ -3060,7 +3060,7 @@
             </w:pPr>
             <w:r>
               <w:rPr>
-                <w:rFonts w:ascii="함초롬돋움" w:hAnsi="함초롬돋움" w:eastAsia="함초롬돋움" w:cs="함초롬돋움"/>
+                <w:rFonts w:ascii="바탕" w:hAnsi="바탕" w:eastAsia="바탕" w:cs="바탕"/>
                 <w:b/>
                 <w:sz w:val="18"/>
               </w:rPr>
@@ -3094,7 +3094,7 @@
             </w:pPr>
             <w:r>
               <w:rPr>
-                <w:rFonts w:ascii="함초롬돋움" w:hAnsi="함초롬돋움" w:eastAsia="함초롬돋움" w:cs="함초롬돋움"/>
+                <w:rFonts w:ascii="바탕" w:hAnsi="바탕" w:eastAsia="바탕" w:cs="바탕"/>
                 <w:b/>
                 <w:sz w:val="18"/>
               </w:rPr>
@@ -3105,7 +3105,7 @@
             </w:r>
             <w:r>
               <w:rPr>
-                <w:rFonts w:ascii="함초롬돋움" w:hAnsi="함초롬돋움" w:eastAsia="함초롬돋움" w:cs="함초롬돋움"/>
+                <w:rFonts w:ascii="바탕" w:hAnsi="바탕" w:eastAsia="바탕" w:cs="바탕"/>
                 <w:b/>
                 <w:sz w:val="18"/>
               </w:rPr>
@@ -3139,7 +3139,7 @@
             </w:pPr>
             <w:r>
               <w:rPr>
-                <w:rFonts w:ascii="함초롬돋움" w:hAnsi="함초롬돋움" w:eastAsia="함초롬돋움" w:cs="함초롬돋움"/>
+                <w:rFonts w:ascii="바탕" w:hAnsi="바탕" w:eastAsia="바탕" w:cs="바탕"/>
                 <w:b/>
                 <w:sz w:val="18"/>
               </w:rPr>
@@ -3150,7 +3150,7 @@
             </w:r>
             <w:r>
               <w:rPr>
-                <w:rFonts w:ascii="함초롬돋움" w:hAnsi="함초롬돋움" w:eastAsia="함초롬돋움" w:cs="함초롬돋움"/>
+                <w:rFonts w:ascii="바탕" w:hAnsi="바탕" w:eastAsia="바탕" w:cs="바탕"/>
                 <w:b/>
                 <w:sz w:val="18"/>
               </w:rPr>
@@ -3191,7 +3191,7 @@
             </w:pPr>
             <w:r>
               <w:rPr>
-                <w:rFonts w:ascii="함초롬돋움" w:hAnsi="함초롬돋움" w:eastAsia="함초롬돋움" w:cs="함초롬돋움"/>
+                <w:rFonts w:ascii="바탕" w:hAnsi="바탕" w:eastAsia="바탕" w:cs="바탕"/>
                 <w:sz w:val="18"/>
               </w:rPr>
               <w:t>ΔContext</w:t>
@@ -3201,7 +3201,7 @@
             </w:r>
             <w:r>
               <w:rPr>
-                <w:rFonts w:ascii="함초롬돋움" w:hAnsi="함초롬돋움" w:eastAsia="함초롬돋움" w:cs="함초롬돋움"/>
+                <w:rFonts w:ascii="바탕" w:hAnsi="바탕" w:eastAsia="바탕" w:cs="바탕"/>
                 <w:sz w:val="18"/>
               </w:rPr>
               <w:t>Precision</w:t>
@@ -3234,7 +3234,7 @@
             </w:pPr>
             <w:r>
               <w:rPr>
-                <w:rFonts w:ascii="함초롬돋움" w:hAnsi="함초롬돋움" w:eastAsia="함초롬돋움" w:cs="함초롬돋움"/>
+                <w:rFonts w:ascii="바탕" w:hAnsi="바탕" w:eastAsia="바탕" w:cs="바탕"/>
                 <w:sz w:val="18"/>
               </w:rPr>
               <w:t>+0.109</w:t>
@@ -3244,7 +3244,7 @@
             </w:r>
             <w:r>
               <w:rPr>
-                <w:rFonts w:ascii="함초롬돋움" w:hAnsi="함초롬돋움" w:eastAsia="함초롬돋움" w:cs="함초롬돋움"/>
+                <w:rFonts w:ascii="바탕" w:hAnsi="바탕" w:eastAsia="바탕" w:cs="바탕"/>
                 <w:sz w:val="18"/>
               </w:rPr>
               <w:t>[+0.002, +0.220]</w:t>
@@ -3277,7 +3277,7 @@
             </w:pPr>
             <w:r>
               <w:rPr>
-                <w:rFonts w:ascii="함초롬돋움" w:hAnsi="함초롬돋움" w:eastAsia="함초롬돋움" w:cs="함초롬돋움"/>
+                <w:rFonts w:ascii="바탕" w:hAnsi="바탕" w:eastAsia="바탕" w:cs="바탕"/>
                 <w:sz w:val="18"/>
               </w:rPr>
               <w:t>+0.025</w:t>
@@ -3287,7 +3287,7 @@
             </w:r>
             <w:r>
               <w:rPr>
-                <w:rFonts w:ascii="함초롬돋움" w:hAnsi="함초롬돋움" w:eastAsia="함초롬돋움" w:cs="함초롬돋움"/>
+                <w:rFonts w:ascii="바탕" w:hAnsi="바탕" w:eastAsia="바탕" w:cs="바탕"/>
                 <w:sz w:val="18"/>
               </w:rPr>
               <w:t>[+0.008, +0.042]</w:t>
@@ -3327,7 +3327,7 @@
             </w:pPr>
             <w:r>
               <w:rPr>
-                <w:rFonts w:ascii="함초롬돋움" w:hAnsi="함초롬돋움" w:eastAsia="함초롬돋움" w:cs="함초롬돋움"/>
+                <w:rFonts w:ascii="바탕" w:hAnsi="바탕" w:eastAsia="바탕" w:cs="바탕"/>
                 <w:sz w:val="18"/>
               </w:rPr>
               <w:t>ΔAnswer</w:t>
@@ -3337,7 +3337,7 @@
             </w:r>
             <w:r>
               <w:rPr>
-                <w:rFonts w:ascii="함초롬돋움" w:hAnsi="함초롬돋움" w:eastAsia="함초롬돋움" w:cs="함초롬돋움"/>
+                <w:rFonts w:ascii="바탕" w:hAnsi="바탕" w:eastAsia="바탕" w:cs="바탕"/>
                 <w:sz w:val="18"/>
               </w:rPr>
               <w:t>Correctness</w:t>
@@ -3370,7 +3370,7 @@
             </w:pPr>
             <w:r>
               <w:rPr>
-                <w:rFonts w:ascii="함초롬돋움" w:hAnsi="함초롬돋움" w:eastAsia="함초롬돋움" w:cs="함초롬돋움"/>
+                <w:rFonts w:ascii="바탕" w:hAnsi="바탕" w:eastAsia="바탕" w:cs="바탕"/>
                 <w:sz w:val="18"/>
               </w:rPr>
               <w:t>−0.003</w:t>
@@ -3380,7 +3380,7 @@
             </w:r>
             <w:r>
               <w:rPr>
-                <w:rFonts w:ascii="함초롬돋움" w:hAnsi="함초롬돋움" w:eastAsia="함초롬돋움" w:cs="함초롬돋움"/>
+                <w:rFonts w:ascii="바탕" w:hAnsi="바탕" w:eastAsia="바탕" w:cs="바탕"/>
                 <w:sz w:val="18"/>
               </w:rPr>
               <w:t>[−0.040, +0.042]</w:t>
@@ -3413,7 +3413,7 @@
             </w:pPr>
             <w:r>
               <w:rPr>
-                <w:rFonts w:ascii="함초롬돋움" w:hAnsi="함초롬돋움" w:eastAsia="함초롬돋움" w:cs="함초롬돋움"/>
+                <w:rFonts w:ascii="바탕" w:hAnsi="바탕" w:eastAsia="바탕" w:cs="바탕"/>
                 <w:sz w:val="18"/>
               </w:rPr>
               <w:t>−0.001</w:t>
@@ -3423,7 +3423,7 @@
             </w:r>
             <w:r>
               <w:rPr>
-                <w:rFonts w:ascii="함초롬돋움" w:hAnsi="함초롬돋움" w:eastAsia="함초롬돋움" w:cs="함초롬돋움"/>
+                <w:rFonts w:ascii="바탕" w:hAnsi="바탕" w:eastAsia="바탕" w:cs="바탕"/>
                 <w:sz w:val="18"/>
               </w:rPr>
               <w:t>[−0.019, +0.018]</w:t>
@@ -3463,7 +3463,7 @@
             </w:pPr>
             <w:r>
               <w:rPr>
-                <w:rFonts w:ascii="함초롬돋움" w:hAnsi="함초롬돋움" w:eastAsia="함초롬돋움" w:cs="함초롬돋움"/>
+                <w:rFonts w:ascii="바탕" w:hAnsi="바탕" w:eastAsia="바탕" w:cs="바탕"/>
                 <w:sz w:val="18"/>
               </w:rPr>
               <w:t>Δ응답 시간</w:t>
@@ -3473,7 +3473,7 @@
             </w:r>
             <w:r>
               <w:rPr>
-                <w:rFonts w:ascii="함초롬돋움" w:hAnsi="함초롬돋움" w:eastAsia="함초롬돋움" w:cs="함초롬돋움"/>
+                <w:rFonts w:ascii="바탕" w:hAnsi="바탕" w:eastAsia="바탕" w:cs="바탕"/>
                 <w:sz w:val="18"/>
               </w:rPr>
               <w:t>(초/질의)</w:t>
@@ -3506,7 +3506,7 @@
             </w:pPr>
             <w:r>
               <w:rPr>
-                <w:rFonts w:ascii="함초롬돋움" w:hAnsi="함초롬돋움" w:eastAsia="함초롬돋움" w:cs="함초롬돋움"/>
+                <w:rFonts w:ascii="바탕" w:hAnsi="바탕" w:eastAsia="바탕" w:cs="바탕"/>
                 <w:sz w:val="18"/>
               </w:rPr>
               <w:t>+1.057</w:t>
@@ -3516,7 +3516,7 @@
             </w:r>
             <w:r>
               <w:rPr>
-                <w:rFonts w:ascii="함초롬돋움" w:hAnsi="함초롬돋움" w:eastAsia="함초롬돋움" w:cs="함초롬돋움"/>
+                <w:rFonts w:ascii="바탕" w:hAnsi="바탕" w:eastAsia="바탕" w:cs="바탕"/>
                 <w:sz w:val="18"/>
               </w:rPr>
               <w:t>[+0.904, +1.211]</w:t>
@@ -3549,7 +3549,7 @@
             </w:pPr>
             <w:r>
               <w:rPr>
-                <w:rFonts w:ascii="함초롬돋움" w:hAnsi="함초롬돋움" w:eastAsia="함초롬돋움" w:cs="함초롬돋움"/>
+                <w:rFonts w:ascii="바탕" w:hAnsi="바탕" w:eastAsia="바탕" w:cs="바탕"/>
                 <w:sz w:val="18"/>
               </w:rPr>
               <w:t>+0.343</w:t>
@@ -3559,7 +3559,7 @@
             </w:r>
             <w:r>
               <w:rPr>
-                <w:rFonts w:ascii="함초롬돋움" w:hAnsi="함초롬돋움" w:eastAsia="함초롬돋움" w:cs="함초롬돋움"/>
+                <w:rFonts w:ascii="바탕" w:hAnsi="바탕" w:eastAsia="바탕" w:cs="바탕"/>
                 <w:sz w:val="18"/>
               </w:rPr>
               <w:t>[−0.761, +1.066]</w:t>
@@ -3592,7 +3592,7 @@
       </w:pPr>
       <w:r>
         <w:rPr>
-          <w:rFonts w:ascii="함초롬돋움" w:hAnsi="함초롬돋움" w:eastAsia="함초롬돋움" w:cs="함초롬돋움"/>
+          <w:rFonts w:ascii="바탕" w:hAnsi="바탕" w:eastAsia="바탕" w:cs="바탕"/>
           <w:sz w:val="18"/>
         </w:rPr>
         <w:t>K3는 첫 번째 실행에서만 답변을 채점했으므로 그 결과끼리 비교하면, 기존 사례에서 proposed는 Context Precision이 K3보다 0.266 [−0.478, −0.099] 낮았지만 Answer Correctness 차이는 −0.022 [−0.120, +0.077]로 거의 없었다. 신규 사례에서는 두 지표의 차이가 각각 +0.020 [−0.047, +0.078], +0.031 [−0.043, +0.136]으로 모두 작았다. 즉, 링크 확장으로 찾은 정답 근거가 늘었어도 자동 채점한 답변의 정확도는 뚜렷하게 달라지지 않았다.</w:t>
@@ -3605,20 +3605,20 @@
         <w:spacing w:line="300" w:lineRule="exact"/>
         <w:ind w:firstLine="180"/>
         <w:rPr>
-          <w:rFonts w:ascii="함초롬돋움" w:hAnsi="함초롬돋움" w:eastAsia="함초롬돋움" w:cs="함초롬돋움"/>
+          <w:rFonts w:ascii="바탕" w:hAnsi="바탕" w:eastAsia="바탕" w:cs="바탕"/>
           <w:sz w:val="18"/>
         </w:rPr>
       </w:pPr>
       <w:r>
         <w:rPr>
-          <w:rFonts w:ascii="함초롬돋움" w:hAnsi="함초롬돋움" w:eastAsia="함초롬돋움" w:cs="함초롬돋움"/>
+          <w:rFonts w:ascii="바탕" w:hAnsi="바탕" w:eastAsia="바탕" w:cs="바탕"/>
           <w:sz w:val="18"/>
         </w:rPr>
         <w:t>그래프형 질의의 평균 응답 시간은 K3 1.446초, link_all 2.157초, proposed 2.678초로, proposed는 연결 근거를 한 번 더 재정렬하는 만큼 link_all보다 약 0.5초 느렸다(표 3).</w:t>
       </w:r>
       <w:r>
         <w:rPr>
-          <w:rFonts w:ascii="함초롬돋움" w:hAnsi="함초롬돋움" w:eastAsia="함초롬돋움" w:cs="함초롬돋움"/>
+          <w:rFonts w:ascii="바탕" w:hAnsi="바탕" w:eastAsia="바탕" w:cs="바탕"/>
           <w:sz w:val="18"/>
         </w:rPr>
       </w:r>
@@ -3639,7 +3639,7 @@
       </w:pPr>
       <w:r>
         <w:rPr>
-          <w:rFonts w:ascii="함초롬돋움" w:hAnsi="함초롬돋움" w:eastAsia="함초롬돋움" w:cs="함초롬돋움"/>
+          <w:rFonts w:ascii="바탕" w:hAnsi="바탕" w:eastAsia="바탕" w:cs="바탕"/>
           <w:b/>
         </w:rPr>
         <w:t>4. 논의 및 결론</w:t>
@@ -3654,7 +3654,7 @@
       </w:pPr>
       <w:r>
         <w:rPr>
-          <w:rFonts w:ascii="함초롬돋움" w:hAnsi="함초롬돋움" w:eastAsia="함초롬돋움" w:cs="함초롬돋움"/>
+          <w:rFonts w:ascii="바탕" w:hAnsi="바탕" w:eastAsia="바탕" w:cs="바탕"/>
           <w:sz w:val="18"/>
         </w:rPr>
         <w:t>승인 링크로 검색을 확장하자 그래프형 질의에서 찾아낸 정답 근거가 크게 늘었다. 특히 K3와 link_all은 질의당 평균 근거 수가 3.15개와 3.08개로 비슷했는데도 Recall 차이가 컸다. 근거를 더 많이 가져와서가 아니라, 링크가 다른 문서에 있는 필요한 구간을 찾아 준 덕분으로 볼 수 있다. 반면 연결 근거를 한 번 더 골라내는 proposed는 link_all보다 Recall이 높지 않았고 응답만 느려졌다.</w:t>
@@ -3669,7 +3669,7 @@
       </w:pPr>
       <w:r>
         <w:rPr>
-          <w:rFonts w:ascii="함초롬돋움" w:hAnsi="함초롬돋움" w:eastAsia="함초롬돋움" w:cs="함초롬돋움"/>
+          <w:rFonts w:ascii="바탕" w:hAnsi="바탕" w:eastAsia="바탕" w:cs="바탕"/>
           <w:sz w:val="18"/>
         </w:rPr>
         <w:t>이 결과를 해석할 때는 평가 자료의 한계를 함께 봐야 한다. 기존 그래프형 5건은 개발 과정에서 만든 질의이고, 신규 15건은 링크를 먼저 정한 뒤 만들었기 때문에 링크 방식에 유리한 질문이 모였을 수 있다. 신규 질의는 현업 전문가 1인이 링크 구조를 아는 상태에서 검토했으므로 평가자 간 일치도를 구하지 못했다. 또한 K3는 근거가 3개보다 적을 때만 보충하므로 근거 수나 토큰 예산을 정확히 맞춘 비교는 아니다. 답변 역시 생성에 쓴 모델이 그대로 채점했고, 사람이 방법명을 가린 채 평가하지는 않았다.</w:t>
@@ -3684,7 +3684,7 @@
       </w:pPr>
       <w:r>
         <w:rPr>
-          <w:rFonts w:ascii="함초롬돋움" w:hAnsi="함초롬돋움" w:eastAsia="함초롬돋움" w:cs="함초롬돋움"/>
+          <w:rFonts w:ascii="바탕" w:hAnsi="바탕" w:eastAsia="바탕" w:cs="바탕"/>
           <w:sz w:val="18"/>
         </w:rPr>
         <w:t>운영 측면에서도 확인할 점이 남아 있다. 관리자는 링크 양 끝의 구간과 승인 상태, 담당자, 시각을 기록하지만, 어떤 기준으로 승인하는지와 문서가 개정되거나 폐기될 때 링크를 어떻게 처리하는지는 정해져 있지 않다. 따라서 이번 결과는 승인된 링크가 정확하다는 근거가 아니라, 링크가 있을 때 검색이 어떻게 달라지는지를 보여 준다. 링크를 미리 보지 않고 만든 현장 질의, 두 명 이상의 독립 검수, 블라인드 답변 평가로 이 결과를 다시 확인할 계획이다. 또한 현재 시스템은 연결 근거를 찾지 못해도 경고 없이 직접 근거만으로 답하므로, 이를 보완하기 전에는 실제 운전 판단에 쓰기 어렵다.</w:t>
@@ -3707,7 +3707,7 @@
       </w:pPr>
       <w:r>
         <w:rPr>
-          <w:rFonts w:ascii="함초롬돋움" w:hAnsi="함초롬돋움" w:eastAsia="함초롬돋움" w:cs="함초롬돋움"/>
+          <w:rFonts w:ascii="바탕" w:hAnsi="바탕" w:eastAsia="바탕" w:cs="바탕"/>
           <w:b/>
         </w:rPr>
         <w:t>참고문헌</w:t>
@@ -3722,14 +3722,14 @@
       </w:pPr>
       <w:r>
         <w:rPr>
-          <w:rFonts w:ascii="함초롬돋움" w:hAnsi="함초롬돋움" w:eastAsia="함초롬돋움" w:cs="함초롬돋움"/>
+          <w:rFonts w:ascii="바탕" w:hAnsi="바탕" w:eastAsia="바탕" w:cs="바탕"/>
           <w:sz w:val="18"/>
         </w:rPr>
         <w:t xml:space="preserve">[1] P. Lewis, E. Perez, A. Piktus, F. Petroni, V. Karpukhin, N. Goyal, H. Küttler, M. Lewis, W. Yih, T. Rocktäschel, S. Riedel, and D. Kiela, “Retrieval-Augmented Generation for Knowledge-Intensive NLP Tasks,” </w:t>
       </w:r>
       <w:r>
         <w:rPr>
-          <w:rFonts w:ascii="함초롬돋움" w:hAnsi="함초롬돋움" w:eastAsia="함초롬돋움" w:cs="함초롬돋움"/>
+          <w:rFonts w:ascii="바탕" w:hAnsi="바탕" w:eastAsia="바탕" w:cs="바탕"/>
           <w:i/>
           <w:sz w:val="18"/>
         </w:rPr>
@@ -3737,7 +3737,7 @@
       </w:r>
       <w:r>
         <w:rPr>
-          <w:rFonts w:ascii="함초롬돋움" w:hAnsi="함초롬돋움" w:eastAsia="함초롬돋움" w:cs="함초롬돋움"/>
+          <w:rFonts w:ascii="바탕" w:hAnsi="바탕" w:eastAsia="바탕" w:cs="바탕"/>
           <w:sz w:val="18"/>
         </w:rPr>
         <w:t>, vol. 33, pp. 9459–9474, 2020.</w:t>
@@ -3752,14 +3752,14 @@
       </w:pPr>
       <w:r>
         <w:rPr>
-          <w:rFonts w:ascii="함초롬돋움" w:hAnsi="함초롬돋움" w:eastAsia="함초롬돋움" w:cs="함초롬돋움"/>
+          <w:rFonts w:ascii="바탕" w:hAnsi="바탕" w:eastAsia="바탕" w:cs="바탕"/>
           <w:sz w:val="18"/>
         </w:rPr>
         <w:t xml:space="preserve">[2] W. Sun, L. Yan, X. Ma, S. Wang, P. Ren, Z. Chen, D. Yin, and Z. Ren, “Is ChatGPT Good at Search? Investigating Large Language Models as Re-Ranking Agents,” in </w:t>
       </w:r>
       <w:r>
         <w:rPr>
-          <w:rFonts w:ascii="함초롬돋움" w:hAnsi="함초롬돋움" w:eastAsia="함초롬돋움" w:cs="함초롬돋움"/>
+          <w:rFonts w:ascii="바탕" w:hAnsi="바탕" w:eastAsia="바탕" w:cs="바탕"/>
           <w:i/>
           <w:sz w:val="18"/>
         </w:rPr>
@@ -3767,7 +3767,7 @@
       </w:r>
       <w:r>
         <w:rPr>
-          <w:rFonts w:ascii="함초롬돋움" w:hAnsi="함초롬돋움" w:eastAsia="함초롬돋움" w:cs="함초롬돋움"/>
+          <w:rFonts w:ascii="바탕" w:hAnsi="바탕" w:eastAsia="바탕" w:cs="바탕"/>
           <w:sz w:val="18"/>
         </w:rPr>
         <w:t>, pp. 14918–14937, 2023.</w:t>
@@ -3782,7 +3782,7 @@
       </w:pPr>
       <w:r>
         <w:rPr>
-          <w:rFonts w:ascii="함초롬돋움" w:hAnsi="함초롬돋움" w:eastAsia="함초롬돋움" w:cs="함초롬돋움"/>
+          <w:rFonts w:ascii="바탕" w:hAnsi="바탕" w:eastAsia="바탕" w:cs="바탕"/>
           <w:sz w:val="18"/>
         </w:rPr>
         <w:t>[3] D. Edge, H. Trinh, N. Cheng, J. Bradley, A. Chao, A. Mody, S. Truitt, D. Metropolitansky, R. O. Ness, and J. Larson, “From Local to Global: A Graph RAG Approach to Query-Focused Summarization,” arXiv:2404.16130, 2024.</w:t>
@@ -3797,14 +3797,14 @@
       </w:pPr>
       <w:r>
         <w:rPr>
-          <w:rFonts w:ascii="함초롬돋움" w:hAnsi="함초롬돋움" w:eastAsia="함초롬돋움" w:cs="함초롬돋움"/>
+          <w:rFonts w:ascii="바탕" w:hAnsi="바탕" w:eastAsia="바탕" w:cs="바탕"/>
           <w:sz w:val="18"/>
         </w:rPr>
         <w:t xml:space="preserve">[4] Z. Guo, L. Xia, Y. Yu, T. Ao, and C. Huang, “LightRAG: Simple and Fast Retrieval-Augmented Generation,” in </w:t>
       </w:r>
       <w:r>
         <w:rPr>
-          <w:rFonts w:ascii="함초롬돋움" w:hAnsi="함초롬돋움" w:eastAsia="함초롬돋움" w:cs="함초롬돋움"/>
+          <w:rFonts w:ascii="바탕" w:hAnsi="바탕" w:eastAsia="바탕" w:cs="바탕"/>
           <w:i/>
           <w:sz w:val="18"/>
         </w:rPr>
@@ -3812,7 +3812,7 @@
       </w:r>
       <w:r>
         <w:rPr>
-          <w:rFonts w:ascii="함초롬돋움" w:hAnsi="함초롬돋움" w:eastAsia="함초롬돋움" w:cs="함초롬돋움"/>
+          <w:rFonts w:ascii="바탕" w:hAnsi="바탕" w:eastAsia="바탕" w:cs="바탕"/>
           <w:sz w:val="18"/>
         </w:rPr>
         <w:t>, pp. 10746–10761, 2025.</w:t>
@@ -3827,14 +3827,14 @@
       </w:pPr>
       <w:r>
         <w:rPr>
-          <w:rFonts w:ascii="함초롬돋움" w:hAnsi="함초롬돋움" w:eastAsia="함초롬돋움" w:cs="함초롬돋움"/>
+          <w:rFonts w:ascii="바탕" w:hAnsi="바탕" w:eastAsia="바탕" w:cs="바탕"/>
           <w:sz w:val="18"/>
         </w:rPr>
         <w:t xml:space="preserve">[5] X. Zhu, Y. Xie, Y. Liu, Y. Li, and W. Hu, “Knowledge Graph-Guided Retrieval Augmented Generation,” in </w:t>
       </w:r>
       <w:r>
         <w:rPr>
-          <w:rFonts w:ascii="함초롬돋움" w:hAnsi="함초롬돋움" w:eastAsia="함초롬돋움" w:cs="함초롬돋움"/>
+          <w:rFonts w:ascii="바탕" w:hAnsi="바탕" w:eastAsia="바탕" w:cs="바탕"/>
           <w:i/>
           <w:sz w:val="18"/>
         </w:rPr>
@@ -3842,7 +3842,7 @@
       </w:r>
       <w:r>
         <w:rPr>
-          <w:rFonts w:ascii="함초롬돋움" w:hAnsi="함초롬돋움" w:eastAsia="함초롬돋움" w:cs="함초롬돋움"/>
+          <w:rFonts w:ascii="바탕" w:hAnsi="바탕" w:eastAsia="바탕" w:cs="바탕"/>
           <w:sz w:val="18"/>
         </w:rPr>
         <w:t>, vol. 1, pp. 8912–8924, 2025.</w:t>
@@ -3857,14 +3857,14 @@
       </w:pPr>
       <w:r>
         <w:rPr>
-          <w:rFonts w:ascii="함초롬돋움" w:hAnsi="함초롬돋움" w:eastAsia="함초롬돋움" w:cs="함초롬돋움"/>
+          <w:rFonts w:ascii="바탕" w:hAnsi="바탕" w:eastAsia="바탕" w:cs="바탕"/>
           <w:sz w:val="18"/>
         </w:rPr>
         <w:t xml:space="preserve">[6] W. Zheng, M. Yang, Y. Ren, H. Wang, C. Zeng, and Y. Zhang, “CARAG: Context-Aware Retrieval-Augmented Generation for Railway Operation and Maintenance Question Answering over Spatial Knowledge Graph,” </w:t>
       </w:r>
       <w:r>
         <w:rPr>
-          <w:rFonts w:ascii="함초롬돋움" w:hAnsi="함초롬돋움" w:eastAsia="함초롬돋움" w:cs="함초롬돋움"/>
+          <w:rFonts w:ascii="바탕" w:hAnsi="바탕" w:eastAsia="바탕" w:cs="바탕"/>
           <w:i/>
           <w:sz w:val="18"/>
         </w:rPr>
@@ -3872,7 +3872,7 @@
       </w:r>
       <w:r>
         <w:rPr>
-          <w:rFonts w:ascii="함초롬돋움" w:hAnsi="함초롬돋움" w:eastAsia="함초롬돋움" w:cs="함초롬돋움"/>
+          <w:rFonts w:ascii="바탕" w:hAnsi="바탕" w:eastAsia="바탕" w:cs="바탕"/>
           <w:sz w:val="18"/>
         </w:rPr>
         <w:t>, vol. 15, no. 2, Article 78, 2026.</w:t>
@@ -3887,14 +3887,14 @@
       </w:pPr>
       <w:r>
         <w:rPr>
-          <w:rFonts w:ascii="함초롬돋움" w:hAnsi="함초롬돋움" w:eastAsia="함초롬돋움" w:cs="함초롬돋움"/>
+          <w:rFonts w:ascii="바탕" w:hAnsi="바탕" w:eastAsia="바탕" w:cs="바탕"/>
           <w:sz w:val="18"/>
         </w:rPr>
         <w:t xml:space="preserve">[7] L. Huang, Z. Liu, C. Yu, T. Zhu, and B. Yan, “Emergency Operation Scheme Generation for Urban Rail Transit Train Door Systems Using Retrieval-Augmented Large Language Models,” </w:t>
       </w:r>
       <w:r>
         <w:rPr>
-          <w:rFonts w:ascii="함초롬돋움" w:hAnsi="함초롬돋움" w:eastAsia="함초롬돋움" w:cs="함초롬돋움"/>
+          <w:rFonts w:ascii="바탕" w:hAnsi="바탕" w:eastAsia="바탕" w:cs="바탕"/>
           <w:i/>
           <w:sz w:val="18"/>
         </w:rPr>
@@ -3902,7 +3902,7 @@
       </w:r>
       <w:r>
         <w:rPr>
-          <w:rFonts w:ascii="함초롬돋움" w:hAnsi="함초롬돋움" w:eastAsia="함초롬돋움" w:cs="함초롬돋움"/>
+          <w:rFonts w:ascii="바탕" w:hAnsi="바탕" w:eastAsia="바탕" w:cs="바탕"/>
           <w:sz w:val="18"/>
         </w:rPr>
         <w:t>, vol. 26, no. 6, Article 2006, 2026.</w:t>
@@ -3917,7 +3917,7 @@
       </w:pPr>
       <w:r>
         <w:rPr>
-          <w:rFonts w:ascii="함초롬돋움" w:hAnsi="함초롬돋움" w:eastAsia="함초롬돋움" w:cs="함초롬돋움"/>
+          <w:rFonts w:ascii="바탕" w:hAnsi="바탕" w:eastAsia="바탕" w:cs="바탕"/>
           <w:sz w:val="18"/>
         </w:rPr>
         <w:t>[8] N. Pipitone and G. H. Alami, “LegalBench-RAG: A Benchmark for Retrieval-Augmented Generation in the Legal Domain,” arXiv:2408.10343, 2024.</w:t>
@@ -3932,14 +3932,14 @@
       </w:pPr>
       <w:r>
         <w:rPr>
-          <w:rFonts w:ascii="함초롬돋움" w:hAnsi="함초롬돋움" w:eastAsia="함초롬돋움" w:cs="함초롬돋움"/>
+          <w:rFonts w:ascii="바탕" w:hAnsi="바탕" w:eastAsia="바탕" w:cs="바탕"/>
           <w:sz w:val="18"/>
         </w:rPr>
         <w:t xml:space="preserve">[9] 서준원, 민정혜, “한국어 법률 QA를 위한 하이브리드 RAG 시스템 최적화,” </w:t>
       </w:r>
       <w:r>
         <w:rPr>
-          <w:rFonts w:ascii="함초롬돋움" w:hAnsi="함초롬돋움" w:eastAsia="함초롬돋움" w:cs="함초롬돋움"/>
+          <w:rFonts w:ascii="바탕" w:hAnsi="바탕" w:eastAsia="바탕" w:cs="바탕"/>
           <w:i/>
           <w:sz w:val="18"/>
         </w:rPr>
@@ -3947,7 +3947,7 @@
       </w:r>
       <w:r>
         <w:rPr>
-          <w:rFonts w:ascii="함초롬돋움" w:hAnsi="함초롬돋움" w:eastAsia="함초롬돋움" w:cs="함초롬돋움"/>
+          <w:rFonts w:ascii="바탕" w:hAnsi="바탕" w:eastAsia="바탕" w:cs="바탕"/>
           <w:sz w:val="18"/>
         </w:rPr>
         <w:t>, 제30권, 제8호, pp. 53–63, 2025.</w:t>
@@ -3962,14 +3962,14 @@
       </w:pPr>
       <w:r>
         <w:rPr>
-          <w:rFonts w:ascii="함초롬돋움" w:hAnsi="함초롬돋움" w:eastAsia="함초롬돋움" w:cs="함초롬돋움"/>
+          <w:rFonts w:ascii="바탕" w:hAnsi="바탕" w:eastAsia="바탕" w:cs="바탕"/>
           <w:sz w:val="18"/>
         </w:rPr>
         <w:t xml:space="preserve">[10] S. Es, J. James, L. Espinosa Anke, and S. Schockaert, “RAGAs: Automated Evaluation of Retrieval Augmented Generation,” in </w:t>
       </w:r>
       <w:r>
         <w:rPr>
-          <w:rFonts w:ascii="함초롬돋움" w:hAnsi="함초롬돋움" w:eastAsia="함초롬돋움" w:cs="함초롬돋움"/>
+          <w:rFonts w:ascii="바탕" w:hAnsi="바탕" w:eastAsia="바탕" w:cs="바탕"/>
           <w:i/>
           <w:sz w:val="18"/>
         </w:rPr>
@@ -3977,7 +3977,7 @@
       </w:r>
       <w:r>
         <w:rPr>
-          <w:rFonts w:ascii="함초롬돋움" w:hAnsi="함초롬돋움" w:eastAsia="함초롬돋움" w:cs="함초롬돋움"/>
+          <w:rFonts w:ascii="바탕" w:hAnsi="바탕" w:eastAsia="바탕" w:cs="바탕"/>
           <w:sz w:val="18"/>
         </w:rPr>
         <w:t>, pp. 150–158, 2024.</w:t>
@@ -4345,7 +4345,7 @@
   <w:docDefaults>
     <w:rPrDefault>
       <w:rPr>
-        <w:rFonts w:ascii="Times New Roman" w:hAnsi="Times New Roman" w:eastAsia="바탕" w:cs="Times New Roman"/>
+        <w:rFonts w:ascii="바탕" w:hAnsi="바탕" w:eastAsia="바탕" w:cs="바탕"/>
         <w:sz w:val="20"/>
         <w:szCs w:val="20"/>
         <w:lang w:val="en-us" w:eastAsia="ko-kr" w:bidi="ar-sa"/>
@@ -4736,7 +4736,7 @@
     <w:name w:val="Normal"/>
     <w:qFormat/>
     <w:rPr>
-      <w:rFonts w:ascii="바탕" w:hAnsi="바탕" w:cs="바탕"/>
+      <w:rFonts w:ascii="바탕" w:hAnsi="바탕" w:cs="바탕" w:eastAsia="바탕"/>
       <w:kern w:val="1"/>
     </w:rPr>
   </w:style>
@@ -4756,7 +4756,7 @@
       <w:outlineLvl w:val="0"/>
     </w:pPr>
     <w:rPr>
-      <w:rFonts w:ascii="½Å¸íÁ¶" w:hAnsi="½Å¸íÁ¶" w:cs="½Å¸íÁ¶"/>
+      <w:rFonts w:ascii="바탕" w:hAnsi="바탕" w:cs="바탕" w:eastAsia="바탕"/>
       <w:b/>
       <w:bCs/>
     </w:rPr>
@@ -4815,7 +4815,7 @@
       <w:ind w:left="288" w:hanging="288"/>
     </w:pPr>
     <w:rPr>
-      <w:rFonts w:ascii="Times New Roman" w:hAnsi="Times New Roman" w:eastAsia="바탕체" w:cs="Times New Roman"/>
+      <w:rFonts w:ascii="바탕" w:hAnsi="바탕" w:eastAsia="바탕" w:cs="바탕"/>
     </w:rPr>
   </w:style>
   <w:style w:type="paragraph" w:styleId="para7" w:customStyle="1">
@@ -4830,7 +4830,7 @@
       <w:ind w:left="340" w:hanging="340"/>
     </w:pPr>
     <w:rPr>
-      <w:rFonts w:ascii="Times New Roman" w:hAnsi="Times New Roman" w:eastAsia="바탕체" w:cs="Times New Roman"/>
+      <w:rFonts w:ascii="바탕" w:hAnsi="바탕" w:eastAsia="바탕" w:cs="바탕"/>
       <w:sz w:val="18"/>
       <w:szCs w:val="18"/>
     </w:rPr>
@@ -4845,7 +4845,7 @@
       <w:jc w:val="left"/>
     </w:pPr>
     <w:rPr>
-      <w:rFonts w:ascii="굴림" w:hAnsi="굴림" w:eastAsia="굴림" w:cs="굴림"/>
+      <w:rFonts w:ascii="바탕" w:hAnsi="바탕" w:eastAsia="바탕" w:cs="바탕"/>
       <w:sz w:val="24"/>
       <w:szCs w:val="24"/>
     </w:rPr>

</xml_diff>

<commit_message>
paper: Times New Roman for Latin text in v2
</commit_message>
<xml_diff>
--- a/paper/final/다알지_논문_v2.docx
+++ b/paper/final/다알지_논문_v2.docx
@@ -70,7 +70,7 @@
               <w:spacing w:line="276" w:lineRule="auto"/>
               <w:jc w:val="center"/>
               <w:rPr>
-                <w:rFonts w:ascii="바탕" w:hAnsi="바탕" w:eastAsia="바탕" w:cs="바탕"/>
+                <w:rFonts w:ascii="Times New Roman" w:hAnsi="Times New Roman" w:eastAsia="바탕" w:cs="Times New Roman"/>
                 <w:b/>
                 <w:bCs/>
                 <w:sz w:val="32"/>
@@ -79,7 +79,7 @@
             </w:pPr>
             <w:r>
               <w:rPr>
-                <w:rFonts w:ascii="바탕" w:hAnsi="바탕" w:eastAsia="바탕" w:cs="바탕"/>
+                <w:rFonts w:ascii="Times New Roman" w:hAnsi="Times New Roman" w:eastAsia="바탕" w:cs="Times New Roman"/>
                 <w:b/>
                 <w:bCs/>
                 <w:sz w:val="32"/>
@@ -97,7 +97,7 @@
               <w:spacing w:line="276" w:lineRule="auto"/>
               <w:jc w:val="center"/>
               <w:rPr>
-                <w:rFonts w:ascii="바탕" w:hAnsi="바탕" w:eastAsia="바탕" w:cs="바탕"/>
+                <w:rFonts w:ascii="Times New Roman" w:hAnsi="Times New Roman" w:eastAsia="바탕" w:cs="Times New Roman"/>
                 <w:sz w:val="40"/>
                 <w:szCs w:val="40"/>
                 <w:vertAlign w:val="superscript"/>
@@ -105,7 +105,7 @@
             </w:pPr>
             <w:r>
               <w:rPr>
-                <w:rFonts w:ascii="바탕" w:hAnsi="바탕" w:eastAsia="바탕" w:cs="바탕"/>
+                <w:rFonts w:ascii="Times New Roman" w:hAnsi="Times New Roman" w:eastAsia="바탕" w:cs="Times New Roman"/>
                 <w:b/>
                 <w:bCs/>
                 <w:sz w:val="32"/>
@@ -117,7 +117,7 @@
             </w:r>
             <w:r>
               <w:rPr>
-                <w:rFonts w:ascii="바탕" w:hAnsi="바탕" w:eastAsia="바탕" w:cs="바탕"/>
+                <w:rFonts w:ascii="Times New Roman" w:hAnsi="Times New Roman" w:eastAsia="바탕" w:cs="Times New Roman"/>
                 <w:sz w:val="40"/>
                 <w:szCs w:val="40"/>
                 <w:vertAlign w:val="superscript"/>
@@ -181,12 +181,12 @@
               <w:spacing w:line="276" w:lineRule="auto"/>
               <w:jc w:val="center"/>
               <w:rPr>
-                <w:rFonts w:ascii="바탕" w:hAnsi="바탕" w:eastAsia="바탕" w:cs="바탕"/>
-              </w:rPr>
-            </w:pPr>
-            <w:r>
-              <w:rPr>
-                <w:rFonts w:ascii="바탕" w:hAnsi="바탕" w:eastAsia="바탕" w:cs="바탕"/>
+                <w:rFonts w:ascii="Times New Roman" w:hAnsi="Times New Roman" w:eastAsia="바탕" w:cs="Times New Roman"/>
+              </w:rPr>
+            </w:pPr>
+            <w:r>
+              <w:rPr>
+                <w:rFonts w:ascii="Times New Roman" w:hAnsi="Times New Roman" w:eastAsia="바탕" w:cs="Times New Roman"/>
               </w:rPr>
             </w:r>
           </w:p>
@@ -199,12 +199,12 @@
               <w:spacing w:line="276" w:lineRule="auto"/>
               <w:jc w:val="center"/>
               <w:rPr>
-                <w:rFonts w:ascii="바탕" w:hAnsi="바탕" w:eastAsia="바탕" w:cs="바탕"/>
-              </w:rPr>
-            </w:pPr>
-            <w:r>
-              <w:rPr>
-                <w:rFonts w:ascii="바탕" w:hAnsi="바탕" w:eastAsia="바탕" w:cs="바탕"/>
+                <w:rFonts w:ascii="Times New Roman" w:hAnsi="Times New Roman" w:eastAsia="바탕" w:cs="Times New Roman"/>
+              </w:rPr>
+            </w:pPr>
+            <w:r>
+              <w:rPr>
+                <w:rFonts w:ascii="Times New Roman" w:hAnsi="Times New Roman" w:eastAsia="바탕" w:cs="Times New Roman"/>
               </w:rPr>
             </w:r>
           </w:p>
@@ -217,12 +217,12 @@
               <w:spacing w:line="276" w:lineRule="auto"/>
               <w:jc w:val="center"/>
               <w:rPr>
-                <w:rFonts w:ascii="바탕" w:hAnsi="바탕" w:eastAsia="바탕" w:cs="바탕"/>
-              </w:rPr>
-            </w:pPr>
-            <w:r>
-              <w:rPr>
-                <w:rFonts w:ascii="바탕" w:hAnsi="바탕" w:eastAsia="바탕" w:cs="바탕"/>
+                <w:rFonts w:ascii="Times New Roman" w:hAnsi="Times New Roman" w:eastAsia="바탕" w:cs="Times New Roman"/>
+              </w:rPr>
+            </w:pPr>
+            <w:r>
+              <w:rPr>
+                <w:rFonts w:ascii="Times New Roman" w:hAnsi="Times New Roman" w:eastAsia="바탕" w:cs="Times New Roman"/>
               </w:rPr>
             </w:r>
           </w:p>
@@ -280,7 +280,7 @@
               <w:spacing/>
               <w:jc w:val="center"/>
               <w:rPr>
-                <w:rFonts w:ascii="바탕" w:hAnsi="바탕" w:eastAsia="바탕" w:cs="바탕"/>
+                <w:rFonts w:ascii="Times New Roman" w:hAnsi="Times New Roman" w:eastAsia="바탕" w:cs="Times New Roman"/>
                 <w:b/>
                 <w:sz w:val="28"/>
                 <w:szCs w:val="32"/>
@@ -288,7 +288,7 @@
             </w:pPr>
             <w:r>
               <w:rPr>
-                <w:rFonts w:ascii="바탕" w:hAnsi="바탕" w:eastAsia="바탕" w:cs="바탕"/>
+                <w:rFonts w:ascii="Times New Roman" w:hAnsi="Times New Roman" w:eastAsia="바탕" w:cs="Times New Roman"/>
                 <w:b/>
                 <w:sz w:val="28"/>
                 <w:szCs w:val="32"/>
@@ -299,7 +299,7 @@
             </w:r>
             <w:r>
               <w:rPr>
-                <w:rFonts w:ascii="바탕" w:hAnsi="바탕" w:eastAsia="바탕" w:cs="바탕"/>
+                <w:rFonts w:ascii="Times New Roman" w:hAnsi="Times New Roman" w:eastAsia="바탕" w:cs="Times New Roman"/>
                 <w:b/>
                 <w:sz w:val="28"/>
                 <w:szCs w:val="32"/>
@@ -363,12 +363,12 @@
               <w:wordWrap w:val="1"/>
               <w:spacing w:line="276" w:lineRule="auto"/>
               <w:rPr>
-                <w:rFonts w:cs="바탕" w:ascii="바탕" w:hAnsi="바탕" w:eastAsia="바탕"/>
-              </w:rPr>
-            </w:pPr>
-            <w:r>
-              <w:rPr>
-                <w:rFonts w:cs="바탕" w:ascii="바탕" w:hAnsi="바탕" w:eastAsia="바탕"/>
+                <w:rFonts w:cs="Times New Roman" w:ascii="Times New Roman" w:hAnsi="Times New Roman" w:eastAsia="바탕"/>
+              </w:rPr>
+            </w:pPr>
+            <w:r>
+              <w:rPr>
+                <w:rFonts w:cs="Times New Roman" w:ascii="Times New Roman" w:hAnsi="Times New Roman" w:eastAsia="바탕"/>
               </w:rPr>
             </w:r>
           </w:p>
@@ -397,14 +397,14 @@
               <w:spacing w:line="276" w:lineRule="auto"/>
               <w:jc w:val="center"/>
               <w:rPr>
-                <w:rFonts w:ascii="바탕" w:hAnsi="바탕" w:eastAsia="바탕" w:cs="바탕"/>
+                <w:rFonts w:ascii="Times New Roman" w:hAnsi="Times New Roman" w:eastAsia="바탕" w:cs="Times New Roman"/>
                 <w:b/>
                 <w:bCs/>
               </w:rPr>
             </w:pPr>
             <w:r>
               <w:rPr>
-                <w:rFonts w:ascii="바탕" w:hAnsi="바탕" w:eastAsia="바탕" w:cs="바탕"/>
+                <w:rFonts w:ascii="Times New Roman" w:hAnsi="Times New Roman" w:eastAsia="바탕" w:cs="Times New Roman"/>
                 <w:b/>
                 <w:bCs/>
               </w:rPr>
@@ -412,7 +412,7 @@
             </w:r>
             <w:r>
               <w:rPr>
-                <w:rFonts w:ascii="바탕" w:hAnsi="바탕" w:eastAsia="바탕" w:cs="바탕"/>
+                <w:rFonts w:ascii="Times New Roman" w:hAnsi="Times New Roman" w:eastAsia="바탕" w:cs="Times New Roman"/>
                 <w:b/>
                 <w:bCs/>
               </w:rPr>
@@ -420,7 +420,7 @@
             </w:r>
             <w:r>
               <w:rPr>
-                <w:rFonts w:ascii="바탕" w:hAnsi="바탕" w:eastAsia="바탕" w:cs="바탕"/>
+                <w:rFonts w:ascii="Times New Roman" w:hAnsi="Times New Roman" w:eastAsia="바탕" w:cs="Times New Roman"/>
                 <w:b/>
                 <w:bCs/>
               </w:rPr>
@@ -428,7 +428,7 @@
             </w:r>
             <w:r>
               <w:rPr>
-                <w:rFonts w:ascii="바탕" w:hAnsi="바탕" w:eastAsia="바탕" w:cs="바탕"/>
+                <w:rFonts w:ascii="Times New Roman" w:hAnsi="Times New Roman" w:eastAsia="바탕" w:cs="Times New Roman"/>
                 <w:b/>
                 <w:bCs/>
               </w:rPr>
@@ -440,14 +440,14 @@
               <w:spacing w:line="276" w:lineRule="auto"/>
               <w:ind w:firstLine="97"/>
               <w:rPr>
-                <w:rFonts w:ascii="바탕" w:hAnsi="바탕" w:eastAsia="바탕" w:cs="바탕"/>
+                <w:rFonts w:ascii="Times New Roman" w:hAnsi="Times New Roman" w:eastAsia="바탕" w:cs="Times New Roman"/>
                 <w:sz w:val="18"/>
                 <w:szCs w:val="18"/>
               </w:rPr>
             </w:pPr>
             <w:r>
               <w:rPr>
-                <w:rFonts w:ascii="바탕" w:hAnsi="바탕" w:eastAsia="바탕" w:cs="바탕"/>
+                <w:rFonts w:ascii="Times New Roman" w:hAnsi="Times New Roman" w:eastAsia="바탕" w:cs="Times New Roman"/>
                 <w:sz w:val="18"/>
                 <w:szCs w:val="18"/>
               </w:rPr>
@@ -460,14 +460,14 @@
               <w:spacing w:line="276" w:lineRule="auto"/>
               <w:ind w:firstLine="90"/>
               <w:rPr>
-                <w:rFonts w:ascii="바탕" w:hAnsi="바탕" w:eastAsia="바탕" w:cs="바탕"/>
+                <w:rFonts w:ascii="Times New Roman" w:hAnsi="Times New Roman" w:eastAsia="바탕" w:cs="Times New Roman"/>
                 <w:sz w:val="18"/>
                 <w:szCs w:val="18"/>
               </w:rPr>
             </w:pPr>
             <w:r>
               <w:rPr>
-                <w:rFonts w:ascii="바탕" w:hAnsi="바탕" w:eastAsia="바탕" w:cs="바탕"/>
+                <w:rFonts w:ascii="Times New Roman" w:hAnsi="Times New Roman" w:eastAsia="바탕" w:cs="Times New Roman"/>
                 <w:sz w:val="18"/>
                 <w:szCs w:val="18"/>
               </w:rPr>
@@ -514,7 +514,7 @@
       </w:pPr>
       <w:r>
         <w:rPr>
-          <w:rFonts w:ascii="바탕" w:hAnsi="바탕" w:eastAsia="바탕" w:cs="바탕"/>
+          <w:rFonts w:ascii="Times New Roman" w:hAnsi="Times New Roman" w:eastAsia="바탕" w:cs="Times New Roman"/>
           <w:b/>
         </w:rPr>
         <w:t>1. 서론 및 관련 연구</w:t>
@@ -529,7 +529,7 @@
       </w:pPr>
       <w:r>
         <w:rPr>
-          <w:rFonts w:ascii="바탕" w:hAnsi="바탕" w:eastAsia="바탕" w:cs="바탕"/>
+          <w:rFonts w:ascii="Times New Roman" w:hAnsi="Times New Roman" w:eastAsia="바탕" w:cs="Times New Roman"/>
           <w:sz w:val="18"/>
         </w:rPr>
         <w:t>기관사와 관제원이 설비 고장 대응 절차를 확인하려면 현장 길라잡이의 구체적인 조치와 규정의 보고·운전 조건을 함께 찾아야 한다. 본 연구는 이러한 근거를 챗봇으로 찾을 때, 관리자가 등록한 문서 간 링크가 검색에 얼마나 도움이 되는지를 다룬다.</w:t>
@@ -542,20 +542,20 @@
         <w:spacing w:line="300" w:lineRule="exact"/>
         <w:ind w:firstLine="180"/>
         <w:rPr>
-          <w:rFonts w:ascii="바탕" w:hAnsi="바탕" w:eastAsia="바탕" w:cs="바탕"/>
+          <w:rFonts w:ascii="Times New Roman" w:hAnsi="Times New Roman" w:eastAsia="바탕" w:cs="Times New Roman"/>
           <w:sz w:val="18"/>
         </w:rPr>
       </w:pPr>
       <w:r>
         <w:rPr>
-          <w:rFonts w:ascii="바탕" w:hAnsi="바탕" w:eastAsia="바탕" w:cs="바탕"/>
+          <w:rFonts w:ascii="Times New Roman" w:hAnsi="Times New Roman" w:eastAsia="바탕" w:cs="Times New Roman"/>
           <w:sz w:val="18"/>
         </w:rPr>
         <w:t>검색 증강 생성(RAG)은 외부 문서에서 찾은 근거로 답변을 만들며[1], 최근에는 LLM으로 검색 후보의 순위를 다시 매기는 방식도 널리 쓰인다[2]. 문서 간 관계를 검색에 반영하려는 연구도 이어지고 있다. GraphRAG와 LightRAG는 문서에서 관계 그래프를 자동으로 구축하고[3,4], KG²RAG는 처음 찾은 청크에서 지식그래프를 따라 주변 청크로 검색 범위를 넓힌다[5]. 철도 분야에서는 공간 지식그래프를 탐색하는 CARAG와 출입문 고장 이력을 활용하는 도시철도 RAG가 제안되었고[6,7], 법률 분야에서도 근거 검색 평가셋과 한국어 하이브리드 검색 연구가 나왔다[8,9]. 다만 이들 방법은 문서 간 관계를 모델이 추출하거나 별도로 구축한 지식그래프에 의존한다. 본 시스템에서는 관리자가 규정과 길라잡이의 대응 구간을 직접 연결해 둔다. 본 연구는 새로운 그래프 알고리즘을 제안하기보다, 이렇게 사람이 등록한 링크로 검색을 확장했을 때 필요한 근거를 얼마나 더 찾을 수 있는지 살펴본다.</w:t>
       </w:r>
       <w:r>
         <w:rPr>
-          <w:rFonts w:ascii="바탕" w:hAnsi="바탕" w:eastAsia="바탕" w:cs="바탕"/>
+          <w:rFonts w:ascii="Times New Roman" w:hAnsi="Times New Roman" w:eastAsia="바탕" w:cs="Times New Roman"/>
           <w:sz w:val="18"/>
         </w:rPr>
       </w:r>
@@ -576,7 +576,7 @@
       </w:pPr>
       <w:r>
         <w:rPr>
-          <w:rFonts w:ascii="바탕" w:hAnsi="바탕" w:eastAsia="바탕" w:cs="바탕"/>
+          <w:rFonts w:ascii="Times New Roman" w:hAnsi="Times New Roman" w:eastAsia="바탕" w:cs="Times New Roman"/>
           <w:b/>
         </w:rPr>
         <w:t>2. 방법</w:t>
@@ -591,7 +591,7 @@
       </w:pPr>
       <w:r>
         <w:rPr>
-          <w:rFonts w:ascii="바탕" w:hAnsi="바탕" w:eastAsia="바탕" w:cs="바탕"/>
+          <w:rFonts w:ascii="Times New Roman" w:hAnsi="Times New Roman" w:eastAsia="바탕" w:cs="Times New Roman"/>
           <w:sz w:val="18"/>
         </w:rPr>
         <w:t>비교에는 일곱 가지 검색 방식을 사용했다. 기준선인 BM25와 Dense는 각각 어휘 일치와 임베딩 유사도로 문서 구간을 찾고, Hybrid는 두 점수를 0.6(Dense)과 0.4(BM25)의 가중치로 합친다. H+RR은 Hybrid로 찾은 상위 20개 후보를 LLM에 보여 주고, 질문에 직접 답하는 근거를 최대 5개까지 고르게 한 방식이다.</w:t>
@@ -606,7 +606,7 @@
       </w:pPr>
       <w:r>
         <w:rPr>
-          <w:rFonts w:ascii="바탕" w:hAnsi="바탕" w:eastAsia="바탕" w:cs="바탕"/>
+          <w:rFonts w:ascii="Times New Roman" w:hAnsi="Times New Roman" w:eastAsia="바탕" w:cs="Times New Roman"/>
           <w:sz w:val="18"/>
         </w:rPr>
         <w:t>link_all과 proposed는 H+RR이 고른 직접 근거를 그대로 두고, 여기에 승인 링크로 연결된 문서 구간을 최대 2단계까지 따라가 덧붙인다(그림 1). 두 방식은 연결 구간을 다루는 방법이 다르다. link_all은 연결된 구간을 모두 붙이되 전체 근거가 15개를 넘지 않도록 자르고, proposed는 연결 구간만 질문과의 관련성에 따라 다시 순위를 매겨 최대 10개를 고른다. H+RR은 LLM이 근거를 적게 고르는 경우가 많아 질의당 평균 근거 수가 링크 방식보다 적다. 근거 개수의 차이만으로 결과가 달라지는지 확인하기 위해, 선택된 근거가 3개보다 적으면 Hybrid 순위에서 모자란 만큼 채우는 K3를 함께 비교했다.</w:t>
@@ -685,7 +685,7 @@
       </w:pPr>
       <w:r>
         <w:rPr>
-          <w:rFonts w:ascii="바탕" w:hAnsi="바탕" w:eastAsia="바탕" w:cs="바탕"/>
+          <w:rFonts w:ascii="Times New Roman" w:hAnsi="Times New Roman" w:eastAsia="바탕" w:cs="Times New Roman"/>
           <w:sz w:val="18"/>
           <w:szCs w:val="18"/>
         </w:rPr>
@@ -693,7 +693,7 @@
       </w:r>
       <w:r>
         <w:rPr>
-          <w:rFonts w:ascii="바탕" w:hAnsi="바탕" w:eastAsia="바탕" w:cs="바탕"/>
+          <w:rFonts w:ascii="Times New Roman" w:hAnsi="Times New Roman" w:eastAsia="바탕" w:cs="Times New Roman"/>
           <w:sz w:val="18"/>
           <w:szCs w:val="18"/>
         </w:rPr>
@@ -702,7 +702,7 @@
       </w:r>
       <w:r>
         <w:rPr>
-          <w:rFonts w:ascii="바탕" w:hAnsi="바탕" w:eastAsia="바탕" w:cs="바탕"/>
+          <w:rFonts w:ascii="Times New Roman" w:hAnsi="Times New Roman" w:eastAsia="바탕" w:cs="Times New Roman"/>
           <w:sz w:val="18"/>
           <w:szCs w:val="18"/>
         </w:rPr>
@@ -731,7 +731,7 @@
       </w:pPr>
       <w:r>
         <w:rPr>
-          <w:rFonts w:ascii="바탕" w:hAnsi="바탕" w:eastAsia="바탕" w:cs="바탕"/>
+          <w:rFonts w:ascii="Times New Roman" w:hAnsi="Times New Roman" w:eastAsia="바탕" w:cs="Times New Roman"/>
           <w:b/>
         </w:rPr>
         <w:t>3. 평가 및 결과</w:t>
@@ -746,7 +746,7 @@
       </w:pPr>
       <w:r>
         <w:rPr>
-          <w:rFonts w:ascii="바탕" w:hAnsi="바탕" w:eastAsia="바탕" w:cs="바탕"/>
+          <w:rFonts w:ascii="Times New Roman" w:hAnsi="Times New Roman" w:eastAsia="바탕" w:cs="Times New Roman"/>
           <w:sz w:val="18"/>
         </w:rPr>
         <w:t>평가에는 질의 37건을 사용했다. 기존 사례 17건은 시스템 개발 과정에서 만든 질의이고(문서형 12건, 그래프형 5건), 나머지 20건은 LLM으로 초안을 작성한 신규 질의다(문서형 5건, 그래프형 15건). 문서형은 한 문서 안에서 답을 찾을 수 있는 질의이고, 그래프형은 링크로 연결된 다른 문서의 구간까지 봐야 답할 수 있는 질의다. 신규 그래프형 15건은 승인 링크 하나를 정한 뒤 그 양쪽 원문을 바탕으로 만들었다. 링크로 연결된 구간 가운데 정답에 해당하는 구간은 따로 '링크 정답 근거'로 표시했다. 신규 20건은 철도 운영기관의 현업 전문가 1인이 체크리스트로 검토했다. 질문이 현실적인지, 정답 근거와 참조 답변이 정확한지, 링크가 실제로 필요한지를 확인했으며, 모두 적합 판정을 받아 고치거나 뺀 사례는 없었다. 링크의 효과를 보려는 것이므로 결과는 그래프형 20건을 중심으로 보고한다.</w:t>
@@ -761,7 +761,7 @@
       </w:pPr>
       <w:r>
         <w:rPr>
-          <w:rFonts w:ascii="바탕" w:hAnsi="바탕" w:eastAsia="바탕" w:cs="바탕"/>
+          <w:rFonts w:ascii="Times New Roman" w:hAnsi="Times New Roman" w:eastAsia="바탕" w:cs="Times New Roman"/>
           <w:sz w:val="18"/>
         </w:rPr>
         <w:t>일곱 가지 방식으로 37건을 각각 세 번씩 검색했고, 검색 지표는 세 번의 평균으로 보고한다. 답변은 gpt-5.6-luna로 생성했고, 같은 모델을 평가자로 쓰는 RAGAS[10]로 채점했다. 임베딩은 text-embedding-3-small(검색)과 text-embedding-3-large(평가)를 썼다. 실험에 쓴 승인 링크는 36개이며, 재현을 위해 평가 시점의 링크 목록과 해시를 따로 보관했다.</w:t>
@@ -776,7 +776,7 @@
       </w:pPr>
       <w:r>
         <w:rPr>
-          <w:rFonts w:ascii="바탕" w:hAnsi="바탕" w:eastAsia="바탕" w:cs="바탕"/>
+          <w:rFonts w:ascii="Times New Roman" w:hAnsi="Times New Roman" w:eastAsia="바탕" w:cs="Times New Roman"/>
           <w:sz w:val="18"/>
         </w:rPr>
         <w:t>그래프형 질의 20건의 검색 결과를 표 1에 정리했다. 링크를 쓰지 않는 방식 가운데서는 K3의 Recall이 0.618로 가장 높았고, 링크로 확장한 link_all과 proposed는 각각 0.850과 0.839였다. 링크 정답 근거만 보면 차이가 더 커서, K3는 0.225에 그친 반면 link_all은 0.750이었다. 출처별로 나눈 표 2에서도 link_all의 Recall은 K3보다 기존 사례에서 0.128, 신규 사례에서 0.267 높았다.</w:t>
@@ -796,7 +796,7 @@
       </w:pPr>
       <w:r>
         <w:rPr>
-          <w:rFonts w:ascii="바탕" w:hAnsi="바탕" w:eastAsia="바탕" w:cs="바탕"/>
+          <w:rFonts w:ascii="Times New Roman" w:hAnsi="Times New Roman" w:eastAsia="바탕" w:cs="Times New Roman"/>
           <w:sz w:val="18"/>
           <w:szCs w:val="18"/>
         </w:rPr>
@@ -854,7 +854,7 @@
             </w:pPr>
             <w:r>
               <w:rPr>
-                <w:rFonts w:ascii="바탕" w:hAnsi="바탕" w:eastAsia="바탕" w:cs="바탕"/>
+                <w:rFonts w:ascii="Times New Roman" w:hAnsi="Times New Roman" w:eastAsia="바탕" w:cs="Times New Roman"/>
                 <w:b/>
                 <w:sz w:val="18"/>
               </w:rPr>
@@ -888,7 +888,7 @@
             </w:pPr>
             <w:r>
               <w:rPr>
-                <w:rFonts w:ascii="바탕" w:hAnsi="바탕" w:eastAsia="바탕" w:cs="바탕"/>
+                <w:rFonts w:ascii="Times New Roman" w:hAnsi="Times New Roman" w:eastAsia="바탕" w:cs="Times New Roman"/>
                 <w:b/>
                 <w:sz w:val="18"/>
               </w:rPr>
@@ -922,7 +922,7 @@
             </w:pPr>
             <w:r>
               <w:rPr>
-                <w:rFonts w:ascii="바탕" w:hAnsi="바탕" w:eastAsia="바탕" w:cs="바탕"/>
+                <w:rFonts w:ascii="Times New Roman" w:hAnsi="Times New Roman" w:eastAsia="바탕" w:cs="Times New Roman"/>
                 <w:b/>
                 <w:sz w:val="18"/>
               </w:rPr>
@@ -933,7 +933,7 @@
             </w:r>
             <w:r>
               <w:rPr>
-                <w:rFonts w:ascii="바탕" w:hAnsi="바탕" w:eastAsia="바탕" w:cs="바탕"/>
+                <w:rFonts w:ascii="Times New Roman" w:hAnsi="Times New Roman" w:eastAsia="바탕" w:cs="Times New Roman"/>
                 <w:b/>
                 <w:sz w:val="18"/>
               </w:rPr>
@@ -967,7 +967,7 @@
             </w:pPr>
             <w:r>
               <w:rPr>
-                <w:rFonts w:ascii="바탕" w:hAnsi="바탕" w:eastAsia="바탕" w:cs="바탕"/>
+                <w:rFonts w:ascii="Times New Roman" w:hAnsi="Times New Roman" w:eastAsia="바탕" w:cs="Times New Roman"/>
                 <w:b/>
                 <w:sz w:val="18"/>
               </w:rPr>
@@ -978,7 +978,7 @@
             </w:r>
             <w:r>
               <w:rPr>
-                <w:rFonts w:ascii="바탕" w:hAnsi="바탕" w:eastAsia="바탕" w:cs="바탕"/>
+                <w:rFonts w:ascii="Times New Roman" w:hAnsi="Times New Roman" w:eastAsia="바탕" w:cs="Times New Roman"/>
                 <w:b/>
                 <w:sz w:val="18"/>
               </w:rPr>
@@ -1019,7 +1019,7 @@
             </w:pPr>
             <w:r>
               <w:rPr>
-                <w:rFonts w:ascii="바탕" w:hAnsi="바탕" w:eastAsia="바탕" w:cs="바탕"/>
+                <w:rFonts w:ascii="Times New Roman" w:hAnsi="Times New Roman" w:eastAsia="바탕" w:cs="Times New Roman"/>
                 <w:sz w:val="18"/>
               </w:rPr>
               <w:t>BM25</w:t>
@@ -1052,7 +1052,7 @@
             </w:pPr>
             <w:r>
               <w:rPr>
-                <w:rFonts w:ascii="바탕" w:hAnsi="바탕" w:eastAsia="바탕" w:cs="바탕"/>
+                <w:rFonts w:ascii="Times New Roman" w:hAnsi="Times New Roman" w:eastAsia="바탕" w:cs="Times New Roman"/>
                 <w:sz w:val="18"/>
               </w:rPr>
               <w:t>0.592±.000</w:t>
@@ -1085,7 +1085,7 @@
             </w:pPr>
             <w:r>
               <w:rPr>
-                <w:rFonts w:ascii="바탕" w:hAnsi="바탕" w:eastAsia="바탕" w:cs="바탕"/>
+                <w:rFonts w:ascii="Times New Roman" w:hAnsi="Times New Roman" w:eastAsia="바탕" w:cs="Times New Roman"/>
                 <w:sz w:val="18"/>
               </w:rPr>
               <w:t>0.275±.000</w:t>
@@ -1118,7 +1118,7 @@
             </w:pPr>
             <w:r>
               <w:rPr>
-                <w:rFonts w:ascii="바탕" w:hAnsi="바탕" w:eastAsia="바탕" w:cs="바탕"/>
+                <w:rFonts w:ascii="Times New Roman" w:hAnsi="Times New Roman" w:eastAsia="바탕" w:cs="Times New Roman"/>
                 <w:sz w:val="18"/>
               </w:rPr>
               <w:t>5.00±.00</w:t>
@@ -1158,7 +1158,7 @@
             </w:pPr>
             <w:r>
               <w:rPr>
-                <w:rFonts w:ascii="바탕" w:hAnsi="바탕" w:eastAsia="바탕" w:cs="바탕"/>
+                <w:rFonts w:ascii="Times New Roman" w:hAnsi="Times New Roman" w:eastAsia="바탕" w:cs="Times New Roman"/>
                 <w:sz w:val="18"/>
               </w:rPr>
               <w:t>Dense</w:t>
@@ -1191,7 +1191,7 @@
             </w:pPr>
             <w:r>
               <w:rPr>
-                <w:rFonts w:ascii="바탕" w:hAnsi="바탕" w:eastAsia="바탕" w:cs="바탕"/>
+                <w:rFonts w:ascii="Times New Roman" w:hAnsi="Times New Roman" w:eastAsia="바탕" w:cs="Times New Roman"/>
                 <w:sz w:val="18"/>
               </w:rPr>
               <w:t>0.383±.000</w:t>
@@ -1224,7 +1224,7 @@
             </w:pPr>
             <w:r>
               <w:rPr>
-                <w:rFonts w:ascii="바탕" w:hAnsi="바탕" w:eastAsia="바탕" w:cs="바탕"/>
+                <w:rFonts w:ascii="Times New Roman" w:hAnsi="Times New Roman" w:eastAsia="바탕" w:cs="Times New Roman"/>
                 <w:sz w:val="18"/>
               </w:rPr>
               <w:t>0.000±.000</w:t>
@@ -1257,7 +1257,7 @@
             </w:pPr>
             <w:r>
               <w:rPr>
-                <w:rFonts w:ascii="바탕" w:hAnsi="바탕" w:eastAsia="바탕" w:cs="바탕"/>
+                <w:rFonts w:ascii="Times New Roman" w:hAnsi="Times New Roman" w:eastAsia="바탕" w:cs="Times New Roman"/>
                 <w:sz w:val="18"/>
               </w:rPr>
               <w:t>5.00±.00</w:t>
@@ -1297,7 +1297,7 @@
             </w:pPr>
             <w:r>
               <w:rPr>
-                <w:rFonts w:ascii="바탕" w:hAnsi="바탕" w:eastAsia="바탕" w:cs="바탕"/>
+                <w:rFonts w:ascii="Times New Roman" w:hAnsi="Times New Roman" w:eastAsia="바탕" w:cs="Times New Roman"/>
                 <w:sz w:val="18"/>
               </w:rPr>
               <w:t>Hybrid</w:t>
@@ -1330,7 +1330,7 @@
             </w:pPr>
             <w:r>
               <w:rPr>
-                <w:rFonts w:ascii="바탕" w:hAnsi="바탕" w:eastAsia="바탕" w:cs="바탕"/>
+                <w:rFonts w:ascii="Times New Roman" w:hAnsi="Times New Roman" w:eastAsia="바탕" w:cs="Times New Roman"/>
                 <w:sz w:val="18"/>
               </w:rPr>
               <w:t>0.521±.000</w:t>
@@ -1363,7 +1363,7 @@
             </w:pPr>
             <w:r>
               <w:rPr>
-                <w:rFonts w:ascii="바탕" w:hAnsi="바탕" w:eastAsia="바탕" w:cs="바탕"/>
+                <w:rFonts w:ascii="Times New Roman" w:hAnsi="Times New Roman" w:eastAsia="바탕" w:cs="Times New Roman"/>
                 <w:sz w:val="18"/>
               </w:rPr>
               <w:t>0.150±.000</w:t>
@@ -1396,7 +1396,7 @@
             </w:pPr>
             <w:r>
               <w:rPr>
-                <w:rFonts w:ascii="바탕" w:hAnsi="바탕" w:eastAsia="바탕" w:cs="바탕"/>
+                <w:rFonts w:ascii="Times New Roman" w:hAnsi="Times New Roman" w:eastAsia="바탕" w:cs="Times New Roman"/>
                 <w:sz w:val="18"/>
               </w:rPr>
               <w:t>5.00±.00</w:t>
@@ -1436,7 +1436,7 @@
             </w:pPr>
             <w:r>
               <w:rPr>
-                <w:rFonts w:ascii="바탕" w:hAnsi="바탕" w:eastAsia="바탕" w:cs="바탕"/>
+                <w:rFonts w:ascii="Times New Roman" w:hAnsi="Times New Roman" w:eastAsia="바탕" w:cs="Times New Roman"/>
                 <w:sz w:val="18"/>
               </w:rPr>
               <w:t>H+RR</w:t>
@@ -1469,7 +1469,7 @@
             </w:pPr>
             <w:r>
               <w:rPr>
-                <w:rFonts w:ascii="바탕" w:hAnsi="바탕" w:eastAsia="바탕" w:cs="바탕"/>
+                <w:rFonts w:ascii="Times New Roman" w:hAnsi="Times New Roman" w:eastAsia="바탕" w:cs="Times New Roman"/>
                 <w:sz w:val="18"/>
               </w:rPr>
               <w:t>0.586±.019</w:t>
@@ -1502,7 +1502,7 @@
             </w:pPr>
             <w:r>
               <w:rPr>
-                <w:rFonts w:ascii="바탕" w:hAnsi="바탕" w:eastAsia="바탕" w:cs="바탕"/>
+                <w:rFonts w:ascii="Times New Roman" w:hAnsi="Times New Roman" w:eastAsia="바탕" w:cs="Times New Roman"/>
                 <w:sz w:val="18"/>
               </w:rPr>
               <w:t>0.233±.014</w:t>
@@ -1535,7 +1535,7 @@
             </w:pPr>
             <w:r>
               <w:rPr>
-                <w:rFonts w:ascii="바탕" w:hAnsi="바탕" w:eastAsia="바탕" w:cs="바탕"/>
+                <w:rFonts w:ascii="Times New Roman" w:hAnsi="Times New Roman" w:eastAsia="바탕" w:cs="Times New Roman"/>
                 <w:sz w:val="18"/>
               </w:rPr>
               <w:t>2.08±.06</w:t>
@@ -1575,7 +1575,7 @@
             </w:pPr>
             <w:r>
               <w:rPr>
-                <w:rFonts w:ascii="바탕" w:hAnsi="바탕" w:eastAsia="바탕" w:cs="바탕"/>
+                <w:rFonts w:ascii="Times New Roman" w:hAnsi="Times New Roman" w:eastAsia="바탕" w:cs="Times New Roman"/>
                 <w:sz w:val="18"/>
               </w:rPr>
               <w:t>K3</w:t>
@@ -1608,7 +1608,7 @@
             </w:pPr>
             <w:r>
               <w:rPr>
-                <w:rFonts w:ascii="바탕" w:hAnsi="바탕" w:eastAsia="바탕" w:cs="바탕"/>
+                <w:rFonts w:ascii="Times New Roman" w:hAnsi="Times New Roman" w:eastAsia="바탕" w:cs="Times New Roman"/>
                 <w:sz w:val="18"/>
               </w:rPr>
               <w:t>0.618±.017</w:t>
@@ -1641,7 +1641,7 @@
             </w:pPr>
             <w:r>
               <w:rPr>
-                <w:rFonts w:ascii="바탕" w:hAnsi="바탕" w:eastAsia="바탕" w:cs="바탕"/>
+                <w:rFonts w:ascii="Times New Roman" w:hAnsi="Times New Roman" w:eastAsia="바탕" w:cs="Times New Roman"/>
                 <w:sz w:val="18"/>
               </w:rPr>
               <w:t>0.225±.043</w:t>
@@ -1674,7 +1674,7 @@
             </w:pPr>
             <w:r>
               <w:rPr>
-                <w:rFonts w:ascii="바탕" w:hAnsi="바탕" w:eastAsia="바탕" w:cs="바탕"/>
+                <w:rFonts w:ascii="Times New Roman" w:hAnsi="Times New Roman" w:eastAsia="바탕" w:cs="Times New Roman"/>
                 <w:sz w:val="18"/>
               </w:rPr>
               <w:t>3.15±.05</w:t>
@@ -1714,7 +1714,7 @@
             </w:pPr>
             <w:r>
               <w:rPr>
-                <w:rFonts w:ascii="바탕" w:hAnsi="바탕" w:eastAsia="바탕" w:cs="바탕"/>
+                <w:rFonts w:ascii="Times New Roman" w:hAnsi="Times New Roman" w:eastAsia="바탕" w:cs="Times New Roman"/>
                 <w:sz w:val="18"/>
               </w:rPr>
               <w:t>link_all</w:t>
@@ -1747,7 +1747,7 @@
             </w:pPr>
             <w:r>
               <w:rPr>
-                <w:rFonts w:ascii="바탕" w:hAnsi="바탕" w:eastAsia="바탕" w:cs="바탕"/>
+                <w:rFonts w:ascii="Times New Roman" w:hAnsi="Times New Roman" w:eastAsia="바탕" w:cs="Times New Roman"/>
                 <w:sz w:val="18"/>
               </w:rPr>
               <w:t>0.850±.014</w:t>
@@ -1780,7 +1780,7 @@
             </w:pPr>
             <w:r>
               <w:rPr>
-                <w:rFonts w:ascii="바탕" w:hAnsi="바탕" w:eastAsia="바탕" w:cs="바탕"/>
+                <w:rFonts w:ascii="Times New Roman" w:hAnsi="Times New Roman" w:eastAsia="바탕" w:cs="Times New Roman"/>
                 <w:sz w:val="18"/>
               </w:rPr>
               <w:t>0.750±.000</w:t>
@@ -1813,7 +1813,7 @@
             </w:pPr>
             <w:r>
               <w:rPr>
-                <w:rFonts w:ascii="바탕" w:hAnsi="바탕" w:eastAsia="바탕" w:cs="바탕"/>
+                <w:rFonts w:ascii="Times New Roman" w:hAnsi="Times New Roman" w:eastAsia="바탕" w:cs="Times New Roman"/>
                 <w:sz w:val="18"/>
               </w:rPr>
               <w:t>3.08±.03</w:t>
@@ -1853,7 +1853,7 @@
             </w:pPr>
             <w:r>
               <w:rPr>
-                <w:rFonts w:ascii="바탕" w:hAnsi="바탕" w:eastAsia="바탕" w:cs="바탕"/>
+                <w:rFonts w:ascii="Times New Roman" w:hAnsi="Times New Roman" w:eastAsia="바탕" w:cs="Times New Roman"/>
                 <w:sz w:val="18"/>
               </w:rPr>
               <w:t>proposed</w:t>
@@ -1886,7 +1886,7 @@
             </w:pPr>
             <w:r>
               <w:rPr>
-                <w:rFonts w:ascii="바탕" w:hAnsi="바탕" w:eastAsia="바탕" w:cs="바탕"/>
+                <w:rFonts w:ascii="Times New Roman" w:hAnsi="Times New Roman" w:eastAsia="바탕" w:cs="Times New Roman"/>
                 <w:sz w:val="18"/>
               </w:rPr>
               <w:t>0.839±.046</w:t>
@@ -1919,7 +1919,7 @@
             </w:pPr>
             <w:r>
               <w:rPr>
-                <w:rFonts w:ascii="바탕" w:hAnsi="바탕" w:eastAsia="바탕" w:cs="바탕"/>
+                <w:rFonts w:ascii="Times New Roman" w:hAnsi="Times New Roman" w:eastAsia="바탕" w:cs="Times New Roman"/>
                 <w:sz w:val="18"/>
               </w:rPr>
               <w:t>0.708±.063</w:t>
@@ -1952,7 +1952,7 @@
             </w:pPr>
             <w:r>
               <w:rPr>
-                <w:rFonts w:ascii="바탕" w:hAnsi="바탕" w:eastAsia="바탕" w:cs="바탕"/>
+                <w:rFonts w:ascii="Times New Roman" w:hAnsi="Times New Roman" w:eastAsia="바탕" w:cs="Times New Roman"/>
                 <w:sz w:val="18"/>
               </w:rPr>
               <w:t>3.00±.17</w:t>
@@ -1982,7 +1982,7 @@
       </w:pPr>
       <w:r>
         <w:rPr>
-          <w:rFonts w:ascii="바탕" w:hAnsi="바탕" w:eastAsia="바탕" w:cs="바탕"/>
+          <w:rFonts w:ascii="Times New Roman" w:hAnsi="Times New Roman" w:eastAsia="바탕" w:cs="Times New Roman"/>
           <w:sz w:val="18"/>
           <w:szCs w:val="18"/>
         </w:rPr>
@@ -2045,7 +2045,7 @@
             </w:pPr>
             <w:r>
               <w:rPr>
-                <w:rFonts w:ascii="바탕" w:hAnsi="바탕" w:eastAsia="바탕" w:cs="바탕"/>
+                <w:rFonts w:ascii="Times New Roman" w:hAnsi="Times New Roman" w:eastAsia="바탕" w:cs="Times New Roman"/>
                 <w:b/>
                 <w:sz w:val="18"/>
               </w:rPr>
@@ -2079,7 +2079,7 @@
             </w:pPr>
             <w:r>
               <w:rPr>
-                <w:rFonts w:ascii="바탕" w:hAnsi="바탕" w:eastAsia="바탕" w:cs="바탕"/>
+                <w:rFonts w:ascii="Times New Roman" w:hAnsi="Times New Roman" w:eastAsia="바탕" w:cs="Times New Roman"/>
                 <w:b/>
                 <w:sz w:val="18"/>
               </w:rPr>
@@ -2113,7 +2113,7 @@
             </w:pPr>
             <w:r>
               <w:rPr>
-                <w:rFonts w:ascii="바탕" w:hAnsi="바탕" w:eastAsia="바탕" w:cs="바탕"/>
+                <w:rFonts w:ascii="Times New Roman" w:hAnsi="Times New Roman" w:eastAsia="바탕" w:cs="Times New Roman"/>
                 <w:b/>
                 <w:sz w:val="18"/>
               </w:rPr>
@@ -2153,7 +2153,7 @@
             </w:pPr>
             <w:r>
               <w:rPr>
-                <w:rFonts w:ascii="바탕" w:hAnsi="바탕" w:eastAsia="바탕" w:cs="바탕"/>
+                <w:rFonts w:ascii="Times New Roman" w:hAnsi="Times New Roman" w:eastAsia="바탕" w:cs="Times New Roman"/>
                 <w:b/>
                 <w:sz w:val="18"/>
               </w:rPr>
@@ -2194,7 +2194,7 @@
             </w:pPr>
             <w:r>
               <w:rPr>
-                <w:rFonts w:ascii="바탕" w:hAnsi="바탕" w:eastAsia="바탕" w:cs="바탕"/>
+                <w:rFonts w:ascii="Times New Roman" w:hAnsi="Times New Roman" w:eastAsia="바탕" w:cs="Times New Roman"/>
                 <w:sz w:val="18"/>
               </w:rPr>
               <w:t>L − K3</w:t>
@@ -2227,7 +2227,7 @@
             </w:pPr>
             <w:r>
               <w:rPr>
-                <w:rFonts w:ascii="바탕" w:hAnsi="바탕" w:eastAsia="바탕" w:cs="바탕"/>
+                <w:rFonts w:ascii="Times New Roman" w:hAnsi="Times New Roman" w:eastAsia="바탕" w:cs="Times New Roman"/>
                 <w:sz w:val="18"/>
               </w:rPr>
               <w:t>+0.128</w:t>
@@ -2237,7 +2237,7 @@
             </w:r>
             <w:r>
               <w:rPr>
-                <w:rFonts w:ascii="바탕" w:hAnsi="바탕" w:eastAsia="바탕" w:cs="바탕"/>
+                <w:rFonts w:ascii="Times New Roman" w:hAnsi="Times New Roman" w:eastAsia="바탕" w:cs="Times New Roman"/>
                 <w:sz w:val="18"/>
               </w:rPr>
               <w:t>[+0.017, +0.244]</w:t>
@@ -2270,7 +2270,7 @@
             </w:pPr>
             <w:r>
               <w:rPr>
-                <w:rFonts w:ascii="바탕" w:hAnsi="바탕" w:eastAsia="바탕" w:cs="바탕"/>
+                <w:rFonts w:ascii="Times New Roman" w:hAnsi="Times New Roman" w:eastAsia="바탕" w:cs="Times New Roman"/>
                 <w:sz w:val="18"/>
               </w:rPr>
               <w:t>+0.367</w:t>
@@ -2280,7 +2280,7 @@
             </w:r>
             <w:r>
               <w:rPr>
-                <w:rFonts w:ascii="바탕" w:hAnsi="바탕" w:eastAsia="바탕" w:cs="바탕"/>
+                <w:rFonts w:ascii="Times New Roman" w:hAnsi="Times New Roman" w:eastAsia="바탕" w:cs="Times New Roman"/>
                 <w:sz w:val="18"/>
               </w:rPr>
               <w:t>[+0.067, +0.700]</w:t>
@@ -2320,7 +2320,7 @@
             </w:pPr>
             <w:r>
               <w:rPr>
-                <w:rFonts w:ascii="바탕" w:hAnsi="바탕" w:eastAsia="바탕" w:cs="바탕"/>
+                <w:rFonts w:ascii="Times New Roman" w:hAnsi="Times New Roman" w:eastAsia="바탕" w:cs="Times New Roman"/>
                 <w:sz w:val="18"/>
               </w:rPr>
               <w:t>P − K3</w:t>
@@ -2353,7 +2353,7 @@
             </w:pPr>
             <w:r>
               <w:rPr>
-                <w:rFonts w:ascii="바탕" w:hAnsi="바탕" w:eastAsia="바탕" w:cs="바탕"/>
+                <w:rFonts w:ascii="Times New Roman" w:hAnsi="Times New Roman" w:eastAsia="바탕" w:cs="Times New Roman"/>
                 <w:sz w:val="18"/>
               </w:rPr>
               <w:t>+0.150</w:t>
@@ -2363,7 +2363,7 @@
             </w:r>
             <w:r>
               <w:rPr>
-                <w:rFonts w:ascii="바탕" w:hAnsi="바탕" w:eastAsia="바탕" w:cs="바탕"/>
+                <w:rFonts w:ascii="Times New Roman" w:hAnsi="Times New Roman" w:eastAsia="바탕" w:cs="Times New Roman"/>
                 <w:sz w:val="18"/>
               </w:rPr>
               <w:t>[+0.017, +0.283]</w:t>
@@ -2396,7 +2396,7 @@
             </w:pPr>
             <w:r>
               <w:rPr>
-                <w:rFonts w:ascii="바탕" w:hAnsi="바탕" w:eastAsia="바탕" w:cs="바탕"/>
+                <w:rFonts w:ascii="Times New Roman" w:hAnsi="Times New Roman" w:eastAsia="바탕" w:cs="Times New Roman"/>
                 <w:sz w:val="18"/>
               </w:rPr>
               <w:t>+0.400</w:t>
@@ -2406,7 +2406,7 @@
             </w:r>
             <w:r>
               <w:rPr>
-                <w:rFonts w:ascii="바탕" w:hAnsi="바탕" w:eastAsia="바탕" w:cs="바탕"/>
+                <w:rFonts w:ascii="Times New Roman" w:hAnsi="Times New Roman" w:eastAsia="바탕" w:cs="Times New Roman"/>
                 <w:sz w:val="18"/>
               </w:rPr>
               <w:t>[+0.100, +0.700]</w:t>
@@ -2446,7 +2446,7 @@
             </w:pPr>
             <w:r>
               <w:rPr>
-                <w:rFonts w:ascii="바탕" w:hAnsi="바탕" w:eastAsia="바탕" w:cs="바탕"/>
+                <w:rFonts w:ascii="Times New Roman" w:hAnsi="Times New Roman" w:eastAsia="바탕" w:cs="Times New Roman"/>
                 <w:sz w:val="18"/>
               </w:rPr>
               <w:t>P − L</w:t>
@@ -2479,7 +2479,7 @@
             </w:pPr>
             <w:r>
               <w:rPr>
-                <w:rFonts w:ascii="바탕" w:hAnsi="바탕" w:eastAsia="바탕" w:cs="바탕"/>
+                <w:rFonts w:ascii="Times New Roman" w:hAnsi="Times New Roman" w:eastAsia="바탕" w:cs="Times New Roman"/>
                 <w:sz w:val="18"/>
               </w:rPr>
               <w:t>+0.022</w:t>
@@ -2489,7 +2489,7 @@
             </w:r>
             <w:r>
               <w:rPr>
-                <w:rFonts w:ascii="바탕" w:hAnsi="바탕" w:eastAsia="바탕" w:cs="바탕"/>
+                <w:rFonts w:ascii="Times New Roman" w:hAnsi="Times New Roman" w:eastAsia="바탕" w:cs="Times New Roman"/>
                 <w:sz w:val="18"/>
               </w:rPr>
               <w:t>[+0.000, +0.067]</w:t>
@@ -2522,7 +2522,7 @@
             </w:pPr>
             <w:r>
               <w:rPr>
-                <w:rFonts w:ascii="바탕" w:hAnsi="바탕" w:eastAsia="바탕" w:cs="바탕"/>
+                <w:rFonts w:ascii="Times New Roman" w:hAnsi="Times New Roman" w:eastAsia="바탕" w:cs="Times New Roman"/>
                 <w:sz w:val="18"/>
               </w:rPr>
               <w:t>+0.033</w:t>
@@ -2532,7 +2532,7 @@
             </w:r>
             <w:r>
               <w:rPr>
-                <w:rFonts w:ascii="바탕" w:hAnsi="바탕" w:eastAsia="바탕" w:cs="바탕"/>
+                <w:rFonts w:ascii="Times New Roman" w:hAnsi="Times New Roman" w:eastAsia="바탕" w:cs="Times New Roman"/>
                 <w:sz w:val="18"/>
               </w:rPr>
               <w:t>[+0.000, +0.100]</w:t>
@@ -2571,7 +2571,7 @@
             </w:pPr>
             <w:r>
               <w:rPr>
-                <w:rFonts w:ascii="바탕" w:hAnsi="바탕" w:eastAsia="바탕" w:cs="바탕"/>
+                <w:rFonts w:ascii="Times New Roman" w:hAnsi="Times New Roman" w:eastAsia="바탕" w:cs="Times New Roman"/>
                 <w:b/>
                 <w:sz w:val="18"/>
               </w:rPr>
@@ -2612,7 +2612,7 @@
             </w:pPr>
             <w:r>
               <w:rPr>
-                <w:rFonts w:ascii="바탕" w:hAnsi="바탕" w:eastAsia="바탕" w:cs="바탕"/>
+                <w:rFonts w:ascii="Times New Roman" w:hAnsi="Times New Roman" w:eastAsia="바탕" w:cs="Times New Roman"/>
                 <w:sz w:val="18"/>
               </w:rPr>
               <w:t>L − K3</w:t>
@@ -2645,7 +2645,7 @@
             </w:pPr>
             <w:r>
               <w:rPr>
-                <w:rFonts w:ascii="바탕" w:hAnsi="바탕" w:eastAsia="바탕" w:cs="바탕"/>
+                <w:rFonts w:ascii="Times New Roman" w:hAnsi="Times New Roman" w:eastAsia="바탕" w:cs="Times New Roman"/>
                 <w:sz w:val="18"/>
               </w:rPr>
               <w:t>+0.267</w:t>
@@ -2655,7 +2655,7 @@
             </w:r>
             <w:r>
               <w:rPr>
-                <w:rFonts w:ascii="바탕" w:hAnsi="바탕" w:eastAsia="바탕" w:cs="바탕"/>
+                <w:rFonts w:ascii="Times New Roman" w:hAnsi="Times New Roman" w:eastAsia="바탕" w:cs="Times New Roman"/>
                 <w:sz w:val="18"/>
               </w:rPr>
               <w:t>[+0.083, +0.440]</w:t>
@@ -2688,7 +2688,7 @@
             </w:pPr>
             <w:r>
               <w:rPr>
-                <w:rFonts w:ascii="바탕" w:hAnsi="바탕" w:eastAsia="바탕" w:cs="바탕"/>
+                <w:rFonts w:ascii="Times New Roman" w:hAnsi="Times New Roman" w:eastAsia="바탕" w:cs="Times New Roman"/>
                 <w:sz w:val="18"/>
               </w:rPr>
               <w:t>+0.578</w:t>
@@ -2698,7 +2698,7 @@
             </w:r>
             <w:r>
               <w:rPr>
-                <w:rFonts w:ascii="바탕" w:hAnsi="바탕" w:eastAsia="바탕" w:cs="바탕"/>
+                <w:rFonts w:ascii="Times New Roman" w:hAnsi="Times New Roman" w:eastAsia="바탕" w:cs="Times New Roman"/>
                 <w:sz w:val="18"/>
               </w:rPr>
               <w:t>[+0.271, +0.889]</w:t>
@@ -2738,7 +2738,7 @@
             </w:pPr>
             <w:r>
               <w:rPr>
-                <w:rFonts w:ascii="바탕" w:hAnsi="바탕" w:eastAsia="바탕" w:cs="바탕"/>
+                <w:rFonts w:ascii="Times New Roman" w:hAnsi="Times New Roman" w:eastAsia="바탕" w:cs="Times New Roman"/>
                 <w:sz w:val="18"/>
               </w:rPr>
               <w:t>P − K3</w:t>
@@ -2771,7 +2771,7 @@
             </w:pPr>
             <w:r>
               <w:rPr>
-                <w:rFonts w:ascii="바탕" w:hAnsi="바탕" w:eastAsia="바탕" w:cs="바탕"/>
+                <w:rFonts w:ascii="Times New Roman" w:hAnsi="Times New Roman" w:eastAsia="바탕" w:cs="Times New Roman"/>
                 <w:sz w:val="18"/>
               </w:rPr>
               <w:t>+0.244</w:t>
@@ -2781,7 +2781,7 @@
             </w:r>
             <w:r>
               <w:rPr>
-                <w:rFonts w:ascii="바탕" w:hAnsi="바탕" w:eastAsia="바탕" w:cs="바탕"/>
+                <w:rFonts w:ascii="Times New Roman" w:hAnsi="Times New Roman" w:eastAsia="바탕" w:cs="Times New Roman"/>
                 <w:sz w:val="18"/>
               </w:rPr>
               <w:t>[+0.098, +0.400]</w:t>
@@ -2814,7 +2814,7 @@
             </w:pPr>
             <w:r>
               <w:rPr>
-                <w:rFonts w:ascii="바탕" w:hAnsi="바탕" w:eastAsia="바탕" w:cs="바탕"/>
+                <w:rFonts w:ascii="Times New Roman" w:hAnsi="Times New Roman" w:eastAsia="바탕" w:cs="Times New Roman"/>
                 <w:sz w:val="18"/>
               </w:rPr>
               <w:t>+0.511</w:t>
@@ -2824,7 +2824,7 @@
             </w:r>
             <w:r>
               <w:rPr>
-                <w:rFonts w:ascii="바탕" w:hAnsi="바탕" w:eastAsia="바탕" w:cs="바탕"/>
+                <w:rFonts w:ascii="Times New Roman" w:hAnsi="Times New Roman" w:eastAsia="바탕" w:cs="Times New Roman"/>
                 <w:sz w:val="18"/>
               </w:rPr>
               <w:t>[+0.246, +0.806]</w:t>
@@ -2864,7 +2864,7 @@
             </w:pPr>
             <w:r>
               <w:rPr>
-                <w:rFonts w:ascii="바탕" w:hAnsi="바탕" w:eastAsia="바탕" w:cs="바탕"/>
+                <w:rFonts w:ascii="Times New Roman" w:hAnsi="Times New Roman" w:eastAsia="바탕" w:cs="Times New Roman"/>
                 <w:sz w:val="18"/>
               </w:rPr>
               <w:t>P − L</w:t>
@@ -2897,7 +2897,7 @@
             </w:pPr>
             <w:r>
               <w:rPr>
-                <w:rFonts w:ascii="바탕" w:hAnsi="바탕" w:eastAsia="바탕" w:cs="바탕"/>
+                <w:rFonts w:ascii="Times New Roman" w:hAnsi="Times New Roman" w:eastAsia="바탕" w:cs="Times New Roman"/>
                 <w:sz w:val="18"/>
               </w:rPr>
               <w:t>−0.022</w:t>
@@ -2907,7 +2907,7 @@
             </w:r>
             <w:r>
               <w:rPr>
-                <w:rFonts w:ascii="바탕" w:hAnsi="바탕" w:eastAsia="바탕" w:cs="바탕"/>
+                <w:rFonts w:ascii="Times New Roman" w:hAnsi="Times New Roman" w:eastAsia="바탕" w:cs="Times New Roman"/>
                 <w:sz w:val="18"/>
               </w:rPr>
               <w:t>[−0.083, +0.026]</w:t>
@@ -2940,7 +2940,7 @@
             </w:pPr>
             <w:r>
               <w:rPr>
-                <w:rFonts w:ascii="바탕" w:hAnsi="바탕" w:eastAsia="바탕" w:cs="바탕"/>
+                <w:rFonts w:ascii="Times New Roman" w:hAnsi="Times New Roman" w:eastAsia="바탕" w:cs="Times New Roman"/>
                 <w:sz w:val="18"/>
               </w:rPr>
               <w:t>−0.067</w:t>
@@ -2950,7 +2950,7 @@
             </w:r>
             <w:r>
               <w:rPr>
-                <w:rFonts w:ascii="바탕" w:hAnsi="바탕" w:eastAsia="바탕" w:cs="바탕"/>
+                <w:rFonts w:ascii="Times New Roman" w:hAnsi="Times New Roman" w:eastAsia="바탕" w:cs="Times New Roman"/>
                 <w:sz w:val="18"/>
               </w:rPr>
               <w:t>[−0.167, 0.000]</w:t>
@@ -2975,7 +2975,7 @@
       </w:pPr>
       <w:r>
         <w:rPr>
-          <w:rFonts w:ascii="바탕" w:hAnsi="바탕" w:eastAsia="바탕" w:cs="바탕"/>
+          <w:rFonts w:ascii="Times New Roman" w:hAnsi="Times New Roman" w:eastAsia="바탕" w:cs="Times New Roman"/>
           <w:sz w:val="18"/>
         </w:rPr>
         <w:t>여러 질의가 같은 링크 정답 근거를 공유하는 경우가 있어서, 질의를 서로 독립인 표본으로 보고 재표집하면 구간이 실제보다 좁아질 수 있다. 그래서 같은 문서 버전의 같은 조항을 링크 정답 근거로 갖는 질의들을 하나로 묶고, 이렇게 이어진 묶음을 군집으로 삼아 군집 단위로 재표집했다. 군집이 기존 사례에서 5개, 신규 사례에서 6개뿐이어서, 표의 구간은 효과의 크기를 가늠하는 참고값으로만 본다.</w:t>
@@ -2995,7 +2995,7 @@
       </w:pPr>
       <w:r>
         <w:rPr>
-          <w:rFonts w:ascii="바탕" w:hAnsi="바탕" w:eastAsia="바탕" w:cs="바탕"/>
+          <w:rFonts w:ascii="Times New Roman" w:hAnsi="Times New Roman" w:eastAsia="바탕" w:cs="Times New Roman"/>
           <w:sz w:val="18"/>
           <w:szCs w:val="18"/>
         </w:rPr>
@@ -3060,7 +3060,7 @@
             </w:pPr>
             <w:r>
               <w:rPr>
-                <w:rFonts w:ascii="바탕" w:hAnsi="바탕" w:eastAsia="바탕" w:cs="바탕"/>
+                <w:rFonts w:ascii="Times New Roman" w:hAnsi="Times New Roman" w:eastAsia="바탕" w:cs="Times New Roman"/>
                 <w:b/>
                 <w:sz w:val="18"/>
               </w:rPr>
@@ -3094,7 +3094,7 @@
             </w:pPr>
             <w:r>
               <w:rPr>
-                <w:rFonts w:ascii="바탕" w:hAnsi="바탕" w:eastAsia="바탕" w:cs="바탕"/>
+                <w:rFonts w:ascii="Times New Roman" w:hAnsi="Times New Roman" w:eastAsia="바탕" w:cs="Times New Roman"/>
                 <w:b/>
                 <w:sz w:val="18"/>
               </w:rPr>
@@ -3105,7 +3105,7 @@
             </w:r>
             <w:r>
               <w:rPr>
-                <w:rFonts w:ascii="바탕" w:hAnsi="바탕" w:eastAsia="바탕" w:cs="바탕"/>
+                <w:rFonts w:ascii="Times New Roman" w:hAnsi="Times New Roman" w:eastAsia="바탕" w:cs="Times New Roman"/>
                 <w:b/>
                 <w:sz w:val="18"/>
               </w:rPr>
@@ -3139,7 +3139,7 @@
             </w:pPr>
             <w:r>
               <w:rPr>
-                <w:rFonts w:ascii="바탕" w:hAnsi="바탕" w:eastAsia="바탕" w:cs="바탕"/>
+                <w:rFonts w:ascii="Times New Roman" w:hAnsi="Times New Roman" w:eastAsia="바탕" w:cs="Times New Roman"/>
                 <w:b/>
                 <w:sz w:val="18"/>
               </w:rPr>
@@ -3150,7 +3150,7 @@
             </w:r>
             <w:r>
               <w:rPr>
-                <w:rFonts w:ascii="바탕" w:hAnsi="바탕" w:eastAsia="바탕" w:cs="바탕"/>
+                <w:rFonts w:ascii="Times New Roman" w:hAnsi="Times New Roman" w:eastAsia="바탕" w:cs="Times New Roman"/>
                 <w:b/>
                 <w:sz w:val="18"/>
               </w:rPr>
@@ -3191,7 +3191,7 @@
             </w:pPr>
             <w:r>
               <w:rPr>
-                <w:rFonts w:ascii="바탕" w:hAnsi="바탕" w:eastAsia="바탕" w:cs="바탕"/>
+                <w:rFonts w:ascii="Times New Roman" w:hAnsi="Times New Roman" w:eastAsia="바탕" w:cs="Times New Roman"/>
                 <w:sz w:val="18"/>
               </w:rPr>
               <w:t>ΔContext</w:t>
@@ -3201,7 +3201,7 @@
             </w:r>
             <w:r>
               <w:rPr>
-                <w:rFonts w:ascii="바탕" w:hAnsi="바탕" w:eastAsia="바탕" w:cs="바탕"/>
+                <w:rFonts w:ascii="Times New Roman" w:hAnsi="Times New Roman" w:eastAsia="바탕" w:cs="Times New Roman"/>
                 <w:sz w:val="18"/>
               </w:rPr>
               <w:t>Precision</w:t>
@@ -3234,7 +3234,7 @@
             </w:pPr>
             <w:r>
               <w:rPr>
-                <w:rFonts w:ascii="바탕" w:hAnsi="바탕" w:eastAsia="바탕" w:cs="바탕"/>
+                <w:rFonts w:ascii="Times New Roman" w:hAnsi="Times New Roman" w:eastAsia="바탕" w:cs="Times New Roman"/>
                 <w:sz w:val="18"/>
               </w:rPr>
               <w:t>+0.109</w:t>
@@ -3244,7 +3244,7 @@
             </w:r>
             <w:r>
               <w:rPr>
-                <w:rFonts w:ascii="바탕" w:hAnsi="바탕" w:eastAsia="바탕" w:cs="바탕"/>
+                <w:rFonts w:ascii="Times New Roman" w:hAnsi="Times New Roman" w:eastAsia="바탕" w:cs="Times New Roman"/>
                 <w:sz w:val="18"/>
               </w:rPr>
               <w:t>[+0.002, +0.220]</w:t>
@@ -3277,7 +3277,7 @@
             </w:pPr>
             <w:r>
               <w:rPr>
-                <w:rFonts w:ascii="바탕" w:hAnsi="바탕" w:eastAsia="바탕" w:cs="바탕"/>
+                <w:rFonts w:ascii="Times New Roman" w:hAnsi="Times New Roman" w:eastAsia="바탕" w:cs="Times New Roman"/>
                 <w:sz w:val="18"/>
               </w:rPr>
               <w:t>+0.025</w:t>
@@ -3287,7 +3287,7 @@
             </w:r>
             <w:r>
               <w:rPr>
-                <w:rFonts w:ascii="바탕" w:hAnsi="바탕" w:eastAsia="바탕" w:cs="바탕"/>
+                <w:rFonts w:ascii="Times New Roman" w:hAnsi="Times New Roman" w:eastAsia="바탕" w:cs="Times New Roman"/>
                 <w:sz w:val="18"/>
               </w:rPr>
               <w:t>[+0.008, +0.042]</w:t>
@@ -3327,7 +3327,7 @@
             </w:pPr>
             <w:r>
               <w:rPr>
-                <w:rFonts w:ascii="바탕" w:hAnsi="바탕" w:eastAsia="바탕" w:cs="바탕"/>
+                <w:rFonts w:ascii="Times New Roman" w:hAnsi="Times New Roman" w:eastAsia="바탕" w:cs="Times New Roman"/>
                 <w:sz w:val="18"/>
               </w:rPr>
               <w:t>ΔAnswer</w:t>
@@ -3337,7 +3337,7 @@
             </w:r>
             <w:r>
               <w:rPr>
-                <w:rFonts w:ascii="바탕" w:hAnsi="바탕" w:eastAsia="바탕" w:cs="바탕"/>
+                <w:rFonts w:ascii="Times New Roman" w:hAnsi="Times New Roman" w:eastAsia="바탕" w:cs="Times New Roman"/>
                 <w:sz w:val="18"/>
               </w:rPr>
               <w:t>Correctness</w:t>
@@ -3370,7 +3370,7 @@
             </w:pPr>
             <w:r>
               <w:rPr>
-                <w:rFonts w:ascii="바탕" w:hAnsi="바탕" w:eastAsia="바탕" w:cs="바탕"/>
+                <w:rFonts w:ascii="Times New Roman" w:hAnsi="Times New Roman" w:eastAsia="바탕" w:cs="Times New Roman"/>
                 <w:sz w:val="18"/>
               </w:rPr>
               <w:t>−0.003</w:t>
@@ -3380,7 +3380,7 @@
             </w:r>
             <w:r>
               <w:rPr>
-                <w:rFonts w:ascii="바탕" w:hAnsi="바탕" w:eastAsia="바탕" w:cs="바탕"/>
+                <w:rFonts w:ascii="Times New Roman" w:hAnsi="Times New Roman" w:eastAsia="바탕" w:cs="Times New Roman"/>
                 <w:sz w:val="18"/>
               </w:rPr>
               <w:t>[−0.040, +0.042]</w:t>
@@ -3413,7 +3413,7 @@
             </w:pPr>
             <w:r>
               <w:rPr>
-                <w:rFonts w:ascii="바탕" w:hAnsi="바탕" w:eastAsia="바탕" w:cs="바탕"/>
+                <w:rFonts w:ascii="Times New Roman" w:hAnsi="Times New Roman" w:eastAsia="바탕" w:cs="Times New Roman"/>
                 <w:sz w:val="18"/>
               </w:rPr>
               <w:t>−0.001</w:t>
@@ -3423,7 +3423,7 @@
             </w:r>
             <w:r>
               <w:rPr>
-                <w:rFonts w:ascii="바탕" w:hAnsi="바탕" w:eastAsia="바탕" w:cs="바탕"/>
+                <w:rFonts w:ascii="Times New Roman" w:hAnsi="Times New Roman" w:eastAsia="바탕" w:cs="Times New Roman"/>
                 <w:sz w:val="18"/>
               </w:rPr>
               <w:t>[−0.019, +0.018]</w:t>
@@ -3463,7 +3463,7 @@
             </w:pPr>
             <w:r>
               <w:rPr>
-                <w:rFonts w:ascii="바탕" w:hAnsi="바탕" w:eastAsia="바탕" w:cs="바탕"/>
+                <w:rFonts w:ascii="Times New Roman" w:hAnsi="Times New Roman" w:eastAsia="바탕" w:cs="Times New Roman"/>
                 <w:sz w:val="18"/>
               </w:rPr>
               <w:t>Δ응답 시간</w:t>
@@ -3473,7 +3473,7 @@
             </w:r>
             <w:r>
               <w:rPr>
-                <w:rFonts w:ascii="바탕" w:hAnsi="바탕" w:eastAsia="바탕" w:cs="바탕"/>
+                <w:rFonts w:ascii="Times New Roman" w:hAnsi="Times New Roman" w:eastAsia="바탕" w:cs="Times New Roman"/>
                 <w:sz w:val="18"/>
               </w:rPr>
               <w:t>(초/질의)</w:t>
@@ -3506,7 +3506,7 @@
             </w:pPr>
             <w:r>
               <w:rPr>
-                <w:rFonts w:ascii="바탕" w:hAnsi="바탕" w:eastAsia="바탕" w:cs="바탕"/>
+                <w:rFonts w:ascii="Times New Roman" w:hAnsi="Times New Roman" w:eastAsia="바탕" w:cs="Times New Roman"/>
                 <w:sz w:val="18"/>
               </w:rPr>
               <w:t>+1.057</w:t>
@@ -3516,7 +3516,7 @@
             </w:r>
             <w:r>
               <w:rPr>
-                <w:rFonts w:ascii="바탕" w:hAnsi="바탕" w:eastAsia="바탕" w:cs="바탕"/>
+                <w:rFonts w:ascii="Times New Roman" w:hAnsi="Times New Roman" w:eastAsia="바탕" w:cs="Times New Roman"/>
                 <w:sz w:val="18"/>
               </w:rPr>
               <w:t>[+0.904, +1.211]</w:t>
@@ -3549,7 +3549,7 @@
             </w:pPr>
             <w:r>
               <w:rPr>
-                <w:rFonts w:ascii="바탕" w:hAnsi="바탕" w:eastAsia="바탕" w:cs="바탕"/>
+                <w:rFonts w:ascii="Times New Roman" w:hAnsi="Times New Roman" w:eastAsia="바탕" w:cs="Times New Roman"/>
                 <w:sz w:val="18"/>
               </w:rPr>
               <w:t>+0.343</w:t>
@@ -3559,7 +3559,7 @@
             </w:r>
             <w:r>
               <w:rPr>
-                <w:rFonts w:ascii="바탕" w:hAnsi="바탕" w:eastAsia="바탕" w:cs="바탕"/>
+                <w:rFonts w:ascii="Times New Roman" w:hAnsi="Times New Roman" w:eastAsia="바탕" w:cs="Times New Roman"/>
                 <w:sz w:val="18"/>
               </w:rPr>
               <w:t>[−0.761, +1.066]</w:t>
@@ -3592,7 +3592,7 @@
       </w:pPr>
       <w:r>
         <w:rPr>
-          <w:rFonts w:ascii="바탕" w:hAnsi="바탕" w:eastAsia="바탕" w:cs="바탕"/>
+          <w:rFonts w:ascii="Times New Roman" w:hAnsi="Times New Roman" w:eastAsia="바탕" w:cs="Times New Roman"/>
           <w:sz w:val="18"/>
         </w:rPr>
         <w:t>K3는 첫 번째 실행에서만 답변을 채점했으므로 그 결과끼리 비교하면, 기존 사례에서 proposed는 Context Precision이 K3보다 0.266 [−0.478, −0.099] 낮았지만 Answer Correctness 차이는 −0.022 [−0.120, +0.077]로 거의 없었다. 신규 사례에서는 두 지표의 차이가 각각 +0.020 [−0.047, +0.078], +0.031 [−0.043, +0.136]으로 모두 작았다. 즉, 링크 확장으로 찾은 정답 근거가 늘었어도 자동 채점한 답변의 정확도는 뚜렷하게 달라지지 않았다.</w:t>
@@ -3605,20 +3605,20 @@
         <w:spacing w:line="300" w:lineRule="exact"/>
         <w:ind w:firstLine="180"/>
         <w:rPr>
-          <w:rFonts w:ascii="바탕" w:hAnsi="바탕" w:eastAsia="바탕" w:cs="바탕"/>
+          <w:rFonts w:ascii="Times New Roman" w:hAnsi="Times New Roman" w:eastAsia="바탕" w:cs="Times New Roman"/>
           <w:sz w:val="18"/>
         </w:rPr>
       </w:pPr>
       <w:r>
         <w:rPr>
-          <w:rFonts w:ascii="바탕" w:hAnsi="바탕" w:eastAsia="바탕" w:cs="바탕"/>
+          <w:rFonts w:ascii="Times New Roman" w:hAnsi="Times New Roman" w:eastAsia="바탕" w:cs="Times New Roman"/>
           <w:sz w:val="18"/>
         </w:rPr>
         <w:t>그래프형 질의의 평균 응답 시간은 K3 1.446초, link_all 2.157초, proposed 2.678초로, proposed는 연결 근거를 한 번 더 재정렬하는 만큼 link_all보다 약 0.5초 느렸다(표 3).</w:t>
       </w:r>
       <w:r>
         <w:rPr>
-          <w:rFonts w:ascii="바탕" w:hAnsi="바탕" w:eastAsia="바탕" w:cs="바탕"/>
+          <w:rFonts w:ascii="Times New Roman" w:hAnsi="Times New Roman" w:eastAsia="바탕" w:cs="Times New Roman"/>
           <w:sz w:val="18"/>
         </w:rPr>
       </w:r>
@@ -3639,7 +3639,7 @@
       </w:pPr>
       <w:r>
         <w:rPr>
-          <w:rFonts w:ascii="바탕" w:hAnsi="바탕" w:eastAsia="바탕" w:cs="바탕"/>
+          <w:rFonts w:ascii="Times New Roman" w:hAnsi="Times New Roman" w:eastAsia="바탕" w:cs="Times New Roman"/>
           <w:b/>
         </w:rPr>
         <w:t>4. 논의 및 결론</w:t>
@@ -3654,7 +3654,7 @@
       </w:pPr>
       <w:r>
         <w:rPr>
-          <w:rFonts w:ascii="바탕" w:hAnsi="바탕" w:eastAsia="바탕" w:cs="바탕"/>
+          <w:rFonts w:ascii="Times New Roman" w:hAnsi="Times New Roman" w:eastAsia="바탕" w:cs="Times New Roman"/>
           <w:sz w:val="18"/>
         </w:rPr>
         <w:t>승인 링크로 검색을 확장하자 그래프형 질의에서 찾아낸 정답 근거가 크게 늘었다. 특히 K3와 link_all은 질의당 평균 근거 수가 3.15개와 3.08개로 비슷했는데도 Recall 차이가 컸다. 근거를 더 많이 가져와서가 아니라, 링크가 다른 문서에 있는 필요한 구간을 찾아 준 덕분으로 볼 수 있다. 반면 연결 근거를 한 번 더 골라내는 proposed는 link_all보다 Recall이 높지 않았고 응답만 느려졌다.</w:t>
@@ -3669,7 +3669,7 @@
       </w:pPr>
       <w:r>
         <w:rPr>
-          <w:rFonts w:ascii="바탕" w:hAnsi="바탕" w:eastAsia="바탕" w:cs="바탕"/>
+          <w:rFonts w:ascii="Times New Roman" w:hAnsi="Times New Roman" w:eastAsia="바탕" w:cs="Times New Roman"/>
           <w:sz w:val="18"/>
         </w:rPr>
         <w:t>이 결과를 해석할 때는 평가 자료의 한계를 함께 봐야 한다. 기존 그래프형 5건은 개발 과정에서 만든 질의이고, 신규 15건은 링크를 먼저 정한 뒤 만들었기 때문에 링크 방식에 유리한 질문이 모였을 수 있다. 신규 질의는 현업 전문가 1인이 링크 구조를 아는 상태에서 검토했으므로 평가자 간 일치도를 구하지 못했다. 또한 K3는 근거가 3개보다 적을 때만 보충하므로 근거 수나 토큰 예산을 정확히 맞춘 비교는 아니다. 답변 역시 생성에 쓴 모델이 그대로 채점했고, 사람이 방법명을 가린 채 평가하지는 않았다.</w:t>
@@ -3684,7 +3684,7 @@
       </w:pPr>
       <w:r>
         <w:rPr>
-          <w:rFonts w:ascii="바탕" w:hAnsi="바탕" w:eastAsia="바탕" w:cs="바탕"/>
+          <w:rFonts w:ascii="Times New Roman" w:hAnsi="Times New Roman" w:eastAsia="바탕" w:cs="Times New Roman"/>
           <w:sz w:val="18"/>
         </w:rPr>
         <w:t>운영 측면에서도 확인할 점이 남아 있다. 관리자는 링크 양 끝의 구간과 승인 상태, 담당자, 시각을 기록하지만, 어떤 기준으로 승인하는지와 문서가 개정되거나 폐기될 때 링크를 어떻게 처리하는지는 정해져 있지 않다. 따라서 이번 결과는 승인된 링크가 정확하다는 근거가 아니라, 링크가 있을 때 검색이 어떻게 달라지는지를 보여 준다. 링크를 미리 보지 않고 만든 현장 질의, 두 명 이상의 독립 검수, 블라인드 답변 평가로 이 결과를 다시 확인할 계획이다. 또한 현재 시스템은 연결 근거를 찾지 못해도 경고 없이 직접 근거만으로 답하므로, 이를 보완하기 전에는 실제 운전 판단에 쓰기 어렵다.</w:t>
@@ -3707,7 +3707,7 @@
       </w:pPr>
       <w:r>
         <w:rPr>
-          <w:rFonts w:ascii="바탕" w:hAnsi="바탕" w:eastAsia="바탕" w:cs="바탕"/>
+          <w:rFonts w:ascii="Times New Roman" w:hAnsi="Times New Roman" w:eastAsia="바탕" w:cs="Times New Roman"/>
           <w:b/>
         </w:rPr>
         <w:t>참고문헌</w:t>
@@ -3722,14 +3722,14 @@
       </w:pPr>
       <w:r>
         <w:rPr>
-          <w:rFonts w:ascii="바탕" w:hAnsi="바탕" w:eastAsia="바탕" w:cs="바탕"/>
+          <w:rFonts w:ascii="Times New Roman" w:hAnsi="Times New Roman" w:eastAsia="바탕" w:cs="Times New Roman"/>
           <w:sz w:val="18"/>
         </w:rPr>
         <w:t xml:space="preserve">[1] P. Lewis, E. Perez, A. Piktus, F. Petroni, V. Karpukhin, N. Goyal, H. Küttler, M. Lewis, W. Yih, T. Rocktäschel, S. Riedel, and D. Kiela, “Retrieval-Augmented Generation for Knowledge-Intensive NLP Tasks,” </w:t>
       </w:r>
       <w:r>
         <w:rPr>
-          <w:rFonts w:ascii="바탕" w:hAnsi="바탕" w:eastAsia="바탕" w:cs="바탕"/>
+          <w:rFonts w:ascii="Times New Roman" w:hAnsi="Times New Roman" w:eastAsia="바탕" w:cs="Times New Roman"/>
           <w:i/>
           <w:sz w:val="18"/>
         </w:rPr>
@@ -3737,7 +3737,7 @@
       </w:r>
       <w:r>
         <w:rPr>
-          <w:rFonts w:ascii="바탕" w:hAnsi="바탕" w:eastAsia="바탕" w:cs="바탕"/>
+          <w:rFonts w:ascii="Times New Roman" w:hAnsi="Times New Roman" w:eastAsia="바탕" w:cs="Times New Roman"/>
           <w:sz w:val="18"/>
         </w:rPr>
         <w:t>, vol. 33, pp. 9459–9474, 2020.</w:t>
@@ -3752,14 +3752,14 @@
       </w:pPr>
       <w:r>
         <w:rPr>
-          <w:rFonts w:ascii="바탕" w:hAnsi="바탕" w:eastAsia="바탕" w:cs="바탕"/>
+          <w:rFonts w:ascii="Times New Roman" w:hAnsi="Times New Roman" w:eastAsia="바탕" w:cs="Times New Roman"/>
           <w:sz w:val="18"/>
         </w:rPr>
         <w:t xml:space="preserve">[2] W. Sun, L. Yan, X. Ma, S. Wang, P. Ren, Z. Chen, D. Yin, and Z. Ren, “Is ChatGPT Good at Search? Investigating Large Language Models as Re-Ranking Agents,” in </w:t>
       </w:r>
       <w:r>
         <w:rPr>
-          <w:rFonts w:ascii="바탕" w:hAnsi="바탕" w:eastAsia="바탕" w:cs="바탕"/>
+          <w:rFonts w:ascii="Times New Roman" w:hAnsi="Times New Roman" w:eastAsia="바탕" w:cs="Times New Roman"/>
           <w:i/>
           <w:sz w:val="18"/>
         </w:rPr>
@@ -3767,7 +3767,7 @@
       </w:r>
       <w:r>
         <w:rPr>
-          <w:rFonts w:ascii="바탕" w:hAnsi="바탕" w:eastAsia="바탕" w:cs="바탕"/>
+          <w:rFonts w:ascii="Times New Roman" w:hAnsi="Times New Roman" w:eastAsia="바탕" w:cs="Times New Roman"/>
           <w:sz w:val="18"/>
         </w:rPr>
         <w:t>, pp. 14918–14937, 2023.</w:t>
@@ -3782,7 +3782,7 @@
       </w:pPr>
       <w:r>
         <w:rPr>
-          <w:rFonts w:ascii="바탕" w:hAnsi="바탕" w:eastAsia="바탕" w:cs="바탕"/>
+          <w:rFonts w:ascii="Times New Roman" w:hAnsi="Times New Roman" w:eastAsia="바탕" w:cs="Times New Roman"/>
           <w:sz w:val="18"/>
         </w:rPr>
         <w:t>[3] D. Edge, H. Trinh, N. Cheng, J. Bradley, A. Chao, A. Mody, S. Truitt, D. Metropolitansky, R. O. Ness, and J. Larson, “From Local to Global: A Graph RAG Approach to Query-Focused Summarization,” arXiv:2404.16130, 2024.</w:t>
@@ -3797,14 +3797,14 @@
       </w:pPr>
       <w:r>
         <w:rPr>
-          <w:rFonts w:ascii="바탕" w:hAnsi="바탕" w:eastAsia="바탕" w:cs="바탕"/>
+          <w:rFonts w:ascii="Times New Roman" w:hAnsi="Times New Roman" w:eastAsia="바탕" w:cs="Times New Roman"/>
           <w:sz w:val="18"/>
         </w:rPr>
         <w:t xml:space="preserve">[4] Z. Guo, L. Xia, Y. Yu, T. Ao, and C. Huang, “LightRAG: Simple and Fast Retrieval-Augmented Generation,” in </w:t>
       </w:r>
       <w:r>
         <w:rPr>
-          <w:rFonts w:ascii="바탕" w:hAnsi="바탕" w:eastAsia="바탕" w:cs="바탕"/>
+          <w:rFonts w:ascii="Times New Roman" w:hAnsi="Times New Roman" w:eastAsia="바탕" w:cs="Times New Roman"/>
           <w:i/>
           <w:sz w:val="18"/>
         </w:rPr>
@@ -3812,7 +3812,7 @@
       </w:r>
       <w:r>
         <w:rPr>
-          <w:rFonts w:ascii="바탕" w:hAnsi="바탕" w:eastAsia="바탕" w:cs="바탕"/>
+          <w:rFonts w:ascii="Times New Roman" w:hAnsi="Times New Roman" w:eastAsia="바탕" w:cs="Times New Roman"/>
           <w:sz w:val="18"/>
         </w:rPr>
         <w:t>, pp. 10746–10761, 2025.</w:t>
@@ -3827,14 +3827,14 @@
       </w:pPr>
       <w:r>
         <w:rPr>
-          <w:rFonts w:ascii="바탕" w:hAnsi="바탕" w:eastAsia="바탕" w:cs="바탕"/>
+          <w:rFonts w:ascii="Times New Roman" w:hAnsi="Times New Roman" w:eastAsia="바탕" w:cs="Times New Roman"/>
           <w:sz w:val="18"/>
         </w:rPr>
         <w:t xml:space="preserve">[5] X. Zhu, Y. Xie, Y. Liu, Y. Li, and W. Hu, “Knowledge Graph-Guided Retrieval Augmented Generation,” in </w:t>
       </w:r>
       <w:r>
         <w:rPr>
-          <w:rFonts w:ascii="바탕" w:hAnsi="바탕" w:eastAsia="바탕" w:cs="바탕"/>
+          <w:rFonts w:ascii="Times New Roman" w:hAnsi="Times New Roman" w:eastAsia="바탕" w:cs="Times New Roman"/>
           <w:i/>
           <w:sz w:val="18"/>
         </w:rPr>
@@ -3842,7 +3842,7 @@
       </w:r>
       <w:r>
         <w:rPr>
-          <w:rFonts w:ascii="바탕" w:hAnsi="바탕" w:eastAsia="바탕" w:cs="바탕"/>
+          <w:rFonts w:ascii="Times New Roman" w:hAnsi="Times New Roman" w:eastAsia="바탕" w:cs="Times New Roman"/>
           <w:sz w:val="18"/>
         </w:rPr>
         <w:t>, vol. 1, pp. 8912–8924, 2025.</w:t>
@@ -3857,14 +3857,14 @@
       </w:pPr>
       <w:r>
         <w:rPr>
-          <w:rFonts w:ascii="바탕" w:hAnsi="바탕" w:eastAsia="바탕" w:cs="바탕"/>
+          <w:rFonts w:ascii="Times New Roman" w:hAnsi="Times New Roman" w:eastAsia="바탕" w:cs="Times New Roman"/>
           <w:sz w:val="18"/>
         </w:rPr>
         <w:t xml:space="preserve">[6] W. Zheng, M. Yang, Y. Ren, H. Wang, C. Zeng, and Y. Zhang, “CARAG: Context-Aware Retrieval-Augmented Generation for Railway Operation and Maintenance Question Answering over Spatial Knowledge Graph,” </w:t>
       </w:r>
       <w:r>
         <w:rPr>
-          <w:rFonts w:ascii="바탕" w:hAnsi="바탕" w:eastAsia="바탕" w:cs="바탕"/>
+          <w:rFonts w:ascii="Times New Roman" w:hAnsi="Times New Roman" w:eastAsia="바탕" w:cs="Times New Roman"/>
           <w:i/>
           <w:sz w:val="18"/>
         </w:rPr>
@@ -3872,7 +3872,7 @@
       </w:r>
       <w:r>
         <w:rPr>
-          <w:rFonts w:ascii="바탕" w:hAnsi="바탕" w:eastAsia="바탕" w:cs="바탕"/>
+          <w:rFonts w:ascii="Times New Roman" w:hAnsi="Times New Roman" w:eastAsia="바탕" w:cs="Times New Roman"/>
           <w:sz w:val="18"/>
         </w:rPr>
         <w:t>, vol. 15, no. 2, Article 78, 2026.</w:t>
@@ -3887,14 +3887,14 @@
       </w:pPr>
       <w:r>
         <w:rPr>
-          <w:rFonts w:ascii="바탕" w:hAnsi="바탕" w:eastAsia="바탕" w:cs="바탕"/>
+          <w:rFonts w:ascii="Times New Roman" w:hAnsi="Times New Roman" w:eastAsia="바탕" w:cs="Times New Roman"/>
           <w:sz w:val="18"/>
         </w:rPr>
         <w:t xml:space="preserve">[7] L. Huang, Z. Liu, C. Yu, T. Zhu, and B. Yan, “Emergency Operation Scheme Generation for Urban Rail Transit Train Door Systems Using Retrieval-Augmented Large Language Models,” </w:t>
       </w:r>
       <w:r>
         <w:rPr>
-          <w:rFonts w:ascii="바탕" w:hAnsi="바탕" w:eastAsia="바탕" w:cs="바탕"/>
+          <w:rFonts w:ascii="Times New Roman" w:hAnsi="Times New Roman" w:eastAsia="바탕" w:cs="Times New Roman"/>
           <w:i/>
           <w:sz w:val="18"/>
         </w:rPr>
@@ -3902,7 +3902,7 @@
       </w:r>
       <w:r>
         <w:rPr>
-          <w:rFonts w:ascii="바탕" w:hAnsi="바탕" w:eastAsia="바탕" w:cs="바탕"/>
+          <w:rFonts w:ascii="Times New Roman" w:hAnsi="Times New Roman" w:eastAsia="바탕" w:cs="Times New Roman"/>
           <w:sz w:val="18"/>
         </w:rPr>
         <w:t>, vol. 26, no. 6, Article 2006, 2026.</w:t>
@@ -3917,7 +3917,7 @@
       </w:pPr>
       <w:r>
         <w:rPr>
-          <w:rFonts w:ascii="바탕" w:hAnsi="바탕" w:eastAsia="바탕" w:cs="바탕"/>
+          <w:rFonts w:ascii="Times New Roman" w:hAnsi="Times New Roman" w:eastAsia="바탕" w:cs="Times New Roman"/>
           <w:sz w:val="18"/>
         </w:rPr>
         <w:t>[8] N. Pipitone and G. H. Alami, “LegalBench-RAG: A Benchmark for Retrieval-Augmented Generation in the Legal Domain,” arXiv:2408.10343, 2024.</w:t>
@@ -3932,14 +3932,14 @@
       </w:pPr>
       <w:r>
         <w:rPr>
-          <w:rFonts w:ascii="바탕" w:hAnsi="바탕" w:eastAsia="바탕" w:cs="바탕"/>
+          <w:rFonts w:ascii="Times New Roman" w:hAnsi="Times New Roman" w:eastAsia="바탕" w:cs="Times New Roman"/>
           <w:sz w:val="18"/>
         </w:rPr>
         <w:t xml:space="preserve">[9] 서준원, 민정혜, “한국어 법률 QA를 위한 하이브리드 RAG 시스템 최적화,” </w:t>
       </w:r>
       <w:r>
         <w:rPr>
-          <w:rFonts w:ascii="바탕" w:hAnsi="바탕" w:eastAsia="바탕" w:cs="바탕"/>
+          <w:rFonts w:ascii="Times New Roman" w:hAnsi="Times New Roman" w:eastAsia="바탕" w:cs="Times New Roman"/>
           <w:i/>
           <w:sz w:val="18"/>
         </w:rPr>
@@ -3947,7 +3947,7 @@
       </w:r>
       <w:r>
         <w:rPr>
-          <w:rFonts w:ascii="바탕" w:hAnsi="바탕" w:eastAsia="바탕" w:cs="바탕"/>
+          <w:rFonts w:ascii="Times New Roman" w:hAnsi="Times New Roman" w:eastAsia="바탕" w:cs="Times New Roman"/>
           <w:sz w:val="18"/>
         </w:rPr>
         <w:t>, 제30권, 제8호, pp. 53–63, 2025.</w:t>
@@ -3962,14 +3962,14 @@
       </w:pPr>
       <w:r>
         <w:rPr>
-          <w:rFonts w:ascii="바탕" w:hAnsi="바탕" w:eastAsia="바탕" w:cs="바탕"/>
+          <w:rFonts w:ascii="Times New Roman" w:hAnsi="Times New Roman" w:eastAsia="바탕" w:cs="Times New Roman"/>
           <w:sz w:val="18"/>
         </w:rPr>
         <w:t xml:space="preserve">[10] S. Es, J. James, L. Espinosa Anke, and S. Schockaert, “RAGAs: Automated Evaluation of Retrieval Augmented Generation,” in </w:t>
       </w:r>
       <w:r>
         <w:rPr>
-          <w:rFonts w:ascii="바탕" w:hAnsi="바탕" w:eastAsia="바탕" w:cs="바탕"/>
+          <w:rFonts w:ascii="Times New Roman" w:hAnsi="Times New Roman" w:eastAsia="바탕" w:cs="Times New Roman"/>
           <w:i/>
           <w:sz w:val="18"/>
         </w:rPr>
@@ -3977,7 +3977,7 @@
       </w:r>
       <w:r>
         <w:rPr>
-          <w:rFonts w:ascii="바탕" w:hAnsi="바탕" w:eastAsia="바탕" w:cs="바탕"/>
+          <w:rFonts w:ascii="Times New Roman" w:hAnsi="Times New Roman" w:eastAsia="바탕" w:cs="Times New Roman"/>
           <w:sz w:val="18"/>
         </w:rPr>
         <w:t>, pp. 150–158, 2024.</w:t>
@@ -4345,7 +4345,7 @@
   <w:docDefaults>
     <w:rPrDefault>
       <w:rPr>
-        <w:rFonts w:ascii="바탕" w:hAnsi="바탕" w:eastAsia="바탕" w:cs="바탕"/>
+        <w:rFonts w:ascii="Times New Roman" w:hAnsi="Times New Roman" w:eastAsia="바탕" w:cs="Times New Roman"/>
         <w:sz w:val="20"/>
         <w:szCs w:val="20"/>
         <w:lang w:val="en-us" w:eastAsia="ko-kr" w:bidi="ar-sa"/>
@@ -4736,7 +4736,7 @@
     <w:name w:val="Normal"/>
     <w:qFormat/>
     <w:rPr>
-      <w:rFonts w:ascii="바탕" w:hAnsi="바탕" w:cs="바탕" w:eastAsia="바탕"/>
+      <w:rFonts w:ascii="Times New Roman" w:hAnsi="Times New Roman" w:cs="Times New Roman" w:eastAsia="바탕"/>
       <w:kern w:val="1"/>
     </w:rPr>
   </w:style>
@@ -4756,7 +4756,7 @@
       <w:outlineLvl w:val="0"/>
     </w:pPr>
     <w:rPr>
-      <w:rFonts w:ascii="바탕" w:hAnsi="바탕" w:cs="바탕" w:eastAsia="바탕"/>
+      <w:rFonts w:ascii="Times New Roman" w:hAnsi="Times New Roman" w:cs="Times New Roman" w:eastAsia="바탕"/>
       <w:b/>
       <w:bCs/>
     </w:rPr>
@@ -4801,7 +4801,7 @@
       <w:jc w:val="left"/>
     </w:pPr>
     <w:rPr>
-      <w:rFonts w:ascii="바탕" w:hAnsi="바탕" w:eastAsia="바탕" w:cs="바탕"/>
+      <w:rFonts w:ascii="Times New Roman" w:hAnsi="Times New Roman" w:eastAsia="바탕" w:cs="Times New Roman"/>
       <w:color w:val="000000"/>
       <w:lang w:val="en-us" w:eastAsia="ko-kr" w:bidi="ar-sa"/>
     </w:rPr>
@@ -4815,7 +4815,7 @@
       <w:ind w:left="288" w:hanging="288"/>
     </w:pPr>
     <w:rPr>
-      <w:rFonts w:ascii="바탕" w:hAnsi="바탕" w:eastAsia="바탕" w:cs="바탕"/>
+      <w:rFonts w:ascii="Times New Roman" w:hAnsi="Times New Roman" w:eastAsia="바탕" w:cs="Times New Roman"/>
     </w:rPr>
   </w:style>
   <w:style w:type="paragraph" w:styleId="para7" w:customStyle="1">
@@ -4830,7 +4830,7 @@
       <w:ind w:left="340" w:hanging="340"/>
     </w:pPr>
     <w:rPr>
-      <w:rFonts w:ascii="바탕" w:hAnsi="바탕" w:eastAsia="바탕" w:cs="바탕"/>
+      <w:rFonts w:ascii="Times New Roman" w:hAnsi="Times New Roman" w:eastAsia="바탕" w:cs="Times New Roman"/>
       <w:sz w:val="18"/>
       <w:szCs w:val="18"/>
     </w:rPr>
@@ -4845,7 +4845,7 @@
       <w:jc w:val="left"/>
     </w:pPr>
     <w:rPr>
-      <w:rFonts w:ascii="바탕" w:hAnsi="바탕" w:eastAsia="바탕" w:cs="바탕"/>
+      <w:rFonts w:ascii="Times New Roman" w:hAnsi="Times New Roman" w:eastAsia="바탕" w:cs="Times New Roman"/>
       <w:sz w:val="24"/>
       <w:szCs w:val="24"/>
     </w:rPr>

</xml_diff>